<commit_message>
Add multinomial OR table (Table 6) and fix predictor analysis
- Fix multinomial logistic regression: method='bfgs', drop_first=True,
  corrected params/conf_int index mapping (col i -> yr_val i+1 -> conf.loc[str(i+1)])
- Add Table 6 (adjusted ORs with 95% CIs) to manuscript and Word document
- Add results paragraph describing multinomial findings
- Fix terminology: 'logistic regression' -> 'multinomial logistic regression'
  in abstract, methods, and results sections of create_docx.js
- Restore optimal_anc feature across all scripts (revert to 11-feature model)
- Update cluster labels to plain numbers in figures (build_table1_and_figs.py,
  generate_scatter.py); remove confusing C-A/C-D manuscript designation notes
- Remove 'pp' suffix from bar labels in prevalence change figure (03)
- Regenerate Word document (maternal_health_malawi_comparative_2015_2024.docx)

Co-Authored-By: Claude Sonnet 4.6 <noreply@anthropic.com>
</commit_message>
<xml_diff>
--- a/manuscript/maternal_health_malawi_comparative_2015_2024.docx
+++ b/manuscript/maternal_health_malawi_comparative_2015_2024.docx
@@ -211,7 +211,7 @@
           <w:sz w:val="22"/>
           <w:szCs w:val="22"/>
         </w:rPr>
-        <w:t xml:space="preserve"> We used a data-driven statistical grouping method (Gaussian Mixture Model clustering) applied independently to harmonised individual-level data from the 2015 MDHS (n = 13,030) and 2024 MDHS (n = 6,925). Eleven care indicators were included spanning the full continuum: antenatal care (visit timing, frequency, provider skill, early initiation, adequacy, and optimality), delivery care (facility delivery, skilled attendance, caesarean section), and postnatal care receipt. The number of groups was determined using standard statistical fit criteria. Groups were matched across survey years using an optimal assignment procedure. Subgroup analyses examined group distributions by residence, wealth, age, and education. Predictors of group membership were identified using logistic regression and a machine learning method (Random Forest), validated by cross-validation. All analyses were conducted in Python.</w:t>
+        <w:t xml:space="preserve"> We used a data-driven statistical grouping method (Gaussian Mixture Model clustering) applied independently to harmonised individual-level data from the 2015 MDHS (n = 13,030) and 2024 MDHS (n = 6,925). Eleven care indicators were included spanning the full continuum: antenatal care (visit timing, frequency, provider skill, early initiation, adequacy, and optimality), delivery care (facility delivery, skilled attendance, caesarean section), and postnatal care receipt. The number of groups was determined using standard statistical fit criteria. Groups were matched across survey years using an optimal assignment procedure. Subgroup analyses examined group distributions by residence, wealth, age, and education. Predictors of group membership were identified using multinomial logistic regression and a machine learning method (Random Forest), validated by cross-validation. All analyses were conducted in Python.</w:t>
       </w:r>
     </w:p>
     <w:p>
@@ -451,7 +451,7 @@
           <w:sz w:val="22"/>
           <w:szCs w:val="22"/>
         </w:rPr>
-        <w:t xml:space="preserve">We examined how group membership varied across four sociodemographic factors: place of residence (urban/rural), household wealth (five quintiles from poorest to richest), age group (adolescent 15–19; young adult 20–34; older 35–49), and education level. Chi-square tests assessed whether these differences were statistically significant, and Cramér’s V measured the strength of association (below 0.1 = weak; 0.1–0.3 = moderate; above 0.3 = strong). To identify which factors best predicted group membership, we used two complementary approaches: logistic regression, which estimates the adjusted likelihood of belonging to each group while accounting for all other factors simultaneously; and Random Forest, a machine learning method that ranks each factor by how much it improves the separation between groups, with accuracy assessed by cross-validation across five data splits. Both approaches were run separately per survey year to allow direct temporal comparison. Both DHS surveys were conducted under protocols approved by the ICF Institutional Review Board and the Malawi National Health Sciences Research Committee. Participation was voluntary and data are anonymised; secondary analysis of publicly available de-identified data does not require additional ethics approval.</w:t>
+        <w:t xml:space="preserve">We examined how group membership varied across four sociodemographic factors: place of residence (urban/rural), household wealth (five quintiles from poorest to richest), age group (adolescent 15–19; young adult 20–34; older 35–49), and education level. Chi-square tests assessed whether these differences were statistically significant, and Cramér’s V measured the strength of association (below 0.1 = weak; 0.1–0.3 = moderate; above 0.3 = strong). To identify which factors best predicted group membership, we used two complementary approaches: multinomial logistic regression, which estimates adjusted odds ratios for belonging to each group while simultaneously accounting for all other sociodemographic factors; and Random Forest, a machine learning method that ranks each factor by how much it improves the separation between groups, with accuracy assessed by cross-validation across five data splits. Both approaches were run separately per survey year to allow direct temporal comparison. Both DHS surveys were conducted under protocols approved by the ICF Institutional Review Board and the Malawi National Health Sciences Research Committee. Participation was voluntary and data are anonymised; secondary analysis of publicly available de-identified data does not require additional ethics approval.</w:t>
       </w:r>
     </w:p>
     <w:p>
@@ -717,7 +717,7 @@
           <w:sz w:val="18"/>
           <w:szCs w:val="18"/>
         </w:rPr>
-        <w:t xml:space="preserve">Figure 2a. Cluster profiles of maternal care utilisation indicators, MDHS 2015 (K = 4). Bars show mean values per cluster: first ANC visit (months) and ANC visits (mean count) as raw means; all binary indicators as percentages. Cluster labels C-A through C-D correspond to manuscript designations.</w:t>
+        <w:t xml:space="preserve">Figure 2a. Cluster profiles of maternal care utilisation indicators, MDHS 2015 (K = 4). Bars show mean values per cluster: first ANC visit (months) and ANC visits (mean count) as raw means; all binary indicators as percentages.</w:t>
       </w:r>
     </w:p>
     <w:p>
@@ -784,7 +784,7 @@
           <w:sz w:val="18"/>
           <w:szCs w:val="18"/>
         </w:rPr>
-        <w:t xml:space="preserve">Figure 2b. Cluster profiles of maternal care utilisation indicators, MDHS 2024 (K = 3). Bars show mean values per cluster: first ANC visit (months) and ANC visits (mean count) as raw means; all binary indicators as percentages. Cluster labels C-1 through C-3 correspond to manuscript designations.</w:t>
+        <w:t xml:space="preserve">Figure 2b. Cluster profiles of maternal care utilisation indicators, MDHS 2024 (K = 3). Bars show mean values per cluster: first ANC visit (months) and ANC visits (mean count) as raw means; all binary indicators as percentages.</w:t>
       </w:r>
     </w:p>
     <w:p>
@@ -905,6 +905,20 @@
           <w:szCs w:val="20"/>
         </w:rPr>
         <w:t xml:space="preserve">INSERT FIGURE 5 ABOUT HERE — Random Forest variable importance and per-cluster F1</w:t>
+      </w:r>
+    </w:p>
+    <w:p>
+      <w:pPr>
+        <w:spacing w:after="100" w:before="60" w:line="480" w:lineRule="auto"/>
+        <w:jc w:val="both"/>
+      </w:pPr>
+      <w:r>
+        <w:rPr>
+          <w:rFonts w:ascii="Times New Roman" w:cs="Times New Roman" w:eastAsia="Times New Roman" w:hAnsi="Times New Roman"/>
+          <w:sz w:val="22"/>
+          <w:szCs w:val="22"/>
+        </w:rPr>
+        <w:t xml:space="preserve">Multinomial logistic regression with the late ANC/facility delivery group as reference provided adjusted odds ratios for all sociodemographic predictors simultaneously (Table 6; McFadden R² = 0.023 in 2015 and 0.011 in 2024). In 2015, membership in the C-section group was significantly predicted by older age (OR per year: 1.06; 95% CI 1.04–1.08; p &lt; 0.001), lower parity (0.73; 0.68–0.79; p &lt; 0.001), urban residence (1.24; 1.02–1.50; p = 0.032), and higher wealth quintile (richer: 1.48, 1.17–1.88; richest: 1.81, 1.40–2.34; both p ≤0.001); all sub-higher education categories were associated with substantially reduced odds (OR 0.45–0.59; all p ≤0.004). The minimal utilisation group was characterised by higher parity (1.09; 1.04–1.16; p = 0.001), greater perceived distance barrier to care (1.39; 1.21–1.59; p &lt; 0.001), and lower urban residence odds (0.73; 0.57–0.94; p = 0.013). Women in the comprehensive care group were more likely to be married (1.14; 1.03–1.27; p = 0.010), from the richest wealth quintile (1.28; 1.09–1.50; p = 0.002), and less likely to reside in urban areas (0.82; 0.71–0.94; p = 0.004) or to have less than higher education (OR 0.62–0.69; all p ≤0.022). In 2024, women in the high-coverage group were significantly more likely to be married (1.22; 1.09–1.36; p &lt; 0.001), of lower parity (0.91; 0.86–0.96; p = 0.001), and marginally older (1.02; 1.00–1.03; p = 0.034); all sub-higher education categories were strongly associated with reduced membership odds (OR 0.43–0.50; all p &lt; 0.001). No predictor reached statistical significance for the moderate ANC/limited delivery group in 2024.</w:t>
       </w:r>
     </w:p>
     <w:p>
@@ -17975,6 +17989,3447 @@
     </w:p>
     <w:p>
       <w:pPr>
+        <w:spacing w:after="60" w:before="240"/>
+      </w:pPr>
+      <w:r>
+        <w:rPr>
+          <w:rFonts w:ascii="Times New Roman" w:cs="Times New Roman" w:eastAsia="Times New Roman" w:hAnsi="Times New Roman"/>
+          <w:b/>
+          <w:bCs/>
+          <w:sz w:val="22"/>
+          <w:szCs w:val="22"/>
+        </w:rPr>
+        <w:t xml:space="preserve">Table 6. Adjusted Odds Ratios from Multinomial Logistic Regression: Predictors of Cluster Membership</w:t>
+      </w:r>
+    </w:p>
+    <w:p>
+      <w:pPr>
+        <w:spacing w:after="80" w:before="40"/>
+      </w:pPr>
+      <w:r>
+        <w:rPr>
+          <w:rFonts w:ascii="Times New Roman" w:cs="Times New Roman" w:eastAsia="Times New Roman" w:hAnsi="Times New Roman"/>
+          <w:i/>
+          <w:iCs/>
+          <w:sz w:val="18"/>
+          <w:szCs w:val="18"/>
+        </w:rPr>
+        <w:t xml:space="preserve">Panel A: MDHS 2015 — Reference group: C-B (Late ANC, facility delivery; n = 7,828)</w:t>
+      </w:r>
+    </w:p>
+    <w:tbl>
+      <w:tblPr>
+        <w:tblW w:type="dxa" w:w="9360"/>
+        <w:tblBorders>
+          <w:top w:val="single" w:color="auto" w:sz="4"/>
+          <w:left w:val="single" w:color="auto" w:sz="4"/>
+          <w:bottom w:val="single" w:color="auto" w:sz="4"/>
+          <w:right w:val="single" w:color="auto" w:sz="4"/>
+          <w:insideH w:val="single" w:color="auto" w:sz="4"/>
+          <w:insideV w:val="single" w:color="auto" w:sz="4"/>
+        </w:tblBorders>
+      </w:tblPr>
+      <w:tblGrid>
+        <w:gridCol w:w="2400"/>
+        <w:gridCol w:w="2320"/>
+        <w:gridCol w:w="2320"/>
+        <w:gridCol w:w="2320"/>
+      </w:tblGrid>
+      <w:tr>
+        <w:tc>
+          <w:tcPr>
+            <w:tcW w:type="dxa" w:w="2400"/>
+            <w:tcBorders>
+              <w:top w:val="single" w:color="AAAAAA" w:sz="4"/>
+              <w:left w:val="single" w:color="AAAAAA" w:sz="4"/>
+              <w:bottom w:val="single" w:color="AAAAAA" w:sz="4"/>
+              <w:right w:val="single" w:color="AAAAAA" w:sz="4"/>
+            </w:tcBorders>
+            <w:shd w:fill="1F3864" w:val="clear"/>
+            <w:tcMar>
+              <w:top w:type="dxa" w:w="80"/>
+              <w:left w:type="dxa" w:w="120"/>
+              <w:bottom w:type="dxa" w:w="80"/>
+              <w:right w:type="dxa" w:w="120"/>
+            </w:tcMar>
+            <w:vAlign w:val="center"/>
+          </w:tcPr>
+          <w:p>
+            <w:pPr>
+              <w:jc w:val="center"/>
+            </w:pPr>
+            <w:r>
+              <w:rPr>
+                <w:rFonts w:ascii="Times New Roman" w:cs="Times New Roman" w:eastAsia="Times New Roman" w:hAnsi="Times New Roman"/>
+                <w:b/>
+                <w:bCs/>
+                <w:color w:val="FFFFFF"/>
+                <w:sz w:val="18"/>
+                <w:szCs w:val="18"/>
+              </w:rPr>
+              <w:t xml:space="preserve">Predictor</w:t>
+            </w:r>
+          </w:p>
+        </w:tc>
+        <w:tc>
+          <w:tcPr>
+            <w:tcW w:type="dxa" w:w="2320"/>
+            <w:tcBorders>
+              <w:top w:val="single" w:color="AAAAAA" w:sz="4"/>
+              <w:left w:val="single" w:color="AAAAAA" w:sz="4"/>
+              <w:bottom w:val="single" w:color="AAAAAA" w:sz="4"/>
+              <w:right w:val="single" w:color="AAAAAA" w:sz="4"/>
+            </w:tcBorders>
+            <w:shd w:fill="1F3864" w:val="clear"/>
+            <w:tcMar>
+              <w:top w:type="dxa" w:w="80"/>
+              <w:left w:type="dxa" w:w="120"/>
+              <w:bottom w:type="dxa" w:w="80"/>
+              <w:right w:type="dxa" w:w="120"/>
+            </w:tcMar>
+            <w:vAlign w:val="center"/>
+          </w:tcPr>
+          <w:p>
+            <w:pPr>
+              <w:jc w:val="center"/>
+            </w:pPr>
+            <w:r>
+              <w:rPr>
+                <w:rFonts w:ascii="Times New Roman" w:cs="Times New Roman" w:eastAsia="Times New Roman" w:hAnsi="Times New Roman"/>
+                <w:b/>
+                <w:bCs/>
+                <w:color w:val="FFFFFF"/>
+                <w:sz w:val="18"/>
+                <w:szCs w:val="18"/>
+              </w:rPr>
+              <w:t xml:space="preserve">C-C: C-section
+(n = 910)</w:t>
+            </w:r>
+          </w:p>
+        </w:tc>
+        <w:tc>
+          <w:tcPr>
+            <w:tcW w:type="dxa" w:w="2320"/>
+            <w:tcBorders>
+              <w:top w:val="single" w:color="AAAAAA" w:sz="4"/>
+              <w:left w:val="single" w:color="AAAAAA" w:sz="4"/>
+              <w:bottom w:val="single" w:color="AAAAAA" w:sz="4"/>
+              <w:right w:val="single" w:color="AAAAAA" w:sz="4"/>
+            </w:tcBorders>
+            <w:shd w:fill="1F3864" w:val="clear"/>
+            <w:tcMar>
+              <w:top w:type="dxa" w:w="80"/>
+              <w:left w:type="dxa" w:w="120"/>
+              <w:bottom w:type="dxa" w:w="80"/>
+              <w:right w:type="dxa" w:w="120"/>
+            </w:tcMar>
+            <w:vAlign w:val="center"/>
+          </w:tcPr>
+          <w:p>
+            <w:pPr>
+              <w:jc w:val="center"/>
+            </w:pPr>
+            <w:r>
+              <w:rPr>
+                <w:rFonts w:ascii="Times New Roman" w:cs="Times New Roman" w:eastAsia="Times New Roman" w:hAnsi="Times New Roman"/>
+                <w:b/>
+                <w:bCs/>
+                <w:color w:val="FFFFFF"/>
+                <w:sz w:val="18"/>
+                <w:szCs w:val="18"/>
+              </w:rPr>
+              <w:t xml:space="preserve">C-D: Minimal utilisation
+(n = 1,143)</w:t>
+            </w:r>
+          </w:p>
+        </w:tc>
+        <w:tc>
+          <w:tcPr>
+            <w:tcW w:type="dxa" w:w="2320"/>
+            <w:tcBorders>
+              <w:top w:val="single" w:color="AAAAAA" w:sz="4"/>
+              <w:left w:val="single" w:color="AAAAAA" w:sz="4"/>
+              <w:bottom w:val="single" w:color="AAAAAA" w:sz="4"/>
+              <w:right w:val="single" w:color="AAAAAA" w:sz="4"/>
+            </w:tcBorders>
+            <w:shd w:fill="1F3864" w:val="clear"/>
+            <w:tcMar>
+              <w:top w:type="dxa" w:w="80"/>
+              <w:left w:type="dxa" w:w="120"/>
+              <w:bottom w:type="dxa" w:w="80"/>
+              <w:right w:type="dxa" w:w="120"/>
+            </w:tcMar>
+            <w:vAlign w:val="center"/>
+          </w:tcPr>
+          <w:p>
+            <w:pPr>
+              <w:jc w:val="center"/>
+            </w:pPr>
+            <w:r>
+              <w:rPr>
+                <w:rFonts w:ascii="Times New Roman" w:cs="Times New Roman" w:eastAsia="Times New Roman" w:hAnsi="Times New Roman"/>
+                <w:b/>
+                <w:bCs/>
+                <w:color w:val="FFFFFF"/>
+                <w:sz w:val="18"/>
+                <w:szCs w:val="18"/>
+              </w:rPr>
+              <w:t xml:space="preserve">C-A: Comprehensive ANC+delivery
+(n = 3,149)</w:t>
+            </w:r>
+          </w:p>
+        </w:tc>
+      </w:tr>
+      <w:tr>
+        <w:tc>
+          <w:tcPr>
+            <w:tcW w:type="dxa" w:w="2400"/>
+            <w:tcBorders>
+              <w:top w:val="single" w:color="AAAAAA" w:sz="4"/>
+              <w:left w:val="single" w:color="AAAAAA" w:sz="4"/>
+              <w:bottom w:val="single" w:color="AAAAAA" w:sz="4"/>
+              <w:right w:val="single" w:color="AAAAAA" w:sz="4"/>
+            </w:tcBorders>
+            <w:tcMar>
+              <w:top w:type="dxa" w:w="60"/>
+              <w:left w:type="dxa" w:w="100"/>
+              <w:bottom w:type="dxa" w:w="60"/>
+              <w:right w:type="dxa" w:w="100"/>
+            </w:tcMar>
+            <w:vAlign w:val="center"/>
+          </w:tcPr>
+          <w:p>
+            <w:pPr>
+              <w:jc w:val="left"/>
+            </w:pPr>
+            <w:r>
+              <w:rPr>
+                <w:rFonts w:ascii="Times New Roman" w:cs="Times New Roman" w:eastAsia="Times New Roman" w:hAnsi="Times New Roman"/>
+                <w:b/>
+                <w:bCs/>
+                <w:sz w:val="18"/>
+                <w:szCs w:val="18"/>
+              </w:rPr>
+              <w:t xml:space="preserve">Age (per year)</w:t>
+            </w:r>
+          </w:p>
+        </w:tc>
+        <w:tc>
+          <w:tcPr>
+            <w:tcW w:type="dxa" w:w="2320"/>
+            <w:tcBorders>
+              <w:top w:val="single" w:color="AAAAAA" w:sz="4"/>
+              <w:left w:val="single" w:color="AAAAAA" w:sz="4"/>
+              <w:bottom w:val="single" w:color="AAAAAA" w:sz="4"/>
+              <w:right w:val="single" w:color="AAAAAA" w:sz="4"/>
+            </w:tcBorders>
+            <w:shd w:fill="FFE5CC" w:val="clear"/>
+            <w:tcMar>
+              <w:top w:type="dxa" w:w="60"/>
+              <w:left w:type="dxa" w:w="100"/>
+              <w:bottom w:type="dxa" w:w="60"/>
+              <w:right w:type="dxa" w:w="100"/>
+            </w:tcMar>
+            <w:vAlign w:val="center"/>
+          </w:tcPr>
+          <w:p>
+            <w:pPr>
+              <w:jc w:val="center"/>
+            </w:pPr>
+            <w:r>
+              <w:rPr>
+                <w:rFonts w:ascii="Times New Roman" w:cs="Times New Roman" w:eastAsia="Times New Roman" w:hAnsi="Times New Roman"/>
+                <w:b w:val="false"/>
+                <w:bCs w:val="false"/>
+                <w:sz w:val="18"/>
+                <w:szCs w:val="18"/>
+              </w:rPr>
+              <w:t xml:space="preserve">1.06 (1.04–1.08)***</w:t>
+            </w:r>
+          </w:p>
+        </w:tc>
+        <w:tc>
+          <w:tcPr>
+            <w:tcW w:type="dxa" w:w="2320"/>
+            <w:tcBorders>
+              <w:top w:val="single" w:color="AAAAAA" w:sz="4"/>
+              <w:left w:val="single" w:color="AAAAAA" w:sz="4"/>
+              <w:bottom w:val="single" w:color="AAAAAA" w:sz="4"/>
+              <w:right w:val="single" w:color="AAAAAA" w:sz="4"/>
+            </w:tcBorders>
+            <w:tcMar>
+              <w:top w:type="dxa" w:w="60"/>
+              <w:left w:type="dxa" w:w="100"/>
+              <w:bottom w:type="dxa" w:w="60"/>
+              <w:right w:type="dxa" w:w="100"/>
+            </w:tcMar>
+            <w:vAlign w:val="center"/>
+          </w:tcPr>
+          <w:p>
+            <w:pPr>
+              <w:jc w:val="center"/>
+            </w:pPr>
+            <w:r>
+              <w:rPr>
+                <w:rFonts w:ascii="Times New Roman" w:cs="Times New Roman" w:eastAsia="Times New Roman" w:hAnsi="Times New Roman"/>
+                <w:b w:val="false"/>
+                <w:bCs w:val="false"/>
+                <w:sz w:val="18"/>
+                <w:szCs w:val="18"/>
+              </w:rPr>
+              <w:t xml:space="preserve">0.99 (0.97–1.01)</w:t>
+            </w:r>
+          </w:p>
+        </w:tc>
+        <w:tc>
+          <w:tcPr>
+            <w:tcW w:type="dxa" w:w="2320"/>
+            <w:tcBorders>
+              <w:top w:val="single" w:color="AAAAAA" w:sz="4"/>
+              <w:left w:val="single" w:color="AAAAAA" w:sz="4"/>
+              <w:bottom w:val="single" w:color="AAAAAA" w:sz="4"/>
+              <w:right w:val="single" w:color="AAAAAA" w:sz="4"/>
+            </w:tcBorders>
+            <w:shd w:fill="E8F5E9" w:val="clear"/>
+            <w:tcMar>
+              <w:top w:type="dxa" w:w="60"/>
+              <w:left w:type="dxa" w:w="100"/>
+              <w:bottom w:type="dxa" w:w="60"/>
+              <w:right w:type="dxa" w:w="100"/>
+            </w:tcMar>
+            <w:vAlign w:val="center"/>
+          </w:tcPr>
+          <w:p>
+            <w:pPr>
+              <w:jc w:val="center"/>
+            </w:pPr>
+            <w:r>
+              <w:rPr>
+                <w:rFonts w:ascii="Times New Roman" w:cs="Times New Roman" w:eastAsia="Times New Roman" w:hAnsi="Times New Roman"/>
+                <w:b w:val="false"/>
+                <w:bCs w:val="false"/>
+                <w:sz w:val="18"/>
+                <w:szCs w:val="18"/>
+              </w:rPr>
+              <w:t xml:space="preserve">1.01 (1.00–1.03)*</w:t>
+            </w:r>
+          </w:p>
+        </w:tc>
+      </w:tr>
+      <w:tr>
+        <w:tc>
+          <w:tcPr>
+            <w:tcW w:type="dxa" w:w="2400"/>
+            <w:tcBorders>
+              <w:top w:val="single" w:color="AAAAAA" w:sz="4"/>
+              <w:left w:val="single" w:color="AAAAAA" w:sz="4"/>
+              <w:bottom w:val="single" w:color="AAAAAA" w:sz="4"/>
+              <w:right w:val="single" w:color="AAAAAA" w:sz="4"/>
+            </w:tcBorders>
+            <w:tcMar>
+              <w:top w:type="dxa" w:w="60"/>
+              <w:left w:type="dxa" w:w="100"/>
+              <w:bottom w:type="dxa" w:w="60"/>
+              <w:right w:type="dxa" w:w="100"/>
+            </w:tcMar>
+            <w:vAlign w:val="center"/>
+          </w:tcPr>
+          <w:p>
+            <w:pPr>
+              <w:jc w:val="left"/>
+            </w:pPr>
+            <w:r>
+              <w:rPr>
+                <w:rFonts w:ascii="Times New Roman" w:cs="Times New Roman" w:eastAsia="Times New Roman" w:hAnsi="Times New Roman"/>
+                <w:b/>
+                <w:bCs/>
+                <w:sz w:val="18"/>
+                <w:szCs w:val="18"/>
+              </w:rPr>
+              <w:t xml:space="preserve">Parity</w:t>
+            </w:r>
+          </w:p>
+        </w:tc>
+        <w:tc>
+          <w:tcPr>
+            <w:tcW w:type="dxa" w:w="2320"/>
+            <w:tcBorders>
+              <w:top w:val="single" w:color="AAAAAA" w:sz="4"/>
+              <w:left w:val="single" w:color="AAAAAA" w:sz="4"/>
+              <w:bottom w:val="single" w:color="AAAAAA" w:sz="4"/>
+              <w:right w:val="single" w:color="AAAAAA" w:sz="4"/>
+            </w:tcBorders>
+            <w:shd w:fill="FFE5CC" w:val="clear"/>
+            <w:tcMar>
+              <w:top w:type="dxa" w:w="60"/>
+              <w:left w:type="dxa" w:w="100"/>
+              <w:bottom w:type="dxa" w:w="60"/>
+              <w:right w:type="dxa" w:w="100"/>
+            </w:tcMar>
+            <w:vAlign w:val="center"/>
+          </w:tcPr>
+          <w:p>
+            <w:pPr>
+              <w:jc w:val="center"/>
+            </w:pPr>
+            <w:r>
+              <w:rPr>
+                <w:rFonts w:ascii="Times New Roman" w:cs="Times New Roman" w:eastAsia="Times New Roman" w:hAnsi="Times New Roman"/>
+                <w:b w:val="false"/>
+                <w:bCs w:val="false"/>
+                <w:sz w:val="18"/>
+                <w:szCs w:val="18"/>
+              </w:rPr>
+              <w:t xml:space="preserve">0.73 (0.68–0.79)***</w:t>
+            </w:r>
+          </w:p>
+        </w:tc>
+        <w:tc>
+          <w:tcPr>
+            <w:tcW w:type="dxa" w:w="2320"/>
+            <w:tcBorders>
+              <w:top w:val="single" w:color="AAAAAA" w:sz="4"/>
+              <w:left w:val="single" w:color="AAAAAA" w:sz="4"/>
+              <w:bottom w:val="single" w:color="AAAAAA" w:sz="4"/>
+              <w:right w:val="single" w:color="AAAAAA" w:sz="4"/>
+            </w:tcBorders>
+            <w:shd w:fill="FFE5CC" w:val="clear"/>
+            <w:tcMar>
+              <w:top w:type="dxa" w:w="60"/>
+              <w:left w:type="dxa" w:w="100"/>
+              <w:bottom w:type="dxa" w:w="60"/>
+              <w:right w:type="dxa" w:w="100"/>
+            </w:tcMar>
+            <w:vAlign w:val="center"/>
+          </w:tcPr>
+          <w:p>
+            <w:pPr>
+              <w:jc w:val="center"/>
+            </w:pPr>
+            <w:r>
+              <w:rPr>
+                <w:rFonts w:ascii="Times New Roman" w:cs="Times New Roman" w:eastAsia="Times New Roman" w:hAnsi="Times New Roman"/>
+                <w:b w:val="false"/>
+                <w:bCs w:val="false"/>
+                <w:sz w:val="18"/>
+                <w:szCs w:val="18"/>
+              </w:rPr>
+              <w:t xml:space="preserve">1.09 (1.04–1.16)**</w:t>
+            </w:r>
+          </w:p>
+        </w:tc>
+        <w:tc>
+          <w:tcPr>
+            <w:tcW w:type="dxa" w:w="2320"/>
+            <w:tcBorders>
+              <w:top w:val="single" w:color="AAAAAA" w:sz="4"/>
+              <w:left w:val="single" w:color="AAAAAA" w:sz="4"/>
+              <w:bottom w:val="single" w:color="AAAAAA" w:sz="4"/>
+              <w:right w:val="single" w:color="AAAAAA" w:sz="4"/>
+            </w:tcBorders>
+            <w:tcMar>
+              <w:top w:type="dxa" w:w="60"/>
+              <w:left w:type="dxa" w:w="100"/>
+              <w:bottom w:type="dxa" w:w="60"/>
+              <w:right w:type="dxa" w:w="100"/>
+            </w:tcMar>
+            <w:vAlign w:val="center"/>
+          </w:tcPr>
+          <w:p>
+            <w:pPr>
+              <w:jc w:val="center"/>
+            </w:pPr>
+            <w:r>
+              <w:rPr>
+                <w:rFonts w:ascii="Times New Roman" w:cs="Times New Roman" w:eastAsia="Times New Roman" w:hAnsi="Times New Roman"/>
+                <w:b w:val="false"/>
+                <w:bCs w:val="false"/>
+                <w:sz w:val="18"/>
+                <w:szCs w:val="18"/>
+              </w:rPr>
+              <w:t xml:space="preserve">0.97 (0.93–1.00)</w:t>
+            </w:r>
+          </w:p>
+        </w:tc>
+      </w:tr>
+      <w:tr>
+        <w:tc>
+          <w:tcPr>
+            <w:tcW w:type="dxa" w:w="2400"/>
+            <w:tcBorders>
+              <w:top w:val="single" w:color="AAAAAA" w:sz="4"/>
+              <w:left w:val="single" w:color="AAAAAA" w:sz="4"/>
+              <w:bottom w:val="single" w:color="AAAAAA" w:sz="4"/>
+              <w:right w:val="single" w:color="AAAAAA" w:sz="4"/>
+            </w:tcBorders>
+            <w:tcMar>
+              <w:top w:type="dxa" w:w="60"/>
+              <w:left w:type="dxa" w:w="100"/>
+              <w:bottom w:type="dxa" w:w="60"/>
+              <w:right w:type="dxa" w:w="100"/>
+            </w:tcMar>
+            <w:vAlign w:val="center"/>
+          </w:tcPr>
+          <w:p>
+            <w:pPr>
+              <w:jc w:val="left"/>
+            </w:pPr>
+            <w:r>
+              <w:rPr>
+                <w:rFonts w:ascii="Times New Roman" w:cs="Times New Roman" w:eastAsia="Times New Roman" w:hAnsi="Times New Roman"/>
+                <w:b/>
+                <w:bCs/>
+                <w:sz w:val="18"/>
+                <w:szCs w:val="18"/>
+              </w:rPr>
+              <w:t xml:space="preserve">Married</w:t>
+            </w:r>
+          </w:p>
+        </w:tc>
+        <w:tc>
+          <w:tcPr>
+            <w:tcW w:type="dxa" w:w="2320"/>
+            <w:tcBorders>
+              <w:top w:val="single" w:color="AAAAAA" w:sz="4"/>
+              <w:left w:val="single" w:color="AAAAAA" w:sz="4"/>
+              <w:bottom w:val="single" w:color="AAAAAA" w:sz="4"/>
+              <w:right w:val="single" w:color="AAAAAA" w:sz="4"/>
+            </w:tcBorders>
+            <w:tcMar>
+              <w:top w:type="dxa" w:w="60"/>
+              <w:left w:type="dxa" w:w="100"/>
+              <w:bottom w:type="dxa" w:w="60"/>
+              <w:right w:type="dxa" w:w="100"/>
+            </w:tcMar>
+            <w:vAlign w:val="center"/>
+          </w:tcPr>
+          <w:p>
+            <w:pPr>
+              <w:jc w:val="center"/>
+            </w:pPr>
+            <w:r>
+              <w:rPr>
+                <w:rFonts w:ascii="Times New Roman" w:cs="Times New Roman" w:eastAsia="Times New Roman" w:hAnsi="Times New Roman"/>
+                <w:b w:val="false"/>
+                <w:bCs w:val="false"/>
+                <w:sz w:val="18"/>
+                <w:szCs w:val="18"/>
+              </w:rPr>
+              <w:t xml:space="preserve">0.85 (0.73–1.00)</w:t>
+            </w:r>
+          </w:p>
+        </w:tc>
+        <w:tc>
+          <w:tcPr>
+            <w:tcW w:type="dxa" w:w="2320"/>
+            <w:tcBorders>
+              <w:top w:val="single" w:color="AAAAAA" w:sz="4"/>
+              <w:left w:val="single" w:color="AAAAAA" w:sz="4"/>
+              <w:bottom w:val="single" w:color="AAAAAA" w:sz="4"/>
+              <w:right w:val="single" w:color="AAAAAA" w:sz="4"/>
+            </w:tcBorders>
+            <w:tcMar>
+              <w:top w:type="dxa" w:w="60"/>
+              <w:left w:type="dxa" w:w="100"/>
+              <w:bottom w:type="dxa" w:w="60"/>
+              <w:right w:type="dxa" w:w="100"/>
+            </w:tcMar>
+            <w:vAlign w:val="center"/>
+          </w:tcPr>
+          <w:p>
+            <w:pPr>
+              <w:jc w:val="center"/>
+            </w:pPr>
+            <w:r>
+              <w:rPr>
+                <w:rFonts w:ascii="Times New Roman" w:cs="Times New Roman" w:eastAsia="Times New Roman" w:hAnsi="Times New Roman"/>
+                <w:b w:val="false"/>
+                <w:bCs w:val="false"/>
+                <w:sz w:val="18"/>
+                <w:szCs w:val="18"/>
+              </w:rPr>
+              <w:t xml:space="preserve">0.88 (0.76–1.02)</w:t>
+            </w:r>
+          </w:p>
+        </w:tc>
+        <w:tc>
+          <w:tcPr>
+            <w:tcW w:type="dxa" w:w="2320"/>
+            <w:tcBorders>
+              <w:top w:val="single" w:color="AAAAAA" w:sz="4"/>
+              <w:left w:val="single" w:color="AAAAAA" w:sz="4"/>
+              <w:bottom w:val="single" w:color="AAAAAA" w:sz="4"/>
+              <w:right w:val="single" w:color="AAAAAA" w:sz="4"/>
+            </w:tcBorders>
+            <w:shd w:fill="E8F5E9" w:val="clear"/>
+            <w:tcMar>
+              <w:top w:type="dxa" w:w="60"/>
+              <w:left w:type="dxa" w:w="100"/>
+              <w:bottom w:type="dxa" w:w="60"/>
+              <w:right w:type="dxa" w:w="100"/>
+            </w:tcMar>
+            <w:vAlign w:val="center"/>
+          </w:tcPr>
+          <w:p>
+            <w:pPr>
+              <w:jc w:val="center"/>
+            </w:pPr>
+            <w:r>
+              <w:rPr>
+                <w:rFonts w:ascii="Times New Roman" w:cs="Times New Roman" w:eastAsia="Times New Roman" w:hAnsi="Times New Roman"/>
+                <w:b w:val="false"/>
+                <w:bCs w:val="false"/>
+                <w:sz w:val="18"/>
+                <w:szCs w:val="18"/>
+              </w:rPr>
+              <w:t xml:space="preserve">1.14 (1.03–1.27)*</w:t>
+            </w:r>
+          </w:p>
+        </w:tc>
+      </w:tr>
+      <w:tr>
+        <w:tc>
+          <w:tcPr>
+            <w:tcW w:type="dxa" w:w="2400"/>
+            <w:tcBorders>
+              <w:top w:val="single" w:color="AAAAAA" w:sz="4"/>
+              <w:left w:val="single" w:color="AAAAAA" w:sz="4"/>
+              <w:bottom w:val="single" w:color="AAAAAA" w:sz="4"/>
+              <w:right w:val="single" w:color="AAAAAA" w:sz="4"/>
+            </w:tcBorders>
+            <w:tcMar>
+              <w:top w:type="dxa" w:w="60"/>
+              <w:left w:type="dxa" w:w="100"/>
+              <w:bottom w:type="dxa" w:w="60"/>
+              <w:right w:type="dxa" w:w="100"/>
+            </w:tcMar>
+            <w:vAlign w:val="center"/>
+          </w:tcPr>
+          <w:p>
+            <w:pPr>
+              <w:jc w:val="left"/>
+            </w:pPr>
+            <w:r>
+              <w:rPr>
+                <w:rFonts w:ascii="Times New Roman" w:cs="Times New Roman" w:eastAsia="Times New Roman" w:hAnsi="Times New Roman"/>
+                <w:b/>
+                <w:bCs/>
+                <w:sz w:val="18"/>
+                <w:szCs w:val="18"/>
+              </w:rPr>
+              <w:t xml:space="preserve">Distance barrier</w:t>
+            </w:r>
+          </w:p>
+        </w:tc>
+        <w:tc>
+          <w:tcPr>
+            <w:tcW w:type="dxa" w:w="2320"/>
+            <w:tcBorders>
+              <w:top w:val="single" w:color="AAAAAA" w:sz="4"/>
+              <w:left w:val="single" w:color="AAAAAA" w:sz="4"/>
+              <w:bottom w:val="single" w:color="AAAAAA" w:sz="4"/>
+              <w:right w:val="single" w:color="AAAAAA" w:sz="4"/>
+            </w:tcBorders>
+            <w:tcMar>
+              <w:top w:type="dxa" w:w="60"/>
+              <w:left w:type="dxa" w:w="100"/>
+              <w:bottom w:type="dxa" w:w="60"/>
+              <w:right w:type="dxa" w:w="100"/>
+            </w:tcMar>
+            <w:vAlign w:val="center"/>
+          </w:tcPr>
+          <w:p>
+            <w:pPr>
+              <w:jc w:val="center"/>
+            </w:pPr>
+            <w:r>
+              <w:rPr>
+                <w:rFonts w:ascii="Times New Roman" w:cs="Times New Roman" w:eastAsia="Times New Roman" w:hAnsi="Times New Roman"/>
+                <w:b w:val="false"/>
+                <w:bCs w:val="false"/>
+                <w:sz w:val="18"/>
+                <w:szCs w:val="18"/>
+              </w:rPr>
+              <w:t xml:space="preserve">1.05 (0.90–1.22)</w:t>
+            </w:r>
+          </w:p>
+        </w:tc>
+        <w:tc>
+          <w:tcPr>
+            <w:tcW w:type="dxa" w:w="2320"/>
+            <w:tcBorders>
+              <w:top w:val="single" w:color="AAAAAA" w:sz="4"/>
+              <w:left w:val="single" w:color="AAAAAA" w:sz="4"/>
+              <w:bottom w:val="single" w:color="AAAAAA" w:sz="4"/>
+              <w:right w:val="single" w:color="AAAAAA" w:sz="4"/>
+            </w:tcBorders>
+            <w:shd w:fill="FFE5CC" w:val="clear"/>
+            <w:tcMar>
+              <w:top w:type="dxa" w:w="60"/>
+              <w:left w:type="dxa" w:w="100"/>
+              <w:bottom w:type="dxa" w:w="60"/>
+              <w:right w:type="dxa" w:w="100"/>
+            </w:tcMar>
+            <w:vAlign w:val="center"/>
+          </w:tcPr>
+          <w:p>
+            <w:pPr>
+              <w:jc w:val="center"/>
+            </w:pPr>
+            <w:r>
+              <w:rPr>
+                <w:rFonts w:ascii="Times New Roman" w:cs="Times New Roman" w:eastAsia="Times New Roman" w:hAnsi="Times New Roman"/>
+                <w:b w:val="false"/>
+                <w:bCs w:val="false"/>
+                <w:sz w:val="18"/>
+                <w:szCs w:val="18"/>
+              </w:rPr>
+              <w:t xml:space="preserve">1.39 (1.21–1.59)***</w:t>
+            </w:r>
+          </w:p>
+        </w:tc>
+        <w:tc>
+          <w:tcPr>
+            <w:tcW w:type="dxa" w:w="2320"/>
+            <w:tcBorders>
+              <w:top w:val="single" w:color="AAAAAA" w:sz="4"/>
+              <w:left w:val="single" w:color="AAAAAA" w:sz="4"/>
+              <w:bottom w:val="single" w:color="AAAAAA" w:sz="4"/>
+              <w:right w:val="single" w:color="AAAAAA" w:sz="4"/>
+            </w:tcBorders>
+            <w:tcMar>
+              <w:top w:type="dxa" w:w="60"/>
+              <w:left w:type="dxa" w:w="100"/>
+              <w:bottom w:type="dxa" w:w="60"/>
+              <w:right w:type="dxa" w:w="100"/>
+            </w:tcMar>
+            <w:vAlign w:val="center"/>
+          </w:tcPr>
+          <w:p>
+            <w:pPr>
+              <w:jc w:val="center"/>
+            </w:pPr>
+            <w:r>
+              <w:rPr>
+                <w:rFonts w:ascii="Times New Roman" w:cs="Times New Roman" w:eastAsia="Times New Roman" w:hAnsi="Times New Roman"/>
+                <w:b w:val="false"/>
+                <w:bCs w:val="false"/>
+                <w:sz w:val="18"/>
+                <w:szCs w:val="18"/>
+              </w:rPr>
+              <w:t xml:space="preserve">0.99 (0.90–1.08)</w:t>
+            </w:r>
+          </w:p>
+        </w:tc>
+      </w:tr>
+      <w:tr>
+        <w:tc>
+          <w:tcPr>
+            <w:tcW w:type="dxa" w:w="2400"/>
+            <w:tcBorders>
+              <w:top w:val="single" w:color="AAAAAA" w:sz="4"/>
+              <w:left w:val="single" w:color="AAAAAA" w:sz="4"/>
+              <w:bottom w:val="single" w:color="AAAAAA" w:sz="4"/>
+              <w:right w:val="single" w:color="AAAAAA" w:sz="4"/>
+            </w:tcBorders>
+            <w:tcMar>
+              <w:top w:type="dxa" w:w="60"/>
+              <w:left w:type="dxa" w:w="100"/>
+              <w:bottom w:type="dxa" w:w="60"/>
+              <w:right w:type="dxa" w:w="100"/>
+            </w:tcMar>
+            <w:vAlign w:val="center"/>
+          </w:tcPr>
+          <w:p>
+            <w:pPr>
+              <w:jc w:val="left"/>
+            </w:pPr>
+            <w:r>
+              <w:rPr>
+                <w:rFonts w:ascii="Times New Roman" w:cs="Times New Roman" w:eastAsia="Times New Roman" w:hAnsi="Times New Roman"/>
+                <w:b/>
+                <w:bCs/>
+                <w:sz w:val="18"/>
+                <w:szCs w:val="18"/>
+              </w:rPr>
+              <w:t xml:space="preserve">Region</w:t>
+            </w:r>
+          </w:p>
+        </w:tc>
+        <w:tc>
+          <w:tcPr>
+            <w:tcW w:type="dxa" w:w="2320"/>
+            <w:tcBorders>
+              <w:top w:val="single" w:color="AAAAAA" w:sz="4"/>
+              <w:left w:val="single" w:color="AAAAAA" w:sz="4"/>
+              <w:bottom w:val="single" w:color="AAAAAA" w:sz="4"/>
+              <w:right w:val="single" w:color="AAAAAA" w:sz="4"/>
+            </w:tcBorders>
+            <w:shd w:fill="FFE5CC" w:val="clear"/>
+            <w:tcMar>
+              <w:top w:type="dxa" w:w="60"/>
+              <w:left w:type="dxa" w:w="100"/>
+              <w:bottom w:type="dxa" w:w="60"/>
+              <w:right w:type="dxa" w:w="100"/>
+            </w:tcMar>
+            <w:vAlign w:val="center"/>
+          </w:tcPr>
+          <w:p>
+            <w:pPr>
+              <w:jc w:val="center"/>
+            </w:pPr>
+            <w:r>
+              <w:rPr>
+                <w:rFonts w:ascii="Times New Roman" w:cs="Times New Roman" w:eastAsia="Times New Roman" w:hAnsi="Times New Roman"/>
+                <w:b w:val="false"/>
+                <w:bCs w:val="false"/>
+                <w:sz w:val="18"/>
+                <w:szCs w:val="18"/>
+              </w:rPr>
+              <w:t xml:space="preserve">0.81 (0.74–0.89)***</w:t>
+            </w:r>
+          </w:p>
+        </w:tc>
+        <w:tc>
+          <w:tcPr>
+            <w:tcW w:type="dxa" w:w="2320"/>
+            <w:tcBorders>
+              <w:top w:val="single" w:color="AAAAAA" w:sz="4"/>
+              <w:left w:val="single" w:color="AAAAAA" w:sz="4"/>
+              <w:bottom w:val="single" w:color="AAAAAA" w:sz="4"/>
+              <w:right w:val="single" w:color="AAAAAA" w:sz="4"/>
+            </w:tcBorders>
+            <w:tcMar>
+              <w:top w:type="dxa" w:w="60"/>
+              <w:left w:type="dxa" w:w="100"/>
+              <w:bottom w:type="dxa" w:w="60"/>
+              <w:right w:type="dxa" w:w="100"/>
+            </w:tcMar>
+            <w:vAlign w:val="center"/>
+          </w:tcPr>
+          <w:p>
+            <w:pPr>
+              <w:jc w:val="center"/>
+            </w:pPr>
+            <w:r>
+              <w:rPr>
+                <w:rFonts w:ascii="Times New Roman" w:cs="Times New Roman" w:eastAsia="Times New Roman" w:hAnsi="Times New Roman"/>
+                <w:b w:val="false"/>
+                <w:bCs w:val="false"/>
+                <w:sz w:val="18"/>
+                <w:szCs w:val="18"/>
+              </w:rPr>
+              <w:t xml:space="preserve">0.94 (0.86–1.02)</w:t>
+            </w:r>
+          </w:p>
+        </w:tc>
+        <w:tc>
+          <w:tcPr>
+            <w:tcW w:type="dxa" w:w="2320"/>
+            <w:tcBorders>
+              <w:top w:val="single" w:color="AAAAAA" w:sz="4"/>
+              <w:left w:val="single" w:color="AAAAAA" w:sz="4"/>
+              <w:bottom w:val="single" w:color="AAAAAA" w:sz="4"/>
+              <w:right w:val="single" w:color="AAAAAA" w:sz="4"/>
+            </w:tcBorders>
+            <w:tcMar>
+              <w:top w:type="dxa" w:w="60"/>
+              <w:left w:type="dxa" w:w="100"/>
+              <w:bottom w:type="dxa" w:w="60"/>
+              <w:right w:type="dxa" w:w="100"/>
+            </w:tcMar>
+            <w:vAlign w:val="center"/>
+          </w:tcPr>
+          <w:p>
+            <w:pPr>
+              <w:jc w:val="center"/>
+            </w:pPr>
+            <w:r>
+              <w:rPr>
+                <w:rFonts w:ascii="Times New Roman" w:cs="Times New Roman" w:eastAsia="Times New Roman" w:hAnsi="Times New Roman"/>
+                <w:b w:val="false"/>
+                <w:bCs w:val="false"/>
+                <w:sz w:val="18"/>
+                <w:szCs w:val="18"/>
+              </w:rPr>
+              <w:t xml:space="preserve">1.02 (0.97–1.08)</w:t>
+            </w:r>
+          </w:p>
+        </w:tc>
+      </w:tr>
+      <w:tr>
+        <w:tc>
+          <w:tcPr>
+            <w:tcW w:type="dxa" w:w="2400"/>
+            <w:tcBorders>
+              <w:top w:val="single" w:color="AAAAAA" w:sz="4"/>
+              <w:left w:val="single" w:color="AAAAAA" w:sz="4"/>
+              <w:bottom w:val="single" w:color="AAAAAA" w:sz="4"/>
+              <w:right w:val="single" w:color="AAAAAA" w:sz="4"/>
+            </w:tcBorders>
+            <w:tcMar>
+              <w:top w:type="dxa" w:w="60"/>
+              <w:left w:type="dxa" w:w="100"/>
+              <w:bottom w:type="dxa" w:w="60"/>
+              <w:right w:type="dxa" w:w="100"/>
+            </w:tcMar>
+            <w:vAlign w:val="center"/>
+          </w:tcPr>
+          <w:p>
+            <w:pPr>
+              <w:jc w:val="left"/>
+            </w:pPr>
+            <w:r>
+              <w:rPr>
+                <w:rFonts w:ascii="Times New Roman" w:cs="Times New Roman" w:eastAsia="Times New Roman" w:hAnsi="Times New Roman"/>
+                <w:b/>
+                <w:bCs/>
+                <w:sz w:val="18"/>
+                <w:szCs w:val="18"/>
+              </w:rPr>
+              <w:t xml:space="preserve">Urban residence</w:t>
+            </w:r>
+          </w:p>
+        </w:tc>
+        <w:tc>
+          <w:tcPr>
+            <w:tcW w:type="dxa" w:w="2320"/>
+            <w:tcBorders>
+              <w:top w:val="single" w:color="AAAAAA" w:sz="4"/>
+              <w:left w:val="single" w:color="AAAAAA" w:sz="4"/>
+              <w:bottom w:val="single" w:color="AAAAAA" w:sz="4"/>
+              <w:right w:val="single" w:color="AAAAAA" w:sz="4"/>
+            </w:tcBorders>
+            <w:shd w:fill="FFE5CC" w:val="clear"/>
+            <w:tcMar>
+              <w:top w:type="dxa" w:w="60"/>
+              <w:left w:type="dxa" w:w="100"/>
+              <w:bottom w:type="dxa" w:w="60"/>
+              <w:right w:type="dxa" w:w="100"/>
+            </w:tcMar>
+            <w:vAlign w:val="center"/>
+          </w:tcPr>
+          <w:p>
+            <w:pPr>
+              <w:jc w:val="center"/>
+            </w:pPr>
+            <w:r>
+              <w:rPr>
+                <w:rFonts w:ascii="Times New Roman" w:cs="Times New Roman" w:eastAsia="Times New Roman" w:hAnsi="Times New Roman"/>
+                <w:b w:val="false"/>
+                <w:bCs w:val="false"/>
+                <w:sz w:val="18"/>
+                <w:szCs w:val="18"/>
+              </w:rPr>
+              <w:t xml:space="preserve">1.24 (1.02–1.50)*</w:t>
+            </w:r>
+          </w:p>
+        </w:tc>
+        <w:tc>
+          <w:tcPr>
+            <w:tcW w:type="dxa" w:w="2320"/>
+            <w:tcBorders>
+              <w:top w:val="single" w:color="AAAAAA" w:sz="4"/>
+              <w:left w:val="single" w:color="AAAAAA" w:sz="4"/>
+              <w:bottom w:val="single" w:color="AAAAAA" w:sz="4"/>
+              <w:right w:val="single" w:color="AAAAAA" w:sz="4"/>
+            </w:tcBorders>
+            <w:shd w:fill="FFE5CC" w:val="clear"/>
+            <w:tcMar>
+              <w:top w:type="dxa" w:w="60"/>
+              <w:left w:type="dxa" w:w="100"/>
+              <w:bottom w:type="dxa" w:w="60"/>
+              <w:right w:type="dxa" w:w="100"/>
+            </w:tcMar>
+            <w:vAlign w:val="center"/>
+          </w:tcPr>
+          <w:p>
+            <w:pPr>
+              <w:jc w:val="center"/>
+            </w:pPr>
+            <w:r>
+              <w:rPr>
+                <w:rFonts w:ascii="Times New Roman" w:cs="Times New Roman" w:eastAsia="Times New Roman" w:hAnsi="Times New Roman"/>
+                <w:b w:val="false"/>
+                <w:bCs w:val="false"/>
+                <w:sz w:val="18"/>
+                <w:szCs w:val="18"/>
+              </w:rPr>
+              <w:t xml:space="preserve">0.73 (0.57–0.94)*</w:t>
+            </w:r>
+          </w:p>
+        </w:tc>
+        <w:tc>
+          <w:tcPr>
+            <w:tcW w:type="dxa" w:w="2320"/>
+            <w:tcBorders>
+              <w:top w:val="single" w:color="AAAAAA" w:sz="4"/>
+              <w:left w:val="single" w:color="AAAAAA" w:sz="4"/>
+              <w:bottom w:val="single" w:color="AAAAAA" w:sz="4"/>
+              <w:right w:val="single" w:color="AAAAAA" w:sz="4"/>
+            </w:tcBorders>
+            <w:shd w:fill="FFE5CC" w:val="clear"/>
+            <w:tcMar>
+              <w:top w:type="dxa" w:w="60"/>
+              <w:left w:type="dxa" w:w="100"/>
+              <w:bottom w:type="dxa" w:w="60"/>
+              <w:right w:type="dxa" w:w="100"/>
+            </w:tcMar>
+            <w:vAlign w:val="center"/>
+          </w:tcPr>
+          <w:p>
+            <w:pPr>
+              <w:jc w:val="center"/>
+            </w:pPr>
+            <w:r>
+              <w:rPr>
+                <w:rFonts w:ascii="Times New Roman" w:cs="Times New Roman" w:eastAsia="Times New Roman" w:hAnsi="Times New Roman"/>
+                <w:b w:val="false"/>
+                <w:bCs w:val="false"/>
+                <w:sz w:val="18"/>
+                <w:szCs w:val="18"/>
+              </w:rPr>
+              <w:t xml:space="preserve">0.82 (0.71–0.94)**</w:t>
+            </w:r>
+          </w:p>
+        </w:tc>
+      </w:tr>
+      <w:tr>
+        <w:tc>
+          <w:tcPr>
+            <w:tcW w:type="dxa" w:w="2400"/>
+            <w:tcBorders>
+              <w:top w:val="single" w:color="AAAAAA" w:sz="4"/>
+              <w:left w:val="single" w:color="AAAAAA" w:sz="4"/>
+              <w:bottom w:val="single" w:color="AAAAAA" w:sz="4"/>
+              <w:right w:val="single" w:color="AAAAAA" w:sz="4"/>
+            </w:tcBorders>
+            <w:tcMar>
+              <w:top w:type="dxa" w:w="60"/>
+              <w:left w:type="dxa" w:w="100"/>
+              <w:bottom w:type="dxa" w:w="60"/>
+              <w:right w:type="dxa" w:w="100"/>
+            </w:tcMar>
+            <w:vAlign w:val="center"/>
+          </w:tcPr>
+          <w:p>
+            <w:pPr>
+              <w:jc w:val="left"/>
+            </w:pPr>
+            <w:r>
+              <w:rPr>
+                <w:rFonts w:ascii="Times New Roman" w:cs="Times New Roman" w:eastAsia="Times New Roman" w:hAnsi="Times New Roman"/>
+                <w:b w:val="false"/>
+                <w:bCs w:val="false"/>
+                <w:sz w:val="18"/>
+                <w:szCs w:val="18"/>
+              </w:rPr>
+              <w:t xml:space="preserve">Wealth: Poorer</w:t>
+            </w:r>
+          </w:p>
+        </w:tc>
+        <w:tc>
+          <w:tcPr>
+            <w:tcW w:type="dxa" w:w="2320"/>
+            <w:tcBorders>
+              <w:top w:val="single" w:color="AAAAAA" w:sz="4"/>
+              <w:left w:val="single" w:color="AAAAAA" w:sz="4"/>
+              <w:bottom w:val="single" w:color="AAAAAA" w:sz="4"/>
+              <w:right w:val="single" w:color="AAAAAA" w:sz="4"/>
+            </w:tcBorders>
+            <w:tcMar>
+              <w:top w:type="dxa" w:w="60"/>
+              <w:left w:type="dxa" w:w="100"/>
+              <w:bottom w:type="dxa" w:w="60"/>
+              <w:right w:type="dxa" w:w="100"/>
+            </w:tcMar>
+            <w:vAlign w:val="center"/>
+          </w:tcPr>
+          <w:p>
+            <w:pPr>
+              <w:jc w:val="center"/>
+            </w:pPr>
+            <w:r>
+              <w:rPr>
+                <w:rFonts w:ascii="Times New Roman" w:cs="Times New Roman" w:eastAsia="Times New Roman" w:hAnsi="Times New Roman"/>
+                <w:b w:val="false"/>
+                <w:bCs w:val="false"/>
+                <w:sz w:val="18"/>
+                <w:szCs w:val="18"/>
+              </w:rPr>
+              <w:t xml:space="preserve">0.98 (0.76–1.26)</w:t>
+            </w:r>
+          </w:p>
+        </w:tc>
+        <w:tc>
+          <w:tcPr>
+            <w:tcW w:type="dxa" w:w="2320"/>
+            <w:tcBorders>
+              <w:top w:val="single" w:color="AAAAAA" w:sz="4"/>
+              <w:left w:val="single" w:color="AAAAAA" w:sz="4"/>
+              <w:bottom w:val="single" w:color="AAAAAA" w:sz="4"/>
+              <w:right w:val="single" w:color="AAAAAA" w:sz="4"/>
+            </w:tcBorders>
+            <w:tcMar>
+              <w:top w:type="dxa" w:w="60"/>
+              <w:left w:type="dxa" w:w="100"/>
+              <w:bottom w:type="dxa" w:w="60"/>
+              <w:right w:type="dxa" w:w="100"/>
+            </w:tcMar>
+            <w:vAlign w:val="center"/>
+          </w:tcPr>
+          <w:p>
+            <w:pPr>
+              <w:jc w:val="center"/>
+            </w:pPr>
+            <w:r>
+              <w:rPr>
+                <w:rFonts w:ascii="Times New Roman" w:cs="Times New Roman" w:eastAsia="Times New Roman" w:hAnsi="Times New Roman"/>
+                <w:b w:val="false"/>
+                <w:bCs w:val="false"/>
+                <w:sz w:val="18"/>
+                <w:szCs w:val="18"/>
+              </w:rPr>
+              <w:t xml:space="preserve">1.05 (0.87–1.26)</w:t>
+            </w:r>
+          </w:p>
+        </w:tc>
+        <w:tc>
+          <w:tcPr>
+            <w:tcW w:type="dxa" w:w="2320"/>
+            <w:tcBorders>
+              <w:top w:val="single" w:color="AAAAAA" w:sz="4"/>
+              <w:left w:val="single" w:color="AAAAAA" w:sz="4"/>
+              <w:bottom w:val="single" w:color="AAAAAA" w:sz="4"/>
+              <w:right w:val="single" w:color="AAAAAA" w:sz="4"/>
+            </w:tcBorders>
+            <w:tcMar>
+              <w:top w:type="dxa" w:w="60"/>
+              <w:left w:type="dxa" w:w="100"/>
+              <w:bottom w:type="dxa" w:w="60"/>
+              <w:right w:type="dxa" w:w="100"/>
+            </w:tcMar>
+            <w:vAlign w:val="center"/>
+          </w:tcPr>
+          <w:p>
+            <w:pPr>
+              <w:jc w:val="center"/>
+            </w:pPr>
+            <w:r>
+              <w:rPr>
+                <w:rFonts w:ascii="Times New Roman" w:cs="Times New Roman" w:eastAsia="Times New Roman" w:hAnsi="Times New Roman"/>
+                <w:b w:val="false"/>
+                <w:bCs w:val="false"/>
+                <w:sz w:val="18"/>
+                <w:szCs w:val="18"/>
+              </w:rPr>
+              <w:t xml:space="preserve">1.05 (0.93–1.20)</w:t>
+            </w:r>
+          </w:p>
+        </w:tc>
+      </w:tr>
+      <w:tr>
+        <w:tc>
+          <w:tcPr>
+            <w:tcW w:type="dxa" w:w="2400"/>
+            <w:tcBorders>
+              <w:top w:val="single" w:color="AAAAAA" w:sz="4"/>
+              <w:left w:val="single" w:color="AAAAAA" w:sz="4"/>
+              <w:bottom w:val="single" w:color="AAAAAA" w:sz="4"/>
+              <w:right w:val="single" w:color="AAAAAA" w:sz="4"/>
+            </w:tcBorders>
+            <w:tcMar>
+              <w:top w:type="dxa" w:w="60"/>
+              <w:left w:type="dxa" w:w="100"/>
+              <w:bottom w:type="dxa" w:w="60"/>
+              <w:right w:type="dxa" w:w="100"/>
+            </w:tcMar>
+            <w:vAlign w:val="center"/>
+          </w:tcPr>
+          <w:p>
+            <w:pPr>
+              <w:jc w:val="left"/>
+            </w:pPr>
+            <w:r>
+              <w:rPr>
+                <w:rFonts w:ascii="Times New Roman" w:cs="Times New Roman" w:eastAsia="Times New Roman" w:hAnsi="Times New Roman"/>
+                <w:b w:val="false"/>
+                <w:bCs w:val="false"/>
+                <w:sz w:val="18"/>
+                <w:szCs w:val="18"/>
+              </w:rPr>
+              <w:t xml:space="preserve">Wealth: Poorest</w:t>
+            </w:r>
+          </w:p>
+        </w:tc>
+        <w:tc>
+          <w:tcPr>
+            <w:tcW w:type="dxa" w:w="2320"/>
+            <w:tcBorders>
+              <w:top w:val="single" w:color="AAAAAA" w:sz="4"/>
+              <w:left w:val="single" w:color="AAAAAA" w:sz="4"/>
+              <w:bottom w:val="single" w:color="AAAAAA" w:sz="4"/>
+              <w:right w:val="single" w:color="AAAAAA" w:sz="4"/>
+            </w:tcBorders>
+            <w:tcMar>
+              <w:top w:type="dxa" w:w="60"/>
+              <w:left w:type="dxa" w:w="100"/>
+              <w:bottom w:type="dxa" w:w="60"/>
+              <w:right w:type="dxa" w:w="100"/>
+            </w:tcMar>
+            <w:vAlign w:val="center"/>
+          </w:tcPr>
+          <w:p>
+            <w:pPr>
+              <w:jc w:val="center"/>
+            </w:pPr>
+            <w:r>
+              <w:rPr>
+                <w:rFonts w:ascii="Times New Roman" w:cs="Times New Roman" w:eastAsia="Times New Roman" w:hAnsi="Times New Roman"/>
+                <w:b w:val="false"/>
+                <w:bCs w:val="false"/>
+                <w:sz w:val="18"/>
+                <w:szCs w:val="18"/>
+              </w:rPr>
+              <w:t xml:space="preserve">0.87 (0.67–1.14)</w:t>
+            </w:r>
+          </w:p>
+        </w:tc>
+        <w:tc>
+          <w:tcPr>
+            <w:tcW w:type="dxa" w:w="2320"/>
+            <w:tcBorders>
+              <w:top w:val="single" w:color="AAAAAA" w:sz="4"/>
+              <w:left w:val="single" w:color="AAAAAA" w:sz="4"/>
+              <w:bottom w:val="single" w:color="AAAAAA" w:sz="4"/>
+              <w:right w:val="single" w:color="AAAAAA" w:sz="4"/>
+            </w:tcBorders>
+            <w:tcMar>
+              <w:top w:type="dxa" w:w="60"/>
+              <w:left w:type="dxa" w:w="100"/>
+              <w:bottom w:type="dxa" w:w="60"/>
+              <w:right w:type="dxa" w:w="100"/>
+            </w:tcMar>
+            <w:vAlign w:val="center"/>
+          </w:tcPr>
+          <w:p>
+            <w:pPr>
+              <w:jc w:val="center"/>
+            </w:pPr>
+            <w:r>
+              <w:rPr>
+                <w:rFonts w:ascii="Times New Roman" w:cs="Times New Roman" w:eastAsia="Times New Roman" w:hAnsi="Times New Roman"/>
+                <w:b w:val="false"/>
+                <w:bCs w:val="false"/>
+                <w:sz w:val="18"/>
+                <w:szCs w:val="18"/>
+              </w:rPr>
+              <w:t xml:space="preserve">1.13 (0.94–1.36)</w:t>
+            </w:r>
+          </w:p>
+        </w:tc>
+        <w:tc>
+          <w:tcPr>
+            <w:tcW w:type="dxa" w:w="2320"/>
+            <w:tcBorders>
+              <w:top w:val="single" w:color="AAAAAA" w:sz="4"/>
+              <w:left w:val="single" w:color="AAAAAA" w:sz="4"/>
+              <w:bottom w:val="single" w:color="AAAAAA" w:sz="4"/>
+              <w:right w:val="single" w:color="AAAAAA" w:sz="4"/>
+            </w:tcBorders>
+            <w:tcMar>
+              <w:top w:type="dxa" w:w="60"/>
+              <w:left w:type="dxa" w:w="100"/>
+              <w:bottom w:type="dxa" w:w="60"/>
+              <w:right w:type="dxa" w:w="100"/>
+            </w:tcMar>
+            <w:vAlign w:val="center"/>
+          </w:tcPr>
+          <w:p>
+            <w:pPr>
+              <w:jc w:val="center"/>
+            </w:pPr>
+            <w:r>
+              <w:rPr>
+                <w:rFonts w:ascii="Times New Roman" w:cs="Times New Roman" w:eastAsia="Times New Roman" w:hAnsi="Times New Roman"/>
+                <w:b w:val="false"/>
+                <w:bCs w:val="false"/>
+                <w:sz w:val="18"/>
+                <w:szCs w:val="18"/>
+              </w:rPr>
+              <w:t xml:space="preserve">0.96 (0.84–1.10)</w:t>
+            </w:r>
+          </w:p>
+        </w:tc>
+      </w:tr>
+      <w:tr>
+        <w:tc>
+          <w:tcPr>
+            <w:tcW w:type="dxa" w:w="2400"/>
+            <w:tcBorders>
+              <w:top w:val="single" w:color="AAAAAA" w:sz="4"/>
+              <w:left w:val="single" w:color="AAAAAA" w:sz="4"/>
+              <w:bottom w:val="single" w:color="AAAAAA" w:sz="4"/>
+              <w:right w:val="single" w:color="AAAAAA" w:sz="4"/>
+            </w:tcBorders>
+            <w:tcMar>
+              <w:top w:type="dxa" w:w="60"/>
+              <w:left w:type="dxa" w:w="100"/>
+              <w:bottom w:type="dxa" w:w="60"/>
+              <w:right w:type="dxa" w:w="100"/>
+            </w:tcMar>
+            <w:vAlign w:val="center"/>
+          </w:tcPr>
+          <w:p>
+            <w:pPr>
+              <w:jc w:val="left"/>
+            </w:pPr>
+            <w:r>
+              <w:rPr>
+                <w:rFonts w:ascii="Times New Roman" w:cs="Times New Roman" w:eastAsia="Times New Roman" w:hAnsi="Times New Roman"/>
+                <w:b w:val="false"/>
+                <w:bCs w:val="false"/>
+                <w:sz w:val="18"/>
+                <w:szCs w:val="18"/>
+              </w:rPr>
+              <w:t xml:space="preserve">Wealth: Richer</w:t>
+            </w:r>
+          </w:p>
+        </w:tc>
+        <w:tc>
+          <w:tcPr>
+            <w:tcW w:type="dxa" w:w="2320"/>
+            <w:tcBorders>
+              <w:top w:val="single" w:color="AAAAAA" w:sz="4"/>
+              <w:left w:val="single" w:color="AAAAAA" w:sz="4"/>
+              <w:bottom w:val="single" w:color="AAAAAA" w:sz="4"/>
+              <w:right w:val="single" w:color="AAAAAA" w:sz="4"/>
+            </w:tcBorders>
+            <w:shd w:fill="FFE5CC" w:val="clear"/>
+            <w:tcMar>
+              <w:top w:type="dxa" w:w="60"/>
+              <w:left w:type="dxa" w:w="100"/>
+              <w:bottom w:type="dxa" w:w="60"/>
+              <w:right w:type="dxa" w:w="100"/>
+            </w:tcMar>
+            <w:vAlign w:val="center"/>
+          </w:tcPr>
+          <w:p>
+            <w:pPr>
+              <w:jc w:val="center"/>
+            </w:pPr>
+            <w:r>
+              <w:rPr>
+                <w:rFonts w:ascii="Times New Roman" w:cs="Times New Roman" w:eastAsia="Times New Roman" w:hAnsi="Times New Roman"/>
+                <w:b w:val="false"/>
+                <w:bCs w:val="false"/>
+                <w:sz w:val="18"/>
+                <w:szCs w:val="18"/>
+              </w:rPr>
+              <w:t xml:space="preserve">1.48 (1.17–1.88)**</w:t>
+            </w:r>
+          </w:p>
+        </w:tc>
+        <w:tc>
+          <w:tcPr>
+            <w:tcW w:type="dxa" w:w="2320"/>
+            <w:tcBorders>
+              <w:top w:val="single" w:color="AAAAAA" w:sz="4"/>
+              <w:left w:val="single" w:color="AAAAAA" w:sz="4"/>
+              <w:bottom w:val="single" w:color="AAAAAA" w:sz="4"/>
+              <w:right w:val="single" w:color="AAAAAA" w:sz="4"/>
+            </w:tcBorders>
+            <w:tcMar>
+              <w:top w:type="dxa" w:w="60"/>
+              <w:left w:type="dxa" w:w="100"/>
+              <w:bottom w:type="dxa" w:w="60"/>
+              <w:right w:type="dxa" w:w="100"/>
+            </w:tcMar>
+            <w:vAlign w:val="center"/>
+          </w:tcPr>
+          <w:p>
+            <w:pPr>
+              <w:jc w:val="center"/>
+            </w:pPr>
+            <w:r>
+              <w:rPr>
+                <w:rFonts w:ascii="Times New Roman" w:cs="Times New Roman" w:eastAsia="Times New Roman" w:hAnsi="Times New Roman"/>
+                <w:b w:val="false"/>
+                <w:bCs w:val="false"/>
+                <w:sz w:val="18"/>
+                <w:szCs w:val="18"/>
+              </w:rPr>
+              <w:t xml:space="preserve">0.92 (0.75–1.13)</w:t>
+            </w:r>
+          </w:p>
+        </w:tc>
+        <w:tc>
+          <w:tcPr>
+            <w:tcW w:type="dxa" w:w="2320"/>
+            <w:tcBorders>
+              <w:top w:val="single" w:color="AAAAAA" w:sz="4"/>
+              <w:left w:val="single" w:color="AAAAAA" w:sz="4"/>
+              <w:bottom w:val="single" w:color="AAAAAA" w:sz="4"/>
+              <w:right w:val="single" w:color="AAAAAA" w:sz="4"/>
+            </w:tcBorders>
+            <w:tcMar>
+              <w:top w:type="dxa" w:w="60"/>
+              <w:left w:type="dxa" w:w="100"/>
+              <w:bottom w:type="dxa" w:w="60"/>
+              <w:right w:type="dxa" w:w="100"/>
+            </w:tcMar>
+            <w:vAlign w:val="center"/>
+          </w:tcPr>
+          <w:p>
+            <w:pPr>
+              <w:jc w:val="center"/>
+            </w:pPr>
+            <w:r>
+              <w:rPr>
+                <w:rFonts w:ascii="Times New Roman" w:cs="Times New Roman" w:eastAsia="Times New Roman" w:hAnsi="Times New Roman"/>
+                <w:b w:val="false"/>
+                <w:bCs w:val="false"/>
+                <w:sz w:val="18"/>
+                <w:szCs w:val="18"/>
+              </w:rPr>
+              <w:t xml:space="preserve">1.04 (0.91–1.19)</w:t>
+            </w:r>
+          </w:p>
+        </w:tc>
+      </w:tr>
+      <w:tr>
+        <w:tc>
+          <w:tcPr>
+            <w:tcW w:type="dxa" w:w="2400"/>
+            <w:tcBorders>
+              <w:top w:val="single" w:color="AAAAAA" w:sz="4"/>
+              <w:left w:val="single" w:color="AAAAAA" w:sz="4"/>
+              <w:bottom w:val="single" w:color="AAAAAA" w:sz="4"/>
+              <w:right w:val="single" w:color="AAAAAA" w:sz="4"/>
+            </w:tcBorders>
+            <w:tcMar>
+              <w:top w:type="dxa" w:w="60"/>
+              <w:left w:type="dxa" w:w="100"/>
+              <w:bottom w:type="dxa" w:w="60"/>
+              <w:right w:type="dxa" w:w="100"/>
+            </w:tcMar>
+            <w:vAlign w:val="center"/>
+          </w:tcPr>
+          <w:p>
+            <w:pPr>
+              <w:jc w:val="left"/>
+            </w:pPr>
+            <w:r>
+              <w:rPr>
+                <w:rFonts w:ascii="Times New Roman" w:cs="Times New Roman" w:eastAsia="Times New Roman" w:hAnsi="Times New Roman"/>
+                <w:b w:val="false"/>
+                <w:bCs w:val="false"/>
+                <w:sz w:val="18"/>
+                <w:szCs w:val="18"/>
+              </w:rPr>
+              <w:t xml:space="preserve">Wealth: Richest</w:t>
+            </w:r>
+          </w:p>
+        </w:tc>
+        <w:tc>
+          <w:tcPr>
+            <w:tcW w:type="dxa" w:w="2320"/>
+            <w:tcBorders>
+              <w:top w:val="single" w:color="AAAAAA" w:sz="4"/>
+              <w:left w:val="single" w:color="AAAAAA" w:sz="4"/>
+              <w:bottom w:val="single" w:color="AAAAAA" w:sz="4"/>
+              <w:right w:val="single" w:color="AAAAAA" w:sz="4"/>
+            </w:tcBorders>
+            <w:shd w:fill="FFE5CC" w:val="clear"/>
+            <w:tcMar>
+              <w:top w:type="dxa" w:w="60"/>
+              <w:left w:type="dxa" w:w="100"/>
+              <w:bottom w:type="dxa" w:w="60"/>
+              <w:right w:type="dxa" w:w="100"/>
+            </w:tcMar>
+            <w:vAlign w:val="center"/>
+          </w:tcPr>
+          <w:p>
+            <w:pPr>
+              <w:jc w:val="center"/>
+            </w:pPr>
+            <w:r>
+              <w:rPr>
+                <w:rFonts w:ascii="Times New Roman" w:cs="Times New Roman" w:eastAsia="Times New Roman" w:hAnsi="Times New Roman"/>
+                <w:b w:val="false"/>
+                <w:bCs w:val="false"/>
+                <w:sz w:val="18"/>
+                <w:szCs w:val="18"/>
+              </w:rPr>
+              <w:t xml:space="preserve">1.81 (1.40–2.34)***</w:t>
+            </w:r>
+          </w:p>
+        </w:tc>
+        <w:tc>
+          <w:tcPr>
+            <w:tcW w:type="dxa" w:w="2320"/>
+            <w:tcBorders>
+              <w:top w:val="single" w:color="AAAAAA" w:sz="4"/>
+              <w:left w:val="single" w:color="AAAAAA" w:sz="4"/>
+              <w:bottom w:val="single" w:color="AAAAAA" w:sz="4"/>
+              <w:right w:val="single" w:color="AAAAAA" w:sz="4"/>
+            </w:tcBorders>
+            <w:tcMar>
+              <w:top w:type="dxa" w:w="60"/>
+              <w:left w:type="dxa" w:w="100"/>
+              <w:bottom w:type="dxa" w:w="60"/>
+              <w:right w:type="dxa" w:w="100"/>
+            </w:tcMar>
+            <w:vAlign w:val="center"/>
+          </w:tcPr>
+          <w:p>
+            <w:pPr>
+              <w:jc w:val="center"/>
+            </w:pPr>
+            <w:r>
+              <w:rPr>
+                <w:rFonts w:ascii="Times New Roman" w:cs="Times New Roman" w:eastAsia="Times New Roman" w:hAnsi="Times New Roman"/>
+                <w:b w:val="false"/>
+                <w:bCs w:val="false"/>
+                <w:sz w:val="18"/>
+                <w:szCs w:val="18"/>
+              </w:rPr>
+              <w:t xml:space="preserve">0.84 (0.65–1.10)</w:t>
+            </w:r>
+          </w:p>
+        </w:tc>
+        <w:tc>
+          <w:tcPr>
+            <w:tcW w:type="dxa" w:w="2320"/>
+            <w:tcBorders>
+              <w:top w:val="single" w:color="AAAAAA" w:sz="4"/>
+              <w:left w:val="single" w:color="AAAAAA" w:sz="4"/>
+              <w:bottom w:val="single" w:color="AAAAAA" w:sz="4"/>
+              <w:right w:val="single" w:color="AAAAAA" w:sz="4"/>
+            </w:tcBorders>
+            <w:shd w:fill="E8F5E9" w:val="clear"/>
+            <w:tcMar>
+              <w:top w:type="dxa" w:w="60"/>
+              <w:left w:type="dxa" w:w="100"/>
+              <w:bottom w:type="dxa" w:w="60"/>
+              <w:right w:type="dxa" w:w="100"/>
+            </w:tcMar>
+            <w:vAlign w:val="center"/>
+          </w:tcPr>
+          <w:p>
+            <w:pPr>
+              <w:jc w:val="center"/>
+            </w:pPr>
+            <w:r>
+              <w:rPr>
+                <w:rFonts w:ascii="Times New Roman" w:cs="Times New Roman" w:eastAsia="Times New Roman" w:hAnsi="Times New Roman"/>
+                <w:b w:val="false"/>
+                <w:bCs w:val="false"/>
+                <w:sz w:val="18"/>
+                <w:szCs w:val="18"/>
+              </w:rPr>
+              <w:t xml:space="preserve">1.28 (1.09–1.50)**</w:t>
+            </w:r>
+          </w:p>
+        </w:tc>
+      </w:tr>
+      <w:tr>
+        <w:tc>
+          <w:tcPr>
+            <w:tcW w:type="dxa" w:w="2400"/>
+            <w:tcBorders>
+              <w:top w:val="single" w:color="AAAAAA" w:sz="4"/>
+              <w:left w:val="single" w:color="AAAAAA" w:sz="4"/>
+              <w:bottom w:val="single" w:color="AAAAAA" w:sz="4"/>
+              <w:right w:val="single" w:color="AAAAAA" w:sz="4"/>
+            </w:tcBorders>
+            <w:tcMar>
+              <w:top w:type="dxa" w:w="60"/>
+              <w:left w:type="dxa" w:w="100"/>
+              <w:bottom w:type="dxa" w:w="60"/>
+              <w:right w:type="dxa" w:w="100"/>
+            </w:tcMar>
+            <w:vAlign w:val="center"/>
+          </w:tcPr>
+          <w:p>
+            <w:pPr>
+              <w:jc w:val="left"/>
+            </w:pPr>
+            <w:r>
+              <w:rPr>
+                <w:rFonts w:ascii="Times New Roman" w:cs="Times New Roman" w:eastAsia="Times New Roman" w:hAnsi="Times New Roman"/>
+                <w:b w:val="false"/>
+                <w:bCs w:val="false"/>
+                <w:sz w:val="18"/>
+                <w:szCs w:val="18"/>
+              </w:rPr>
+              <w:t xml:space="preserve">Education: No education</w:t>
+            </w:r>
+          </w:p>
+        </w:tc>
+        <w:tc>
+          <w:tcPr>
+            <w:tcW w:type="dxa" w:w="2320"/>
+            <w:tcBorders>
+              <w:top w:val="single" w:color="AAAAAA" w:sz="4"/>
+              <w:left w:val="single" w:color="AAAAAA" w:sz="4"/>
+              <w:bottom w:val="single" w:color="AAAAAA" w:sz="4"/>
+              <w:right w:val="single" w:color="AAAAAA" w:sz="4"/>
+            </w:tcBorders>
+            <w:shd w:fill="FFE5CC" w:val="clear"/>
+            <w:tcMar>
+              <w:top w:type="dxa" w:w="60"/>
+              <w:left w:type="dxa" w:w="100"/>
+              <w:bottom w:type="dxa" w:w="60"/>
+              <w:right w:type="dxa" w:w="100"/>
+            </w:tcMar>
+            <w:vAlign w:val="center"/>
+          </w:tcPr>
+          <w:p>
+            <w:pPr>
+              <w:jc w:val="center"/>
+            </w:pPr>
+            <w:r>
+              <w:rPr>
+                <w:rFonts w:ascii="Times New Roman" w:cs="Times New Roman" w:eastAsia="Times New Roman" w:hAnsi="Times New Roman"/>
+                <w:b w:val="false"/>
+                <w:bCs w:val="false"/>
+                <w:sz w:val="18"/>
+                <w:szCs w:val="18"/>
+              </w:rPr>
+              <w:t xml:space="preserve">0.45 (0.28–0.72)***</w:t>
+            </w:r>
+          </w:p>
+        </w:tc>
+        <w:tc>
+          <w:tcPr>
+            <w:tcW w:type="dxa" w:w="2320"/>
+            <w:tcBorders>
+              <w:top w:val="single" w:color="AAAAAA" w:sz="4"/>
+              <w:left w:val="single" w:color="AAAAAA" w:sz="4"/>
+              <w:bottom w:val="single" w:color="AAAAAA" w:sz="4"/>
+              <w:right w:val="single" w:color="AAAAAA" w:sz="4"/>
+            </w:tcBorders>
+            <w:tcMar>
+              <w:top w:type="dxa" w:w="60"/>
+              <w:left w:type="dxa" w:w="100"/>
+              <w:bottom w:type="dxa" w:w="60"/>
+              <w:right w:type="dxa" w:w="100"/>
+            </w:tcMar>
+            <w:vAlign w:val="center"/>
+          </w:tcPr>
+          <w:p>
+            <w:pPr>
+              <w:jc w:val="center"/>
+            </w:pPr>
+            <w:r>
+              <w:rPr>
+                <w:rFonts w:ascii="Times New Roman" w:cs="Times New Roman" w:eastAsia="Times New Roman" w:hAnsi="Times New Roman"/>
+                <w:b w:val="false"/>
+                <w:bCs w:val="false"/>
+                <w:sz w:val="18"/>
+                <w:szCs w:val="18"/>
+              </w:rPr>
+              <w:t xml:space="preserve">2.13 (0.84–5.43)</w:t>
+            </w:r>
+          </w:p>
+        </w:tc>
+        <w:tc>
+          <w:tcPr>
+            <w:tcW w:type="dxa" w:w="2320"/>
+            <w:tcBorders>
+              <w:top w:val="single" w:color="AAAAAA" w:sz="4"/>
+              <w:left w:val="single" w:color="AAAAAA" w:sz="4"/>
+              <w:bottom w:val="single" w:color="AAAAAA" w:sz="4"/>
+              <w:right w:val="single" w:color="AAAAAA" w:sz="4"/>
+            </w:tcBorders>
+            <w:shd w:fill="FFE5CC" w:val="clear"/>
+            <w:tcMar>
+              <w:top w:type="dxa" w:w="60"/>
+              <w:left w:type="dxa" w:w="100"/>
+              <w:bottom w:type="dxa" w:w="60"/>
+              <w:right w:type="dxa" w:w="100"/>
+            </w:tcMar>
+            <w:vAlign w:val="center"/>
+          </w:tcPr>
+          <w:p>
+            <w:pPr>
+              <w:jc w:val="center"/>
+            </w:pPr>
+            <w:r>
+              <w:rPr>
+                <w:rFonts w:ascii="Times New Roman" w:cs="Times New Roman" w:eastAsia="Times New Roman" w:hAnsi="Times New Roman"/>
+                <w:b w:val="false"/>
+                <w:bCs w:val="false"/>
+                <w:sz w:val="18"/>
+                <w:szCs w:val="18"/>
+              </w:rPr>
+              <w:t xml:space="preserve">0.62 (0.44–0.88)**</w:t>
+            </w:r>
+          </w:p>
+        </w:tc>
+      </w:tr>
+      <w:tr>
+        <w:tc>
+          <w:tcPr>
+            <w:tcW w:type="dxa" w:w="2400"/>
+            <w:tcBorders>
+              <w:top w:val="single" w:color="AAAAAA" w:sz="4"/>
+              <w:left w:val="single" w:color="AAAAAA" w:sz="4"/>
+              <w:bottom w:val="single" w:color="AAAAAA" w:sz="4"/>
+              <w:right w:val="single" w:color="AAAAAA" w:sz="4"/>
+            </w:tcBorders>
+            <w:tcMar>
+              <w:top w:type="dxa" w:w="60"/>
+              <w:left w:type="dxa" w:w="100"/>
+              <w:bottom w:type="dxa" w:w="60"/>
+              <w:right w:type="dxa" w:w="100"/>
+            </w:tcMar>
+            <w:vAlign w:val="center"/>
+          </w:tcPr>
+          <w:p>
+            <w:pPr>
+              <w:jc w:val="left"/>
+            </w:pPr>
+            <w:r>
+              <w:rPr>
+                <w:rFonts w:ascii="Times New Roman" w:cs="Times New Roman" w:eastAsia="Times New Roman" w:hAnsi="Times New Roman"/>
+                <w:b w:val="false"/>
+                <w:bCs w:val="false"/>
+                <w:sz w:val="18"/>
+                <w:szCs w:val="18"/>
+              </w:rPr>
+              <w:t xml:space="preserve">Education: Primary</w:t>
+            </w:r>
+          </w:p>
+        </w:tc>
+        <w:tc>
+          <w:tcPr>
+            <w:tcW w:type="dxa" w:w="2320"/>
+            <w:tcBorders>
+              <w:top w:val="single" w:color="AAAAAA" w:sz="4"/>
+              <w:left w:val="single" w:color="AAAAAA" w:sz="4"/>
+              <w:bottom w:val="single" w:color="AAAAAA" w:sz="4"/>
+              <w:right w:val="single" w:color="AAAAAA" w:sz="4"/>
+            </w:tcBorders>
+            <w:shd w:fill="FFE5CC" w:val="clear"/>
+            <w:tcMar>
+              <w:top w:type="dxa" w:w="60"/>
+              <w:left w:type="dxa" w:w="100"/>
+              <w:bottom w:type="dxa" w:w="60"/>
+              <w:right w:type="dxa" w:w="100"/>
+            </w:tcMar>
+            <w:vAlign w:val="center"/>
+          </w:tcPr>
+          <w:p>
+            <w:pPr>
+              <w:jc w:val="center"/>
+            </w:pPr>
+            <w:r>
+              <w:rPr>
+                <w:rFonts w:ascii="Times New Roman" w:cs="Times New Roman" w:eastAsia="Times New Roman" w:hAnsi="Times New Roman"/>
+                <w:b w:val="false"/>
+                <w:bCs w:val="false"/>
+                <w:sz w:val="18"/>
+                <w:szCs w:val="18"/>
+              </w:rPr>
+              <w:t xml:space="preserve">0.54 (0.37–0.78)**</w:t>
+            </w:r>
+          </w:p>
+        </w:tc>
+        <w:tc>
+          <w:tcPr>
+            <w:tcW w:type="dxa" w:w="2320"/>
+            <w:tcBorders>
+              <w:top w:val="single" w:color="AAAAAA" w:sz="4"/>
+              <w:left w:val="single" w:color="AAAAAA" w:sz="4"/>
+              <w:bottom w:val="single" w:color="AAAAAA" w:sz="4"/>
+              <w:right w:val="single" w:color="AAAAAA" w:sz="4"/>
+            </w:tcBorders>
+            <w:tcMar>
+              <w:top w:type="dxa" w:w="60"/>
+              <w:left w:type="dxa" w:w="100"/>
+              <w:bottom w:type="dxa" w:w="60"/>
+              <w:right w:type="dxa" w:w="100"/>
+            </w:tcMar>
+            <w:vAlign w:val="center"/>
+          </w:tcPr>
+          <w:p>
+            <w:pPr>
+              <w:jc w:val="center"/>
+            </w:pPr>
+            <w:r>
+              <w:rPr>
+                <w:rFonts w:ascii="Times New Roman" w:cs="Times New Roman" w:eastAsia="Times New Roman" w:hAnsi="Times New Roman"/>
+                <w:b w:val="false"/>
+                <w:bCs w:val="false"/>
+                <w:sz w:val="18"/>
+                <w:szCs w:val="18"/>
+              </w:rPr>
+              <w:t xml:space="preserve">1.85 (0.74–4.63)</w:t>
+            </w:r>
+          </w:p>
+        </w:tc>
+        <w:tc>
+          <w:tcPr>
+            <w:tcW w:type="dxa" w:w="2320"/>
+            <w:tcBorders>
+              <w:top w:val="single" w:color="AAAAAA" w:sz="4"/>
+              <w:left w:val="single" w:color="AAAAAA" w:sz="4"/>
+              <w:bottom w:val="single" w:color="AAAAAA" w:sz="4"/>
+              <w:right w:val="single" w:color="AAAAAA" w:sz="4"/>
+            </w:tcBorders>
+            <w:shd w:fill="FFE5CC" w:val="clear"/>
+            <w:tcMar>
+              <w:top w:type="dxa" w:w="60"/>
+              <w:left w:type="dxa" w:w="100"/>
+              <w:bottom w:type="dxa" w:w="60"/>
+              <w:right w:type="dxa" w:w="100"/>
+            </w:tcMar>
+            <w:vAlign w:val="center"/>
+          </w:tcPr>
+          <w:p>
+            <w:pPr>
+              <w:jc w:val="center"/>
+            </w:pPr>
+            <w:r>
+              <w:rPr>
+                <w:rFonts w:ascii="Times New Roman" w:cs="Times New Roman" w:eastAsia="Times New Roman" w:hAnsi="Times New Roman"/>
+                <w:b w:val="false"/>
+                <w:bCs w:val="false"/>
+                <w:sz w:val="18"/>
+                <w:szCs w:val="18"/>
+              </w:rPr>
+              <w:t xml:space="preserve">0.69 (0.50–0.95)*</w:t>
+            </w:r>
+          </w:p>
+        </w:tc>
+      </w:tr>
+      <w:tr>
+        <w:tc>
+          <w:tcPr>
+            <w:tcW w:type="dxa" w:w="2400"/>
+            <w:tcBorders>
+              <w:top w:val="single" w:color="AAAAAA" w:sz="4"/>
+              <w:left w:val="single" w:color="AAAAAA" w:sz="4"/>
+              <w:bottom w:val="single" w:color="AAAAAA" w:sz="4"/>
+              <w:right w:val="single" w:color="AAAAAA" w:sz="4"/>
+            </w:tcBorders>
+            <w:tcMar>
+              <w:top w:type="dxa" w:w="60"/>
+              <w:left w:type="dxa" w:w="100"/>
+              <w:bottom w:type="dxa" w:w="60"/>
+              <w:right w:type="dxa" w:w="100"/>
+            </w:tcMar>
+            <w:vAlign w:val="center"/>
+          </w:tcPr>
+          <w:p>
+            <w:pPr>
+              <w:jc w:val="left"/>
+            </w:pPr>
+            <w:r>
+              <w:rPr>
+                <w:rFonts w:ascii="Times New Roman" w:cs="Times New Roman" w:eastAsia="Times New Roman" w:hAnsi="Times New Roman"/>
+                <w:b w:val="false"/>
+                <w:bCs w:val="false"/>
+                <w:sz w:val="18"/>
+                <w:szCs w:val="18"/>
+              </w:rPr>
+              <w:t xml:space="preserve">Education: Secondary</w:t>
+            </w:r>
+          </w:p>
+        </w:tc>
+        <w:tc>
+          <w:tcPr>
+            <w:tcW w:type="dxa" w:w="2320"/>
+            <w:tcBorders>
+              <w:top w:val="single" w:color="AAAAAA" w:sz="4"/>
+              <w:left w:val="single" w:color="AAAAAA" w:sz="4"/>
+              <w:bottom w:val="single" w:color="AAAAAA" w:sz="4"/>
+              <w:right w:val="single" w:color="AAAAAA" w:sz="4"/>
+            </w:tcBorders>
+            <w:shd w:fill="FFE5CC" w:val="clear"/>
+            <w:tcMar>
+              <w:top w:type="dxa" w:w="60"/>
+              <w:left w:type="dxa" w:w="100"/>
+              <w:bottom w:type="dxa" w:w="60"/>
+              <w:right w:type="dxa" w:w="100"/>
+            </w:tcMar>
+            <w:vAlign w:val="center"/>
+          </w:tcPr>
+          <w:p>
+            <w:pPr>
+              <w:jc w:val="center"/>
+            </w:pPr>
+            <w:r>
+              <w:rPr>
+                <w:rFonts w:ascii="Times New Roman" w:cs="Times New Roman" w:eastAsia="Times New Roman" w:hAnsi="Times New Roman"/>
+                <w:b w:val="false"/>
+                <w:bCs w:val="false"/>
+                <w:sz w:val="18"/>
+                <w:szCs w:val="18"/>
+              </w:rPr>
+              <w:t xml:space="preserve">0.59 (0.41–0.85)**</w:t>
+            </w:r>
+          </w:p>
+        </w:tc>
+        <w:tc>
+          <w:tcPr>
+            <w:tcW w:type="dxa" w:w="2320"/>
+            <w:tcBorders>
+              <w:top w:val="single" w:color="AAAAAA" w:sz="4"/>
+              <w:left w:val="single" w:color="AAAAAA" w:sz="4"/>
+              <w:bottom w:val="single" w:color="AAAAAA" w:sz="4"/>
+              <w:right w:val="single" w:color="AAAAAA" w:sz="4"/>
+            </w:tcBorders>
+            <w:tcMar>
+              <w:top w:type="dxa" w:w="60"/>
+              <w:left w:type="dxa" w:w="100"/>
+              <w:bottom w:type="dxa" w:w="60"/>
+              <w:right w:type="dxa" w:w="100"/>
+            </w:tcMar>
+            <w:vAlign w:val="center"/>
+          </w:tcPr>
+          <w:p>
+            <w:pPr>
+              <w:jc w:val="center"/>
+            </w:pPr>
+            <w:r>
+              <w:rPr>
+                <w:rFonts w:ascii="Times New Roman" w:cs="Times New Roman" w:eastAsia="Times New Roman" w:hAnsi="Times New Roman"/>
+                <w:b w:val="false"/>
+                <w:bCs w:val="false"/>
+                <w:sz w:val="18"/>
+                <w:szCs w:val="18"/>
+              </w:rPr>
+              <w:t xml:space="preserve">1.29 (0.51–3.24)</w:t>
+            </w:r>
+          </w:p>
+        </w:tc>
+        <w:tc>
+          <w:tcPr>
+            <w:tcW w:type="dxa" w:w="2320"/>
+            <w:tcBorders>
+              <w:top w:val="single" w:color="AAAAAA" w:sz="4"/>
+              <w:left w:val="single" w:color="AAAAAA" w:sz="4"/>
+              <w:bottom w:val="single" w:color="AAAAAA" w:sz="4"/>
+              <w:right w:val="single" w:color="AAAAAA" w:sz="4"/>
+            </w:tcBorders>
+            <w:shd w:fill="FFE5CC" w:val="clear"/>
+            <w:tcMar>
+              <w:top w:type="dxa" w:w="60"/>
+              <w:left w:type="dxa" w:w="100"/>
+              <w:bottom w:type="dxa" w:w="60"/>
+              <w:right w:type="dxa" w:w="100"/>
+            </w:tcMar>
+            <w:vAlign w:val="center"/>
+          </w:tcPr>
+          <w:p>
+            <w:pPr>
+              <w:jc w:val="center"/>
+            </w:pPr>
+            <w:r>
+              <w:rPr>
+                <w:rFonts w:ascii="Times New Roman" w:cs="Times New Roman" w:eastAsia="Times New Roman" w:hAnsi="Times New Roman"/>
+                <w:b w:val="false"/>
+                <w:bCs w:val="false"/>
+                <w:sz w:val="18"/>
+                <w:szCs w:val="18"/>
+              </w:rPr>
+              <w:t xml:space="preserve">0.62 (0.45–0.85)**</w:t>
+            </w:r>
+          </w:p>
+        </w:tc>
+      </w:tr>
+    </w:tbl>
+    <w:p>
+      <w:pPr>
+        <w:spacing w:after="0" w:before="280"/>
+      </w:pPr>
+    </w:p>
+    <w:p>
+      <w:pPr>
+        <w:spacing w:after="80" w:before="40"/>
+      </w:pPr>
+      <w:r>
+        <w:rPr>
+          <w:rFonts w:ascii="Times New Roman" w:cs="Times New Roman" w:eastAsia="Times New Roman" w:hAnsi="Times New Roman"/>
+          <w:i/>
+          <w:iCs/>
+          <w:sz w:val="18"/>
+          <w:szCs w:val="18"/>
+        </w:rPr>
+        <w:t xml:space="preserve">Panel B: MDHS 2024 — Reference group: C-2 (Late ANC, facility delivery; n = 3,349)</w:t>
+      </w:r>
+    </w:p>
+    <w:tbl>
+      <w:tblPr>
+        <w:tblW w:type="dxa" w:w="9360"/>
+        <w:tblBorders>
+          <w:top w:val="single" w:color="auto" w:sz="4"/>
+          <w:left w:val="single" w:color="auto" w:sz="4"/>
+          <w:bottom w:val="single" w:color="auto" w:sz="4"/>
+          <w:right w:val="single" w:color="auto" w:sz="4"/>
+          <w:insideH w:val="single" w:color="auto" w:sz="4"/>
+          <w:insideV w:val="single" w:color="auto" w:sz="4"/>
+        </w:tblBorders>
+      </w:tblPr>
+      <w:tblGrid>
+        <w:gridCol w:w="2400"/>
+        <w:gridCol w:w="3480"/>
+        <w:gridCol w:w="3480"/>
+      </w:tblGrid>
+      <w:tr>
+        <w:tc>
+          <w:tcPr>
+            <w:tcW w:type="dxa" w:w="2400"/>
+            <w:tcBorders>
+              <w:top w:val="single" w:color="AAAAAA" w:sz="4"/>
+              <w:left w:val="single" w:color="AAAAAA" w:sz="4"/>
+              <w:bottom w:val="single" w:color="AAAAAA" w:sz="4"/>
+              <w:right w:val="single" w:color="AAAAAA" w:sz="4"/>
+            </w:tcBorders>
+            <w:shd w:fill="1F3864" w:val="clear"/>
+            <w:tcMar>
+              <w:top w:type="dxa" w:w="80"/>
+              <w:left w:type="dxa" w:w="120"/>
+              <w:bottom w:type="dxa" w:w="80"/>
+              <w:right w:type="dxa" w:w="120"/>
+            </w:tcMar>
+            <w:vAlign w:val="center"/>
+          </w:tcPr>
+          <w:p>
+            <w:pPr>
+              <w:jc w:val="center"/>
+            </w:pPr>
+            <w:r>
+              <w:rPr>
+                <w:rFonts w:ascii="Times New Roman" w:cs="Times New Roman" w:eastAsia="Times New Roman" w:hAnsi="Times New Roman"/>
+                <w:b/>
+                <w:bCs/>
+                <w:color w:val="FFFFFF"/>
+                <w:sz w:val="18"/>
+                <w:szCs w:val="18"/>
+              </w:rPr>
+              <w:t xml:space="preserve">Predictor</w:t>
+            </w:r>
+          </w:p>
+        </w:tc>
+        <w:tc>
+          <w:tcPr>
+            <w:tcW w:type="dxa" w:w="3480"/>
+            <w:tcBorders>
+              <w:top w:val="single" w:color="AAAAAA" w:sz="4"/>
+              <w:left w:val="single" w:color="AAAAAA" w:sz="4"/>
+              <w:bottom w:val="single" w:color="AAAAAA" w:sz="4"/>
+              <w:right w:val="single" w:color="AAAAAA" w:sz="4"/>
+            </w:tcBorders>
+            <w:shd w:fill="1F3864" w:val="clear"/>
+            <w:tcMar>
+              <w:top w:type="dxa" w:w="80"/>
+              <w:left w:type="dxa" w:w="120"/>
+              <w:bottom w:type="dxa" w:w="80"/>
+              <w:right w:type="dxa" w:w="120"/>
+            </w:tcMar>
+            <w:vAlign w:val="center"/>
+          </w:tcPr>
+          <w:p>
+            <w:pPr>
+              <w:jc w:val="center"/>
+            </w:pPr>
+            <w:r>
+              <w:rPr>
+                <w:rFonts w:ascii="Times New Roman" w:cs="Times New Roman" w:eastAsia="Times New Roman" w:hAnsi="Times New Roman"/>
+                <w:b/>
+                <w:bCs/>
+                <w:color w:val="FFFFFF"/>
+                <w:sz w:val="18"/>
+                <w:szCs w:val="18"/>
+              </w:rPr>
+              <w:t xml:space="preserve">C-1: High coverage
+(n = 3,232)</w:t>
+            </w:r>
+          </w:p>
+        </w:tc>
+        <w:tc>
+          <w:tcPr>
+            <w:tcW w:type="dxa" w:w="3480"/>
+            <w:tcBorders>
+              <w:top w:val="single" w:color="AAAAAA" w:sz="4"/>
+              <w:left w:val="single" w:color="AAAAAA" w:sz="4"/>
+              <w:bottom w:val="single" w:color="AAAAAA" w:sz="4"/>
+              <w:right w:val="single" w:color="AAAAAA" w:sz="4"/>
+            </w:tcBorders>
+            <w:shd w:fill="1F3864" w:val="clear"/>
+            <w:tcMar>
+              <w:top w:type="dxa" w:w="80"/>
+              <w:left w:type="dxa" w:w="120"/>
+              <w:bottom w:type="dxa" w:w="80"/>
+              <w:right w:type="dxa" w:w="120"/>
+            </w:tcMar>
+            <w:vAlign w:val="center"/>
+          </w:tcPr>
+          <w:p>
+            <w:pPr>
+              <w:jc w:val="center"/>
+            </w:pPr>
+            <w:r>
+              <w:rPr>
+                <w:rFonts w:ascii="Times New Roman" w:cs="Times New Roman" w:eastAsia="Times New Roman" w:hAnsi="Times New Roman"/>
+                <w:b/>
+                <w:bCs/>
+                <w:color w:val="FFFFFF"/>
+                <w:sz w:val="18"/>
+                <w:szCs w:val="18"/>
+              </w:rPr>
+              <w:t xml:space="preserve">C-3: Moderate ANC, limited delivery
+(n = 344)</w:t>
+            </w:r>
+          </w:p>
+        </w:tc>
+      </w:tr>
+      <w:tr>
+        <w:tc>
+          <w:tcPr>
+            <w:tcW w:type="dxa" w:w="2400"/>
+            <w:tcBorders>
+              <w:top w:val="single" w:color="AAAAAA" w:sz="4"/>
+              <w:left w:val="single" w:color="AAAAAA" w:sz="4"/>
+              <w:bottom w:val="single" w:color="AAAAAA" w:sz="4"/>
+              <w:right w:val="single" w:color="AAAAAA" w:sz="4"/>
+            </w:tcBorders>
+            <w:tcMar>
+              <w:top w:type="dxa" w:w="60"/>
+              <w:left w:type="dxa" w:w="100"/>
+              <w:bottom w:type="dxa" w:w="60"/>
+              <w:right w:type="dxa" w:w="100"/>
+            </w:tcMar>
+            <w:vAlign w:val="center"/>
+          </w:tcPr>
+          <w:p>
+            <w:pPr>
+              <w:jc w:val="left"/>
+            </w:pPr>
+            <w:r>
+              <w:rPr>
+                <w:rFonts w:ascii="Times New Roman" w:cs="Times New Roman" w:eastAsia="Times New Roman" w:hAnsi="Times New Roman"/>
+                <w:b/>
+                <w:bCs/>
+                <w:sz w:val="18"/>
+                <w:szCs w:val="18"/>
+              </w:rPr>
+              <w:t xml:space="preserve">Age (per year)</w:t>
+            </w:r>
+          </w:p>
+        </w:tc>
+        <w:tc>
+          <w:tcPr>
+            <w:tcW w:type="dxa" w:w="3480"/>
+            <w:tcBorders>
+              <w:top w:val="single" w:color="AAAAAA" w:sz="4"/>
+              <w:left w:val="single" w:color="AAAAAA" w:sz="4"/>
+              <w:bottom w:val="single" w:color="AAAAAA" w:sz="4"/>
+              <w:right w:val="single" w:color="AAAAAA" w:sz="4"/>
+            </w:tcBorders>
+            <w:shd w:fill="E8F5E9" w:val="clear"/>
+            <w:tcMar>
+              <w:top w:type="dxa" w:w="60"/>
+              <w:left w:type="dxa" w:w="100"/>
+              <w:bottom w:type="dxa" w:w="60"/>
+              <w:right w:type="dxa" w:w="100"/>
+            </w:tcMar>
+            <w:vAlign w:val="center"/>
+          </w:tcPr>
+          <w:p>
+            <w:pPr>
+              <w:jc w:val="center"/>
+            </w:pPr>
+            <w:r>
+              <w:rPr>
+                <w:rFonts w:ascii="Times New Roman" w:cs="Times New Roman" w:eastAsia="Times New Roman" w:hAnsi="Times New Roman"/>
+                <w:b w:val="false"/>
+                <w:bCs w:val="false"/>
+                <w:sz w:val="18"/>
+                <w:szCs w:val="18"/>
+              </w:rPr>
+              <w:t xml:space="preserve">1.02 (1.00–1.03)*</w:t>
+            </w:r>
+          </w:p>
+        </w:tc>
+        <w:tc>
+          <w:tcPr>
+            <w:tcW w:type="dxa" w:w="3480"/>
+            <w:tcBorders>
+              <w:top w:val="single" w:color="AAAAAA" w:sz="4"/>
+              <w:left w:val="single" w:color="AAAAAA" w:sz="4"/>
+              <w:bottom w:val="single" w:color="AAAAAA" w:sz="4"/>
+              <w:right w:val="single" w:color="AAAAAA" w:sz="4"/>
+            </w:tcBorders>
+            <w:tcMar>
+              <w:top w:type="dxa" w:w="60"/>
+              <w:left w:type="dxa" w:w="100"/>
+              <w:bottom w:type="dxa" w:w="60"/>
+              <w:right w:type="dxa" w:w="100"/>
+            </w:tcMar>
+            <w:vAlign w:val="center"/>
+          </w:tcPr>
+          <w:p>
+            <w:pPr>
+              <w:jc w:val="center"/>
+            </w:pPr>
+            <w:r>
+              <w:rPr>
+                <w:rFonts w:ascii="Times New Roman" w:cs="Times New Roman" w:eastAsia="Times New Roman" w:hAnsi="Times New Roman"/>
+                <w:b w:val="false"/>
+                <w:bCs w:val="false"/>
+                <w:sz w:val="18"/>
+                <w:szCs w:val="18"/>
+              </w:rPr>
+              <w:t xml:space="preserve">1.00 (0.97–1.03)</w:t>
+            </w:r>
+          </w:p>
+        </w:tc>
+      </w:tr>
+      <w:tr>
+        <w:tc>
+          <w:tcPr>
+            <w:tcW w:type="dxa" w:w="2400"/>
+            <w:tcBorders>
+              <w:top w:val="single" w:color="AAAAAA" w:sz="4"/>
+              <w:left w:val="single" w:color="AAAAAA" w:sz="4"/>
+              <w:bottom w:val="single" w:color="AAAAAA" w:sz="4"/>
+              <w:right w:val="single" w:color="AAAAAA" w:sz="4"/>
+            </w:tcBorders>
+            <w:tcMar>
+              <w:top w:type="dxa" w:w="60"/>
+              <w:left w:type="dxa" w:w="100"/>
+              <w:bottom w:type="dxa" w:w="60"/>
+              <w:right w:type="dxa" w:w="100"/>
+            </w:tcMar>
+            <w:vAlign w:val="center"/>
+          </w:tcPr>
+          <w:p>
+            <w:pPr>
+              <w:jc w:val="left"/>
+            </w:pPr>
+            <w:r>
+              <w:rPr>
+                <w:rFonts w:ascii="Times New Roman" w:cs="Times New Roman" w:eastAsia="Times New Roman" w:hAnsi="Times New Roman"/>
+                <w:b/>
+                <w:bCs/>
+                <w:sz w:val="18"/>
+                <w:szCs w:val="18"/>
+              </w:rPr>
+              <w:t xml:space="preserve">Parity</w:t>
+            </w:r>
+          </w:p>
+        </w:tc>
+        <w:tc>
+          <w:tcPr>
+            <w:tcW w:type="dxa" w:w="3480"/>
+            <w:tcBorders>
+              <w:top w:val="single" w:color="AAAAAA" w:sz="4"/>
+              <w:left w:val="single" w:color="AAAAAA" w:sz="4"/>
+              <w:bottom w:val="single" w:color="AAAAAA" w:sz="4"/>
+              <w:right w:val="single" w:color="AAAAAA" w:sz="4"/>
+            </w:tcBorders>
+            <w:shd w:fill="FFE5CC" w:val="clear"/>
+            <w:tcMar>
+              <w:top w:type="dxa" w:w="60"/>
+              <w:left w:type="dxa" w:w="100"/>
+              <w:bottom w:type="dxa" w:w="60"/>
+              <w:right w:type="dxa" w:w="100"/>
+            </w:tcMar>
+            <w:vAlign w:val="center"/>
+          </w:tcPr>
+          <w:p>
+            <w:pPr>
+              <w:jc w:val="center"/>
+            </w:pPr>
+            <w:r>
+              <w:rPr>
+                <w:rFonts w:ascii="Times New Roman" w:cs="Times New Roman" w:eastAsia="Times New Roman" w:hAnsi="Times New Roman"/>
+                <w:b w:val="false"/>
+                <w:bCs w:val="false"/>
+                <w:sz w:val="18"/>
+                <w:szCs w:val="18"/>
+              </w:rPr>
+              <w:t xml:space="preserve">0.91 (0.86–0.96)***</w:t>
+            </w:r>
+          </w:p>
+        </w:tc>
+        <w:tc>
+          <w:tcPr>
+            <w:tcW w:type="dxa" w:w="3480"/>
+            <w:tcBorders>
+              <w:top w:val="single" w:color="AAAAAA" w:sz="4"/>
+              <w:left w:val="single" w:color="AAAAAA" w:sz="4"/>
+              <w:bottom w:val="single" w:color="AAAAAA" w:sz="4"/>
+              <w:right w:val="single" w:color="AAAAAA" w:sz="4"/>
+            </w:tcBorders>
+            <w:tcMar>
+              <w:top w:type="dxa" w:w="60"/>
+              <w:left w:type="dxa" w:w="100"/>
+              <w:bottom w:type="dxa" w:w="60"/>
+              <w:right w:type="dxa" w:w="100"/>
+            </w:tcMar>
+            <w:vAlign w:val="center"/>
+          </w:tcPr>
+          <w:p>
+            <w:pPr>
+              <w:jc w:val="center"/>
+            </w:pPr>
+            <w:r>
+              <w:rPr>
+                <w:rFonts w:ascii="Times New Roman" w:cs="Times New Roman" w:eastAsia="Times New Roman" w:hAnsi="Times New Roman"/>
+                <w:b w:val="false"/>
+                <w:bCs w:val="false"/>
+                <w:sz w:val="18"/>
+                <w:szCs w:val="18"/>
+              </w:rPr>
+              <w:t xml:space="preserve">1.09 (0.98–1.22)</w:t>
+            </w:r>
+          </w:p>
+        </w:tc>
+      </w:tr>
+      <w:tr>
+        <w:tc>
+          <w:tcPr>
+            <w:tcW w:type="dxa" w:w="2400"/>
+            <w:tcBorders>
+              <w:top w:val="single" w:color="AAAAAA" w:sz="4"/>
+              <w:left w:val="single" w:color="AAAAAA" w:sz="4"/>
+              <w:bottom w:val="single" w:color="AAAAAA" w:sz="4"/>
+              <w:right w:val="single" w:color="AAAAAA" w:sz="4"/>
+            </w:tcBorders>
+            <w:tcMar>
+              <w:top w:type="dxa" w:w="60"/>
+              <w:left w:type="dxa" w:w="100"/>
+              <w:bottom w:type="dxa" w:w="60"/>
+              <w:right w:type="dxa" w:w="100"/>
+            </w:tcMar>
+            <w:vAlign w:val="center"/>
+          </w:tcPr>
+          <w:p>
+            <w:pPr>
+              <w:jc w:val="left"/>
+            </w:pPr>
+            <w:r>
+              <w:rPr>
+                <w:rFonts w:ascii="Times New Roman" w:cs="Times New Roman" w:eastAsia="Times New Roman" w:hAnsi="Times New Roman"/>
+                <w:b/>
+                <w:bCs/>
+                <w:sz w:val="18"/>
+                <w:szCs w:val="18"/>
+              </w:rPr>
+              <w:t xml:space="preserve">Married</w:t>
+            </w:r>
+          </w:p>
+        </w:tc>
+        <w:tc>
+          <w:tcPr>
+            <w:tcW w:type="dxa" w:w="3480"/>
+            <w:tcBorders>
+              <w:top w:val="single" w:color="AAAAAA" w:sz="4"/>
+              <w:left w:val="single" w:color="AAAAAA" w:sz="4"/>
+              <w:bottom w:val="single" w:color="AAAAAA" w:sz="4"/>
+              <w:right w:val="single" w:color="AAAAAA" w:sz="4"/>
+            </w:tcBorders>
+            <w:shd w:fill="E8F5E9" w:val="clear"/>
+            <w:tcMar>
+              <w:top w:type="dxa" w:w="60"/>
+              <w:left w:type="dxa" w:w="100"/>
+              <w:bottom w:type="dxa" w:w="60"/>
+              <w:right w:type="dxa" w:w="100"/>
+            </w:tcMar>
+            <w:vAlign w:val="center"/>
+          </w:tcPr>
+          <w:p>
+            <w:pPr>
+              <w:jc w:val="center"/>
+            </w:pPr>
+            <w:r>
+              <w:rPr>
+                <w:rFonts w:ascii="Times New Roman" w:cs="Times New Roman" w:eastAsia="Times New Roman" w:hAnsi="Times New Roman"/>
+                <w:b w:val="false"/>
+                <w:bCs w:val="false"/>
+                <w:sz w:val="18"/>
+                <w:szCs w:val="18"/>
+              </w:rPr>
+              <w:t xml:space="preserve">1.22 (1.09–1.36)***</w:t>
+            </w:r>
+          </w:p>
+        </w:tc>
+        <w:tc>
+          <w:tcPr>
+            <w:tcW w:type="dxa" w:w="3480"/>
+            <w:tcBorders>
+              <w:top w:val="single" w:color="AAAAAA" w:sz="4"/>
+              <w:left w:val="single" w:color="AAAAAA" w:sz="4"/>
+              <w:bottom w:val="single" w:color="AAAAAA" w:sz="4"/>
+              <w:right w:val="single" w:color="AAAAAA" w:sz="4"/>
+            </w:tcBorders>
+            <w:tcMar>
+              <w:top w:type="dxa" w:w="60"/>
+              <w:left w:type="dxa" w:w="100"/>
+              <w:bottom w:type="dxa" w:w="60"/>
+              <w:right w:type="dxa" w:w="100"/>
+            </w:tcMar>
+            <w:vAlign w:val="center"/>
+          </w:tcPr>
+          <w:p>
+            <w:pPr>
+              <w:jc w:val="center"/>
+            </w:pPr>
+            <w:r>
+              <w:rPr>
+                <w:rFonts w:ascii="Times New Roman" w:cs="Times New Roman" w:eastAsia="Times New Roman" w:hAnsi="Times New Roman"/>
+                <w:b w:val="false"/>
+                <w:bCs w:val="false"/>
+                <w:sz w:val="18"/>
+                <w:szCs w:val="18"/>
+              </w:rPr>
+              <w:t xml:space="preserve">1.21 (0.94–1.56)</w:t>
+            </w:r>
+          </w:p>
+        </w:tc>
+      </w:tr>
+      <w:tr>
+        <w:tc>
+          <w:tcPr>
+            <w:tcW w:type="dxa" w:w="2400"/>
+            <w:tcBorders>
+              <w:top w:val="single" w:color="AAAAAA" w:sz="4"/>
+              <w:left w:val="single" w:color="AAAAAA" w:sz="4"/>
+              <w:bottom w:val="single" w:color="AAAAAA" w:sz="4"/>
+              <w:right w:val="single" w:color="AAAAAA" w:sz="4"/>
+            </w:tcBorders>
+            <w:tcMar>
+              <w:top w:type="dxa" w:w="60"/>
+              <w:left w:type="dxa" w:w="100"/>
+              <w:bottom w:type="dxa" w:w="60"/>
+              <w:right w:type="dxa" w:w="100"/>
+            </w:tcMar>
+            <w:vAlign w:val="center"/>
+          </w:tcPr>
+          <w:p>
+            <w:pPr>
+              <w:jc w:val="left"/>
+            </w:pPr>
+            <w:r>
+              <w:rPr>
+                <w:rFonts w:ascii="Times New Roman" w:cs="Times New Roman" w:eastAsia="Times New Roman" w:hAnsi="Times New Roman"/>
+                <w:b/>
+                <w:bCs/>
+                <w:sz w:val="18"/>
+                <w:szCs w:val="18"/>
+              </w:rPr>
+              <w:t xml:space="preserve">Distance barrier</w:t>
+            </w:r>
+          </w:p>
+        </w:tc>
+        <w:tc>
+          <w:tcPr>
+            <w:tcW w:type="dxa" w:w="3480"/>
+            <w:tcBorders>
+              <w:top w:val="single" w:color="AAAAAA" w:sz="4"/>
+              <w:left w:val="single" w:color="AAAAAA" w:sz="4"/>
+              <w:bottom w:val="single" w:color="AAAAAA" w:sz="4"/>
+              <w:right w:val="single" w:color="AAAAAA" w:sz="4"/>
+            </w:tcBorders>
+            <w:tcMar>
+              <w:top w:type="dxa" w:w="60"/>
+              <w:left w:type="dxa" w:w="100"/>
+              <w:bottom w:type="dxa" w:w="60"/>
+              <w:right w:type="dxa" w:w="100"/>
+            </w:tcMar>
+            <w:vAlign w:val="center"/>
+          </w:tcPr>
+          <w:p>
+            <w:pPr>
+              <w:jc w:val="center"/>
+            </w:pPr>
+            <w:r>
+              <w:rPr>
+                <w:rFonts w:ascii="Times New Roman" w:cs="Times New Roman" w:eastAsia="Times New Roman" w:hAnsi="Times New Roman"/>
+                <w:b w:val="false"/>
+                <w:bCs w:val="false"/>
+                <w:sz w:val="18"/>
+                <w:szCs w:val="18"/>
+              </w:rPr>
+              <w:t xml:space="preserve">1.03 (0.93–1.14)</w:t>
+            </w:r>
+          </w:p>
+        </w:tc>
+        <w:tc>
+          <w:tcPr>
+            <w:tcW w:type="dxa" w:w="3480"/>
+            <w:tcBorders>
+              <w:top w:val="single" w:color="AAAAAA" w:sz="4"/>
+              <w:left w:val="single" w:color="AAAAAA" w:sz="4"/>
+              <w:bottom w:val="single" w:color="AAAAAA" w:sz="4"/>
+              <w:right w:val="single" w:color="AAAAAA" w:sz="4"/>
+            </w:tcBorders>
+            <w:tcMar>
+              <w:top w:type="dxa" w:w="60"/>
+              <w:left w:type="dxa" w:w="100"/>
+              <w:bottom w:type="dxa" w:w="60"/>
+              <w:right w:type="dxa" w:w="100"/>
+            </w:tcMar>
+            <w:vAlign w:val="center"/>
+          </w:tcPr>
+          <w:p>
+            <w:pPr>
+              <w:jc w:val="center"/>
+            </w:pPr>
+            <w:r>
+              <w:rPr>
+                <w:rFonts w:ascii="Times New Roman" w:cs="Times New Roman" w:eastAsia="Times New Roman" w:hAnsi="Times New Roman"/>
+                <w:b w:val="false"/>
+                <w:bCs w:val="false"/>
+                <w:sz w:val="18"/>
+                <w:szCs w:val="18"/>
+              </w:rPr>
+              <w:t xml:space="preserve">0.89 (0.70–1.13)</w:t>
+            </w:r>
+          </w:p>
+        </w:tc>
+      </w:tr>
+      <w:tr>
+        <w:tc>
+          <w:tcPr>
+            <w:tcW w:type="dxa" w:w="2400"/>
+            <w:tcBorders>
+              <w:top w:val="single" w:color="AAAAAA" w:sz="4"/>
+              <w:left w:val="single" w:color="AAAAAA" w:sz="4"/>
+              <w:bottom w:val="single" w:color="AAAAAA" w:sz="4"/>
+              <w:right w:val="single" w:color="AAAAAA" w:sz="4"/>
+            </w:tcBorders>
+            <w:tcMar>
+              <w:top w:type="dxa" w:w="60"/>
+              <w:left w:type="dxa" w:w="100"/>
+              <w:bottom w:type="dxa" w:w="60"/>
+              <w:right w:type="dxa" w:w="100"/>
+            </w:tcMar>
+            <w:vAlign w:val="center"/>
+          </w:tcPr>
+          <w:p>
+            <w:pPr>
+              <w:jc w:val="left"/>
+            </w:pPr>
+            <w:r>
+              <w:rPr>
+                <w:rFonts w:ascii="Times New Roman" w:cs="Times New Roman" w:eastAsia="Times New Roman" w:hAnsi="Times New Roman"/>
+                <w:b/>
+                <w:bCs/>
+                <w:sz w:val="18"/>
+                <w:szCs w:val="18"/>
+              </w:rPr>
+              <w:t xml:space="preserve">Region</w:t>
+            </w:r>
+          </w:p>
+        </w:tc>
+        <w:tc>
+          <w:tcPr>
+            <w:tcW w:type="dxa" w:w="3480"/>
+            <w:tcBorders>
+              <w:top w:val="single" w:color="AAAAAA" w:sz="4"/>
+              <w:left w:val="single" w:color="AAAAAA" w:sz="4"/>
+              <w:bottom w:val="single" w:color="AAAAAA" w:sz="4"/>
+              <w:right w:val="single" w:color="AAAAAA" w:sz="4"/>
+            </w:tcBorders>
+            <w:tcMar>
+              <w:top w:type="dxa" w:w="60"/>
+              <w:left w:type="dxa" w:w="100"/>
+              <w:bottom w:type="dxa" w:w="60"/>
+              <w:right w:type="dxa" w:w="100"/>
+            </w:tcMar>
+            <w:vAlign w:val="center"/>
+          </w:tcPr>
+          <w:p>
+            <w:pPr>
+              <w:jc w:val="center"/>
+            </w:pPr>
+            <w:r>
+              <w:rPr>
+                <w:rFonts w:ascii="Times New Roman" w:cs="Times New Roman" w:eastAsia="Times New Roman" w:hAnsi="Times New Roman"/>
+                <w:b w:val="false"/>
+                <w:bCs w:val="false"/>
+                <w:sz w:val="18"/>
+                <w:szCs w:val="18"/>
+              </w:rPr>
+              <w:t xml:space="preserve">1.06 (0.99–1.13)</w:t>
+            </w:r>
+          </w:p>
+        </w:tc>
+        <w:tc>
+          <w:tcPr>
+            <w:tcW w:type="dxa" w:w="3480"/>
+            <w:tcBorders>
+              <w:top w:val="single" w:color="AAAAAA" w:sz="4"/>
+              <w:left w:val="single" w:color="AAAAAA" w:sz="4"/>
+              <w:bottom w:val="single" w:color="AAAAAA" w:sz="4"/>
+              <w:right w:val="single" w:color="AAAAAA" w:sz="4"/>
+            </w:tcBorders>
+            <w:tcMar>
+              <w:top w:type="dxa" w:w="60"/>
+              <w:left w:type="dxa" w:w="100"/>
+              <w:bottom w:type="dxa" w:w="60"/>
+              <w:right w:type="dxa" w:w="100"/>
+            </w:tcMar>
+            <w:vAlign w:val="center"/>
+          </w:tcPr>
+          <w:p>
+            <w:pPr>
+              <w:jc w:val="center"/>
+            </w:pPr>
+            <w:r>
+              <w:rPr>
+                <w:rFonts w:ascii="Times New Roman" w:cs="Times New Roman" w:eastAsia="Times New Roman" w:hAnsi="Times New Roman"/>
+                <w:b w:val="false"/>
+                <w:bCs w:val="false"/>
+                <w:sz w:val="18"/>
+                <w:szCs w:val="18"/>
+              </w:rPr>
+              <w:t xml:space="preserve">1.00 (0.86–1.15)</w:t>
+            </w:r>
+          </w:p>
+        </w:tc>
+      </w:tr>
+      <w:tr>
+        <w:tc>
+          <w:tcPr>
+            <w:tcW w:type="dxa" w:w="2400"/>
+            <w:tcBorders>
+              <w:top w:val="single" w:color="AAAAAA" w:sz="4"/>
+              <w:left w:val="single" w:color="AAAAAA" w:sz="4"/>
+              <w:bottom w:val="single" w:color="AAAAAA" w:sz="4"/>
+              <w:right w:val="single" w:color="AAAAAA" w:sz="4"/>
+            </w:tcBorders>
+            <w:tcMar>
+              <w:top w:type="dxa" w:w="60"/>
+              <w:left w:type="dxa" w:w="100"/>
+              <w:bottom w:type="dxa" w:w="60"/>
+              <w:right w:type="dxa" w:w="100"/>
+            </w:tcMar>
+            <w:vAlign w:val="center"/>
+          </w:tcPr>
+          <w:p>
+            <w:pPr>
+              <w:jc w:val="left"/>
+            </w:pPr>
+            <w:r>
+              <w:rPr>
+                <w:rFonts w:ascii="Times New Roman" w:cs="Times New Roman" w:eastAsia="Times New Roman" w:hAnsi="Times New Roman"/>
+                <w:b/>
+                <w:bCs/>
+                <w:sz w:val="18"/>
+                <w:szCs w:val="18"/>
+              </w:rPr>
+              <w:t xml:space="preserve">Urban residence</w:t>
+            </w:r>
+          </w:p>
+        </w:tc>
+        <w:tc>
+          <w:tcPr>
+            <w:tcW w:type="dxa" w:w="3480"/>
+            <w:tcBorders>
+              <w:top w:val="single" w:color="AAAAAA" w:sz="4"/>
+              <w:left w:val="single" w:color="AAAAAA" w:sz="4"/>
+              <w:bottom w:val="single" w:color="AAAAAA" w:sz="4"/>
+              <w:right w:val="single" w:color="AAAAAA" w:sz="4"/>
+            </w:tcBorders>
+            <w:tcMar>
+              <w:top w:type="dxa" w:w="60"/>
+              <w:left w:type="dxa" w:w="100"/>
+              <w:bottom w:type="dxa" w:w="60"/>
+              <w:right w:type="dxa" w:w="100"/>
+            </w:tcMar>
+            <w:vAlign w:val="center"/>
+          </w:tcPr>
+          <w:p>
+            <w:pPr>
+              <w:jc w:val="center"/>
+            </w:pPr>
+            <w:r>
+              <w:rPr>
+                <w:rFonts w:ascii="Times New Roman" w:cs="Times New Roman" w:eastAsia="Times New Roman" w:hAnsi="Times New Roman"/>
+                <w:b w:val="false"/>
+                <w:bCs w:val="false"/>
+                <w:sz w:val="18"/>
+                <w:szCs w:val="18"/>
+              </w:rPr>
+              <w:t xml:space="preserve">1.02 (0.87–1.19)</w:t>
+            </w:r>
+          </w:p>
+        </w:tc>
+        <w:tc>
+          <w:tcPr>
+            <w:tcW w:type="dxa" w:w="3480"/>
+            <w:tcBorders>
+              <w:top w:val="single" w:color="AAAAAA" w:sz="4"/>
+              <w:left w:val="single" w:color="AAAAAA" w:sz="4"/>
+              <w:bottom w:val="single" w:color="AAAAAA" w:sz="4"/>
+              <w:right w:val="single" w:color="AAAAAA" w:sz="4"/>
+            </w:tcBorders>
+            <w:tcMar>
+              <w:top w:type="dxa" w:w="60"/>
+              <w:left w:type="dxa" w:w="100"/>
+              <w:bottom w:type="dxa" w:w="60"/>
+              <w:right w:type="dxa" w:w="100"/>
+            </w:tcMar>
+            <w:vAlign w:val="center"/>
+          </w:tcPr>
+          <w:p>
+            <w:pPr>
+              <w:jc w:val="center"/>
+            </w:pPr>
+            <w:r>
+              <w:rPr>
+                <w:rFonts w:ascii="Times New Roman" w:cs="Times New Roman" w:eastAsia="Times New Roman" w:hAnsi="Times New Roman"/>
+                <w:b w:val="false"/>
+                <w:bCs w:val="false"/>
+                <w:sz w:val="18"/>
+                <w:szCs w:val="18"/>
+              </w:rPr>
+              <w:t xml:space="preserve">0.76 (0.50–1.14)</w:t>
+            </w:r>
+          </w:p>
+        </w:tc>
+      </w:tr>
+      <w:tr>
+        <w:tc>
+          <w:tcPr>
+            <w:tcW w:type="dxa" w:w="2400"/>
+            <w:tcBorders>
+              <w:top w:val="single" w:color="AAAAAA" w:sz="4"/>
+              <w:left w:val="single" w:color="AAAAAA" w:sz="4"/>
+              <w:bottom w:val="single" w:color="AAAAAA" w:sz="4"/>
+              <w:right w:val="single" w:color="AAAAAA" w:sz="4"/>
+            </w:tcBorders>
+            <w:tcMar>
+              <w:top w:type="dxa" w:w="60"/>
+              <w:left w:type="dxa" w:w="100"/>
+              <w:bottom w:type="dxa" w:w="60"/>
+              <w:right w:type="dxa" w:w="100"/>
+            </w:tcMar>
+            <w:vAlign w:val="center"/>
+          </w:tcPr>
+          <w:p>
+            <w:pPr>
+              <w:jc w:val="left"/>
+            </w:pPr>
+            <w:r>
+              <w:rPr>
+                <w:rFonts w:ascii="Times New Roman" w:cs="Times New Roman" w:eastAsia="Times New Roman" w:hAnsi="Times New Roman"/>
+                <w:b w:val="false"/>
+                <w:bCs w:val="false"/>
+                <w:sz w:val="18"/>
+                <w:szCs w:val="18"/>
+              </w:rPr>
+              <w:t xml:space="preserve">Wealth: Poorer</w:t>
+            </w:r>
+          </w:p>
+        </w:tc>
+        <w:tc>
+          <w:tcPr>
+            <w:tcW w:type="dxa" w:w="3480"/>
+            <w:tcBorders>
+              <w:top w:val="single" w:color="AAAAAA" w:sz="4"/>
+              <w:left w:val="single" w:color="AAAAAA" w:sz="4"/>
+              <w:bottom w:val="single" w:color="AAAAAA" w:sz="4"/>
+              <w:right w:val="single" w:color="AAAAAA" w:sz="4"/>
+            </w:tcBorders>
+            <w:tcMar>
+              <w:top w:type="dxa" w:w="60"/>
+              <w:left w:type="dxa" w:w="100"/>
+              <w:bottom w:type="dxa" w:w="60"/>
+              <w:right w:type="dxa" w:w="100"/>
+            </w:tcMar>
+            <w:vAlign w:val="center"/>
+          </w:tcPr>
+          <w:p>
+            <w:pPr>
+              <w:jc w:val="center"/>
+            </w:pPr>
+            <w:r>
+              <w:rPr>
+                <w:rFonts w:ascii="Times New Roman" w:cs="Times New Roman" w:eastAsia="Times New Roman" w:hAnsi="Times New Roman"/>
+                <w:b w:val="false"/>
+                <w:bCs w:val="false"/>
+                <w:sz w:val="18"/>
+                <w:szCs w:val="18"/>
+              </w:rPr>
+              <w:t xml:space="preserve">0.97 (0.82–1.15)</w:t>
+            </w:r>
+          </w:p>
+        </w:tc>
+        <w:tc>
+          <w:tcPr>
+            <w:tcW w:type="dxa" w:w="3480"/>
+            <w:tcBorders>
+              <w:top w:val="single" w:color="AAAAAA" w:sz="4"/>
+              <w:left w:val="single" w:color="AAAAAA" w:sz="4"/>
+              <w:bottom w:val="single" w:color="AAAAAA" w:sz="4"/>
+              <w:right w:val="single" w:color="AAAAAA" w:sz="4"/>
+            </w:tcBorders>
+            <w:tcMar>
+              <w:top w:type="dxa" w:w="60"/>
+              <w:left w:type="dxa" w:w="100"/>
+              <w:bottom w:type="dxa" w:w="60"/>
+              <w:right w:type="dxa" w:w="100"/>
+            </w:tcMar>
+            <w:vAlign w:val="center"/>
+          </w:tcPr>
+          <w:p>
+            <w:pPr>
+              <w:jc w:val="center"/>
+            </w:pPr>
+            <w:r>
+              <w:rPr>
+                <w:rFonts w:ascii="Times New Roman" w:cs="Times New Roman" w:eastAsia="Times New Roman" w:hAnsi="Times New Roman"/>
+                <w:b w:val="false"/>
+                <w:bCs w:val="false"/>
+                <w:sz w:val="18"/>
+                <w:szCs w:val="18"/>
+              </w:rPr>
+              <w:t xml:space="preserve">1.40 (0.97–2.02)</w:t>
+            </w:r>
+          </w:p>
+        </w:tc>
+      </w:tr>
+      <w:tr>
+        <w:tc>
+          <w:tcPr>
+            <w:tcW w:type="dxa" w:w="2400"/>
+            <w:tcBorders>
+              <w:top w:val="single" w:color="AAAAAA" w:sz="4"/>
+              <w:left w:val="single" w:color="AAAAAA" w:sz="4"/>
+              <w:bottom w:val="single" w:color="AAAAAA" w:sz="4"/>
+              <w:right w:val="single" w:color="AAAAAA" w:sz="4"/>
+            </w:tcBorders>
+            <w:tcMar>
+              <w:top w:type="dxa" w:w="60"/>
+              <w:left w:type="dxa" w:w="100"/>
+              <w:bottom w:type="dxa" w:w="60"/>
+              <w:right w:type="dxa" w:w="100"/>
+            </w:tcMar>
+            <w:vAlign w:val="center"/>
+          </w:tcPr>
+          <w:p>
+            <w:pPr>
+              <w:jc w:val="left"/>
+            </w:pPr>
+            <w:r>
+              <w:rPr>
+                <w:rFonts w:ascii="Times New Roman" w:cs="Times New Roman" w:eastAsia="Times New Roman" w:hAnsi="Times New Roman"/>
+                <w:b w:val="false"/>
+                <w:bCs w:val="false"/>
+                <w:sz w:val="18"/>
+                <w:szCs w:val="18"/>
+              </w:rPr>
+              <w:t xml:space="preserve">Wealth: Poorest</w:t>
+            </w:r>
+          </w:p>
+        </w:tc>
+        <w:tc>
+          <w:tcPr>
+            <w:tcW w:type="dxa" w:w="3480"/>
+            <w:tcBorders>
+              <w:top w:val="single" w:color="AAAAAA" w:sz="4"/>
+              <w:left w:val="single" w:color="AAAAAA" w:sz="4"/>
+              <w:bottom w:val="single" w:color="AAAAAA" w:sz="4"/>
+              <w:right w:val="single" w:color="AAAAAA" w:sz="4"/>
+            </w:tcBorders>
+            <w:tcMar>
+              <w:top w:type="dxa" w:w="60"/>
+              <w:left w:type="dxa" w:w="100"/>
+              <w:bottom w:type="dxa" w:w="60"/>
+              <w:right w:type="dxa" w:w="100"/>
+            </w:tcMar>
+            <w:vAlign w:val="center"/>
+          </w:tcPr>
+          <w:p>
+            <w:pPr>
+              <w:jc w:val="center"/>
+            </w:pPr>
+            <w:r>
+              <w:rPr>
+                <w:rFonts w:ascii="Times New Roman" w:cs="Times New Roman" w:eastAsia="Times New Roman" w:hAnsi="Times New Roman"/>
+                <w:b w:val="false"/>
+                <w:bCs w:val="false"/>
+                <w:sz w:val="18"/>
+                <w:szCs w:val="18"/>
+              </w:rPr>
+              <w:t xml:space="preserve">0.96 (0.82–1.12)</w:t>
+            </w:r>
+          </w:p>
+        </w:tc>
+        <w:tc>
+          <w:tcPr>
+            <w:tcW w:type="dxa" w:w="3480"/>
+            <w:tcBorders>
+              <w:top w:val="single" w:color="AAAAAA" w:sz="4"/>
+              <w:left w:val="single" w:color="AAAAAA" w:sz="4"/>
+              <w:bottom w:val="single" w:color="AAAAAA" w:sz="4"/>
+              <w:right w:val="single" w:color="AAAAAA" w:sz="4"/>
+            </w:tcBorders>
+            <w:tcMar>
+              <w:top w:type="dxa" w:w="60"/>
+              <w:left w:type="dxa" w:w="100"/>
+              <w:bottom w:type="dxa" w:w="60"/>
+              <w:right w:type="dxa" w:w="100"/>
+            </w:tcMar>
+            <w:vAlign w:val="center"/>
+          </w:tcPr>
+          <w:p>
+            <w:pPr>
+              <w:jc w:val="center"/>
+            </w:pPr>
+            <w:r>
+              <w:rPr>
+                <w:rFonts w:ascii="Times New Roman" w:cs="Times New Roman" w:eastAsia="Times New Roman" w:hAnsi="Times New Roman"/>
+                <w:b w:val="false"/>
+                <w:bCs w:val="false"/>
+                <w:sz w:val="18"/>
+                <w:szCs w:val="18"/>
+              </w:rPr>
+              <w:t xml:space="preserve">1.34 (0.94–1.90)</w:t>
+            </w:r>
+          </w:p>
+        </w:tc>
+      </w:tr>
+      <w:tr>
+        <w:tc>
+          <w:tcPr>
+            <w:tcW w:type="dxa" w:w="2400"/>
+            <w:tcBorders>
+              <w:top w:val="single" w:color="AAAAAA" w:sz="4"/>
+              <w:left w:val="single" w:color="AAAAAA" w:sz="4"/>
+              <w:bottom w:val="single" w:color="AAAAAA" w:sz="4"/>
+              <w:right w:val="single" w:color="AAAAAA" w:sz="4"/>
+            </w:tcBorders>
+            <w:tcMar>
+              <w:top w:type="dxa" w:w="60"/>
+              <w:left w:type="dxa" w:w="100"/>
+              <w:bottom w:type="dxa" w:w="60"/>
+              <w:right w:type="dxa" w:w="100"/>
+            </w:tcMar>
+            <w:vAlign w:val="center"/>
+          </w:tcPr>
+          <w:p>
+            <w:pPr>
+              <w:jc w:val="left"/>
+            </w:pPr>
+            <w:r>
+              <w:rPr>
+                <w:rFonts w:ascii="Times New Roman" w:cs="Times New Roman" w:eastAsia="Times New Roman" w:hAnsi="Times New Roman"/>
+                <w:b w:val="false"/>
+                <w:bCs w:val="false"/>
+                <w:sz w:val="18"/>
+                <w:szCs w:val="18"/>
+              </w:rPr>
+              <w:t xml:space="preserve">Wealth: Richer</w:t>
+            </w:r>
+          </w:p>
+        </w:tc>
+        <w:tc>
+          <w:tcPr>
+            <w:tcW w:type="dxa" w:w="3480"/>
+            <w:tcBorders>
+              <w:top w:val="single" w:color="AAAAAA" w:sz="4"/>
+              <w:left w:val="single" w:color="AAAAAA" w:sz="4"/>
+              <w:bottom w:val="single" w:color="AAAAAA" w:sz="4"/>
+              <w:right w:val="single" w:color="AAAAAA" w:sz="4"/>
+            </w:tcBorders>
+            <w:tcMar>
+              <w:top w:type="dxa" w:w="60"/>
+              <w:left w:type="dxa" w:w="100"/>
+              <w:bottom w:type="dxa" w:w="60"/>
+              <w:right w:type="dxa" w:w="100"/>
+            </w:tcMar>
+            <w:vAlign w:val="center"/>
+          </w:tcPr>
+          <w:p>
+            <w:pPr>
+              <w:jc w:val="center"/>
+            </w:pPr>
+            <w:r>
+              <w:rPr>
+                <w:rFonts w:ascii="Times New Roman" w:cs="Times New Roman" w:eastAsia="Times New Roman" w:hAnsi="Times New Roman"/>
+                <w:b w:val="false"/>
+                <w:bCs w:val="false"/>
+                <w:sz w:val="18"/>
+                <w:szCs w:val="18"/>
+              </w:rPr>
+              <w:t xml:space="preserve">0.95 (0.80–1.12)</w:t>
+            </w:r>
+          </w:p>
+        </w:tc>
+        <w:tc>
+          <w:tcPr>
+            <w:tcW w:type="dxa" w:w="3480"/>
+            <w:tcBorders>
+              <w:top w:val="single" w:color="AAAAAA" w:sz="4"/>
+              <w:left w:val="single" w:color="AAAAAA" w:sz="4"/>
+              <w:bottom w:val="single" w:color="AAAAAA" w:sz="4"/>
+              <w:right w:val="single" w:color="AAAAAA" w:sz="4"/>
+            </w:tcBorders>
+            <w:tcMar>
+              <w:top w:type="dxa" w:w="60"/>
+              <w:left w:type="dxa" w:w="100"/>
+              <w:bottom w:type="dxa" w:w="60"/>
+              <w:right w:type="dxa" w:w="100"/>
+            </w:tcMar>
+            <w:vAlign w:val="center"/>
+          </w:tcPr>
+          <w:p>
+            <w:pPr>
+              <w:jc w:val="center"/>
+            </w:pPr>
+            <w:r>
+              <w:rPr>
+                <w:rFonts w:ascii="Times New Roman" w:cs="Times New Roman" w:eastAsia="Times New Roman" w:hAnsi="Times New Roman"/>
+                <w:b w:val="false"/>
+                <w:bCs w:val="false"/>
+                <w:sz w:val="18"/>
+                <w:szCs w:val="18"/>
+              </w:rPr>
+              <w:t xml:space="preserve">1.05 (0.71–1.55)</w:t>
+            </w:r>
+          </w:p>
+        </w:tc>
+      </w:tr>
+      <w:tr>
+        <w:tc>
+          <w:tcPr>
+            <w:tcW w:type="dxa" w:w="2400"/>
+            <w:tcBorders>
+              <w:top w:val="single" w:color="AAAAAA" w:sz="4"/>
+              <w:left w:val="single" w:color="AAAAAA" w:sz="4"/>
+              <w:bottom w:val="single" w:color="AAAAAA" w:sz="4"/>
+              <w:right w:val="single" w:color="AAAAAA" w:sz="4"/>
+            </w:tcBorders>
+            <w:tcMar>
+              <w:top w:type="dxa" w:w="60"/>
+              <w:left w:type="dxa" w:w="100"/>
+              <w:bottom w:type="dxa" w:w="60"/>
+              <w:right w:type="dxa" w:w="100"/>
+            </w:tcMar>
+            <w:vAlign w:val="center"/>
+          </w:tcPr>
+          <w:p>
+            <w:pPr>
+              <w:jc w:val="left"/>
+            </w:pPr>
+            <w:r>
+              <w:rPr>
+                <w:rFonts w:ascii="Times New Roman" w:cs="Times New Roman" w:eastAsia="Times New Roman" w:hAnsi="Times New Roman"/>
+                <w:b w:val="false"/>
+                <w:bCs w:val="false"/>
+                <w:sz w:val="18"/>
+                <w:szCs w:val="18"/>
+              </w:rPr>
+              <w:t xml:space="preserve">Wealth: Richest</w:t>
+            </w:r>
+          </w:p>
+        </w:tc>
+        <w:tc>
+          <w:tcPr>
+            <w:tcW w:type="dxa" w:w="3480"/>
+            <w:tcBorders>
+              <w:top w:val="single" w:color="AAAAAA" w:sz="4"/>
+              <w:left w:val="single" w:color="AAAAAA" w:sz="4"/>
+              <w:bottom w:val="single" w:color="AAAAAA" w:sz="4"/>
+              <w:right w:val="single" w:color="AAAAAA" w:sz="4"/>
+            </w:tcBorders>
+            <w:tcMar>
+              <w:top w:type="dxa" w:w="60"/>
+              <w:left w:type="dxa" w:w="100"/>
+              <w:bottom w:type="dxa" w:w="60"/>
+              <w:right w:type="dxa" w:w="100"/>
+            </w:tcMar>
+            <w:vAlign w:val="center"/>
+          </w:tcPr>
+          <w:p>
+            <w:pPr>
+              <w:jc w:val="center"/>
+            </w:pPr>
+            <w:r>
+              <w:rPr>
+                <w:rFonts w:ascii="Times New Roman" w:cs="Times New Roman" w:eastAsia="Times New Roman" w:hAnsi="Times New Roman"/>
+                <w:b w:val="false"/>
+                <w:bCs w:val="false"/>
+                <w:sz w:val="18"/>
+                <w:szCs w:val="18"/>
+              </w:rPr>
+              <w:t xml:space="preserve">1.15 (0.95–1.39)</w:t>
+            </w:r>
+          </w:p>
+        </w:tc>
+        <w:tc>
+          <w:tcPr>
+            <w:tcW w:type="dxa" w:w="3480"/>
+            <w:tcBorders>
+              <w:top w:val="single" w:color="AAAAAA" w:sz="4"/>
+              <w:left w:val="single" w:color="AAAAAA" w:sz="4"/>
+              <w:bottom w:val="single" w:color="AAAAAA" w:sz="4"/>
+              <w:right w:val="single" w:color="AAAAAA" w:sz="4"/>
+            </w:tcBorders>
+            <w:tcMar>
+              <w:top w:type="dxa" w:w="60"/>
+              <w:left w:type="dxa" w:w="100"/>
+              <w:bottom w:type="dxa" w:w="60"/>
+              <w:right w:type="dxa" w:w="100"/>
+            </w:tcMar>
+            <w:vAlign w:val="center"/>
+          </w:tcPr>
+          <w:p>
+            <w:pPr>
+              <w:jc w:val="center"/>
+            </w:pPr>
+            <w:r>
+              <w:rPr>
+                <w:rFonts w:ascii="Times New Roman" w:cs="Times New Roman" w:eastAsia="Times New Roman" w:hAnsi="Times New Roman"/>
+                <w:b w:val="false"/>
+                <w:bCs w:val="false"/>
+                <w:sz w:val="18"/>
+                <w:szCs w:val="18"/>
+              </w:rPr>
+              <w:t xml:space="preserve">1.06 (0.66–1.70)</w:t>
+            </w:r>
+          </w:p>
+        </w:tc>
+      </w:tr>
+      <w:tr>
+        <w:tc>
+          <w:tcPr>
+            <w:tcW w:type="dxa" w:w="2400"/>
+            <w:tcBorders>
+              <w:top w:val="single" w:color="AAAAAA" w:sz="4"/>
+              <w:left w:val="single" w:color="AAAAAA" w:sz="4"/>
+              <w:bottom w:val="single" w:color="AAAAAA" w:sz="4"/>
+              <w:right w:val="single" w:color="AAAAAA" w:sz="4"/>
+            </w:tcBorders>
+            <w:tcMar>
+              <w:top w:type="dxa" w:w="60"/>
+              <w:left w:type="dxa" w:w="100"/>
+              <w:bottom w:type="dxa" w:w="60"/>
+              <w:right w:type="dxa" w:w="100"/>
+            </w:tcMar>
+            <w:vAlign w:val="center"/>
+          </w:tcPr>
+          <w:p>
+            <w:pPr>
+              <w:jc w:val="left"/>
+            </w:pPr>
+            <w:r>
+              <w:rPr>
+                <w:rFonts w:ascii="Times New Roman" w:cs="Times New Roman" w:eastAsia="Times New Roman" w:hAnsi="Times New Roman"/>
+                <w:b w:val="false"/>
+                <w:bCs w:val="false"/>
+                <w:sz w:val="18"/>
+                <w:szCs w:val="18"/>
+              </w:rPr>
+              <w:t xml:space="preserve">Education: No education</w:t>
+            </w:r>
+          </w:p>
+        </w:tc>
+        <w:tc>
+          <w:tcPr>
+            <w:tcW w:type="dxa" w:w="3480"/>
+            <w:tcBorders>
+              <w:top w:val="single" w:color="AAAAAA" w:sz="4"/>
+              <w:left w:val="single" w:color="AAAAAA" w:sz="4"/>
+              <w:bottom w:val="single" w:color="AAAAAA" w:sz="4"/>
+              <w:right w:val="single" w:color="AAAAAA" w:sz="4"/>
+            </w:tcBorders>
+            <w:shd w:fill="FFE5CC" w:val="clear"/>
+            <w:tcMar>
+              <w:top w:type="dxa" w:w="60"/>
+              <w:left w:type="dxa" w:w="100"/>
+              <w:bottom w:type="dxa" w:w="60"/>
+              <w:right w:type="dxa" w:w="100"/>
+            </w:tcMar>
+            <w:vAlign w:val="center"/>
+          </w:tcPr>
+          <w:p>
+            <w:pPr>
+              <w:jc w:val="center"/>
+            </w:pPr>
+            <w:r>
+              <w:rPr>
+                <w:rFonts w:ascii="Times New Roman" w:cs="Times New Roman" w:eastAsia="Times New Roman" w:hAnsi="Times New Roman"/>
+                <w:b w:val="false"/>
+                <w:bCs w:val="false"/>
+                <w:sz w:val="18"/>
+                <w:szCs w:val="18"/>
+              </w:rPr>
+              <w:t xml:space="preserve">0.43 (0.28–0.65)***</w:t>
+            </w:r>
+          </w:p>
+        </w:tc>
+        <w:tc>
+          <w:tcPr>
+            <w:tcW w:type="dxa" w:w="3480"/>
+            <w:tcBorders>
+              <w:top w:val="single" w:color="AAAAAA" w:sz="4"/>
+              <w:left w:val="single" w:color="AAAAAA" w:sz="4"/>
+              <w:bottom w:val="single" w:color="AAAAAA" w:sz="4"/>
+              <w:right w:val="single" w:color="AAAAAA" w:sz="4"/>
+            </w:tcBorders>
+            <w:tcMar>
+              <w:top w:type="dxa" w:w="60"/>
+              <w:left w:type="dxa" w:w="100"/>
+              <w:bottom w:type="dxa" w:w="60"/>
+              <w:right w:type="dxa" w:w="100"/>
+            </w:tcMar>
+            <w:vAlign w:val="center"/>
+          </w:tcPr>
+          <w:p>
+            <w:pPr>
+              <w:jc w:val="center"/>
+            </w:pPr>
+            <w:r>
+              <w:rPr>
+                <w:rFonts w:ascii="Times New Roman" w:cs="Times New Roman" w:eastAsia="Times New Roman" w:hAnsi="Times New Roman"/>
+                <w:b w:val="false"/>
+                <w:bCs w:val="false"/>
+                <w:sz w:val="18"/>
+                <w:szCs w:val="18"/>
+              </w:rPr>
+              <w:t xml:space="preserve">0.90 (0.31–2.62)</w:t>
+            </w:r>
+          </w:p>
+        </w:tc>
+      </w:tr>
+      <w:tr>
+        <w:tc>
+          <w:tcPr>
+            <w:tcW w:type="dxa" w:w="2400"/>
+            <w:tcBorders>
+              <w:top w:val="single" w:color="AAAAAA" w:sz="4"/>
+              <w:left w:val="single" w:color="AAAAAA" w:sz="4"/>
+              <w:bottom w:val="single" w:color="AAAAAA" w:sz="4"/>
+              <w:right w:val="single" w:color="AAAAAA" w:sz="4"/>
+            </w:tcBorders>
+            <w:tcMar>
+              <w:top w:type="dxa" w:w="60"/>
+              <w:left w:type="dxa" w:w="100"/>
+              <w:bottom w:type="dxa" w:w="60"/>
+              <w:right w:type="dxa" w:w="100"/>
+            </w:tcMar>
+            <w:vAlign w:val="center"/>
+          </w:tcPr>
+          <w:p>
+            <w:pPr>
+              <w:jc w:val="left"/>
+            </w:pPr>
+            <w:r>
+              <w:rPr>
+                <w:rFonts w:ascii="Times New Roman" w:cs="Times New Roman" w:eastAsia="Times New Roman" w:hAnsi="Times New Roman"/>
+                <w:b w:val="false"/>
+                <w:bCs w:val="false"/>
+                <w:sz w:val="18"/>
+                <w:szCs w:val="18"/>
+              </w:rPr>
+              <w:t xml:space="preserve">Education: Primary</w:t>
+            </w:r>
+          </w:p>
+        </w:tc>
+        <w:tc>
+          <w:tcPr>
+            <w:tcW w:type="dxa" w:w="3480"/>
+            <w:tcBorders>
+              <w:top w:val="single" w:color="AAAAAA" w:sz="4"/>
+              <w:left w:val="single" w:color="AAAAAA" w:sz="4"/>
+              <w:bottom w:val="single" w:color="AAAAAA" w:sz="4"/>
+              <w:right w:val="single" w:color="AAAAAA" w:sz="4"/>
+            </w:tcBorders>
+            <w:shd w:fill="FFE5CC" w:val="clear"/>
+            <w:tcMar>
+              <w:top w:type="dxa" w:w="60"/>
+              <w:left w:type="dxa" w:w="100"/>
+              <w:bottom w:type="dxa" w:w="60"/>
+              <w:right w:type="dxa" w:w="100"/>
+            </w:tcMar>
+            <w:vAlign w:val="center"/>
+          </w:tcPr>
+          <w:p>
+            <w:pPr>
+              <w:jc w:val="center"/>
+            </w:pPr>
+            <w:r>
+              <w:rPr>
+                <w:rFonts w:ascii="Times New Roman" w:cs="Times New Roman" w:eastAsia="Times New Roman" w:hAnsi="Times New Roman"/>
+                <w:b w:val="false"/>
+                <w:bCs w:val="false"/>
+                <w:sz w:val="18"/>
+                <w:szCs w:val="18"/>
+              </w:rPr>
+              <w:t xml:space="preserve">0.48 (0.34–0.70)***</w:t>
+            </w:r>
+          </w:p>
+        </w:tc>
+        <w:tc>
+          <w:tcPr>
+            <w:tcW w:type="dxa" w:w="3480"/>
+            <w:tcBorders>
+              <w:top w:val="single" w:color="AAAAAA" w:sz="4"/>
+              <w:left w:val="single" w:color="AAAAAA" w:sz="4"/>
+              <w:bottom w:val="single" w:color="AAAAAA" w:sz="4"/>
+              <w:right w:val="single" w:color="AAAAAA" w:sz="4"/>
+            </w:tcBorders>
+            <w:tcMar>
+              <w:top w:type="dxa" w:w="60"/>
+              <w:left w:type="dxa" w:w="100"/>
+              <w:bottom w:type="dxa" w:w="60"/>
+              <w:right w:type="dxa" w:w="100"/>
+            </w:tcMar>
+            <w:vAlign w:val="center"/>
+          </w:tcPr>
+          <w:p>
+            <w:pPr>
+              <w:jc w:val="center"/>
+            </w:pPr>
+            <w:r>
+              <w:rPr>
+                <w:rFonts w:ascii="Times New Roman" w:cs="Times New Roman" w:eastAsia="Times New Roman" w:hAnsi="Times New Roman"/>
+                <w:b w:val="false"/>
+                <w:bCs w:val="false"/>
+                <w:sz w:val="18"/>
+                <w:szCs w:val="18"/>
+              </w:rPr>
+              <w:t xml:space="preserve">0.67 (0.25–1.81)</w:t>
+            </w:r>
+          </w:p>
+        </w:tc>
+      </w:tr>
+      <w:tr>
+        <w:tc>
+          <w:tcPr>
+            <w:tcW w:type="dxa" w:w="2400"/>
+            <w:tcBorders>
+              <w:top w:val="single" w:color="AAAAAA" w:sz="4"/>
+              <w:left w:val="single" w:color="AAAAAA" w:sz="4"/>
+              <w:bottom w:val="single" w:color="AAAAAA" w:sz="4"/>
+              <w:right w:val="single" w:color="AAAAAA" w:sz="4"/>
+            </w:tcBorders>
+            <w:tcMar>
+              <w:top w:type="dxa" w:w="60"/>
+              <w:left w:type="dxa" w:w="100"/>
+              <w:bottom w:type="dxa" w:w="60"/>
+              <w:right w:type="dxa" w:w="100"/>
+            </w:tcMar>
+            <w:vAlign w:val="center"/>
+          </w:tcPr>
+          <w:p>
+            <w:pPr>
+              <w:jc w:val="left"/>
+            </w:pPr>
+            <w:r>
+              <w:rPr>
+                <w:rFonts w:ascii="Times New Roman" w:cs="Times New Roman" w:eastAsia="Times New Roman" w:hAnsi="Times New Roman"/>
+                <w:b w:val="false"/>
+                <w:bCs w:val="false"/>
+                <w:sz w:val="18"/>
+                <w:szCs w:val="18"/>
+              </w:rPr>
+              <w:t xml:space="preserve">Education: Secondary</w:t>
+            </w:r>
+          </w:p>
+        </w:tc>
+        <w:tc>
+          <w:tcPr>
+            <w:tcW w:type="dxa" w:w="3480"/>
+            <w:tcBorders>
+              <w:top w:val="single" w:color="AAAAAA" w:sz="4"/>
+              <w:left w:val="single" w:color="AAAAAA" w:sz="4"/>
+              <w:bottom w:val="single" w:color="AAAAAA" w:sz="4"/>
+              <w:right w:val="single" w:color="AAAAAA" w:sz="4"/>
+            </w:tcBorders>
+            <w:shd w:fill="FFE5CC" w:val="clear"/>
+            <w:tcMar>
+              <w:top w:type="dxa" w:w="60"/>
+              <w:left w:type="dxa" w:w="100"/>
+              <w:bottom w:type="dxa" w:w="60"/>
+              <w:right w:type="dxa" w:w="100"/>
+            </w:tcMar>
+            <w:vAlign w:val="center"/>
+          </w:tcPr>
+          <w:p>
+            <w:pPr>
+              <w:jc w:val="center"/>
+            </w:pPr>
+            <w:r>
+              <w:rPr>
+                <w:rFonts w:ascii="Times New Roman" w:cs="Times New Roman" w:eastAsia="Times New Roman" w:hAnsi="Times New Roman"/>
+                <w:b w:val="false"/>
+                <w:bCs w:val="false"/>
+                <w:sz w:val="18"/>
+                <w:szCs w:val="18"/>
+              </w:rPr>
+              <w:t xml:space="preserve">0.50 (0.35–0.71)***</w:t>
+            </w:r>
+          </w:p>
+        </w:tc>
+        <w:tc>
+          <w:tcPr>
+            <w:tcW w:type="dxa" w:w="3480"/>
+            <w:tcBorders>
+              <w:top w:val="single" w:color="AAAAAA" w:sz="4"/>
+              <w:left w:val="single" w:color="AAAAAA" w:sz="4"/>
+              <w:bottom w:val="single" w:color="AAAAAA" w:sz="4"/>
+              <w:right w:val="single" w:color="AAAAAA" w:sz="4"/>
+            </w:tcBorders>
+            <w:tcMar>
+              <w:top w:type="dxa" w:w="60"/>
+              <w:left w:type="dxa" w:w="100"/>
+              <w:bottom w:type="dxa" w:w="60"/>
+              <w:right w:type="dxa" w:w="100"/>
+            </w:tcMar>
+            <w:vAlign w:val="center"/>
+          </w:tcPr>
+          <w:p>
+            <w:pPr>
+              <w:jc w:val="center"/>
+            </w:pPr>
+            <w:r>
+              <w:rPr>
+                <w:rFonts w:ascii="Times New Roman" w:cs="Times New Roman" w:eastAsia="Times New Roman" w:hAnsi="Times New Roman"/>
+                <w:b w:val="false"/>
+                <w:bCs w:val="false"/>
+                <w:sz w:val="18"/>
+                <w:szCs w:val="18"/>
+              </w:rPr>
+              <w:t xml:space="preserve">0.74 (0.28–1.97)</w:t>
+            </w:r>
+          </w:p>
+        </w:tc>
+      </w:tr>
+    </w:tbl>
+    <w:p>
+      <w:pPr>
+        <w:spacing w:after="80" w:before="40"/>
+      </w:pPr>
+      <w:r>
+        <w:rPr>
+          <w:rFonts w:ascii="Times New Roman" w:cs="Times New Roman" w:eastAsia="Times New Roman" w:hAnsi="Times New Roman"/>
+          <w:i/>
+          <w:iCs/>
+          <w:sz w:val="18"/>
+          <w:szCs w:val="18"/>
+        </w:rPr>
+        <w:t xml:space="preserve">OR = adjusted odds ratio; 95% confidence interval in parentheses. Reference cluster: C-B (2015) and C-2 (2024), both Late ANC, facility delivery. Reference categories within predictors: residence = rural; wealth quintile = middle; education = higher education. * p &lt; 0.05; ** p &lt; 0.01; *** p &lt; 0.001. Highlighted cells: orange = lower odds; green = higher odds. McFadden R² = 0.023 (2015); 0.011 (2024).</w:t>
+      </w:r>
+    </w:p>
+    <w:p>
+      <w:pPr>
+        <w:pageBreakBefore/>
+      </w:pPr>
+    </w:p>
+    <w:p>
+      <w:pPr>
         <w:pStyle w:val="Heading1"/>
         <w:spacing w:after="100" w:before="320"/>
       </w:pPr>
@@ -18013,7 +21468,7 @@
           <w:sz w:val="22"/>
           <w:szCs w:val="22"/>
         </w:rPr>
-        <w:t xml:space="preserve">Figure 2a. Cluster profiles of maternal care utilisation indicators, MDHS 2015 (K = 4). Bars show mean values per cluster: first ANC visit (months) and ANC visits (mean count) as raw means; all binary indicators as percentages. Cluster labels C-A through C-D correspond to manuscript designations.</w:t>
+        <w:t xml:space="preserve">Figure 2a. Cluster profiles of maternal care utilisation indicators, MDHS 2015 (K = 4). Bars show mean values per cluster: first ANC visit (months) and ANC visits (mean count) as raw means; all binary indicators as percentages.</w:t>
       </w:r>
     </w:p>
     <w:p>
@@ -18026,7 +21481,7 @@
           <w:sz w:val="22"/>
           <w:szCs w:val="22"/>
         </w:rPr>
-        <w:t xml:space="preserve">Figure 2b. Cluster profiles of maternal care utilisation indicators, MDHS 2024 (K = 3). Bars show mean values per cluster: first ANC visit (months) and ANC visits (mean count) as raw means; all binary indicators as percentages. Cluster labels C-1 through C-3 correspond to manuscript designations.</w:t>
+        <w:t xml:space="preserve">Figure 2b. Cluster profiles of maternal care utilisation indicators, MDHS 2024 (K = 3). Bars show mean values per cluster: first ANC visit (months) and ANC visits (mean count) as raw means; all binary indicators as percentages.</w:t>
       </w:r>
     </w:p>
     <w:p>

</xml_diff>

<commit_message>
Add Table 1 overall sample comparison and complete sociodemographic characteristics
- Add Table 1: complete sociodemographic comparison of 2015 vs 2024 analytic
  samples (n=13,030 vs n=6,925) with p-values for all characteristics including
  age, age group, residence, wealth quintile, education, parity, marital status,
  distance barrier, and region
- Add results paragraph describing key inter-sample differences (younger and
  more educated 2024 sample, lower parity, fewer married, similar rurality)
- Renumber tables: old 1a/1b → 2a/2b; Tables 2-6 → Tables 3-7 in create_docx.js
  to accommodate new Table 1; update all table cross-references in results text
- Regenerate Word document
</commit_message>
<xml_diff>
--- a/manuscript/maternal_health_malawi_comparative_2015_2024.docx
+++ b/manuscript/maternal_health_malawi_comparative_2015_2024.docx
@@ -487,6 +487,20 @@
           <w:sz w:val="22"/>
           <w:szCs w:val="22"/>
         </w:rPr>
+        <w:t xml:space="preserve">The sociodemographic characteristics of the two analytic samples are summarised in Table 1. The 2024 sample was significantly younger (mean age 26.9 ± 6.9 vs 28.1 ± 7.0 years; p &lt; 0.001), with a notably higher proportion of adolescent women aged 15–19 years (13.4% vs 8.5%). Women in 2024 had lower mean parity (2.7 ± 1.8 vs 3.3 ± 2.1; p &lt; 0.001) and were less likely to be married (69.6% vs 76.9%; p &lt; 0.001), consistent with trends toward later marriage and smaller family sizes. The education profile improved markedly: the proportion with no formal education halved from 11.6% to 6.2%, while secondary education rose from 21.4% to 25.8% (overall p &lt; 0.001). Both samples were predominantly rural (82.7% and 81.3% respectively; p = 0.013), with similar regional distributions (p = 0.058). The proportion reporting distance as a barrier to care declined from 53.4% to 49.3% (p &lt; 0.001).</w:t>
+      </w:r>
+    </w:p>
+    <w:p>
+      <w:pPr>
+        <w:spacing w:after="100" w:before="60" w:line="480" w:lineRule="auto"/>
+        <w:jc w:val="both"/>
+      </w:pPr>
+      <w:r>
+        <w:rPr>
+          <w:rFonts w:ascii="Times New Roman" w:cs="Times New Roman" w:eastAsia="Times New Roman" w:hAnsi="Times New Roman"/>
+          <w:sz w:val="22"/>
+          <w:szCs w:val="22"/>
+        </w:rPr>
         <w:t xml:space="preserve">The 2015 analysis sample comprised </w:t>
       </w:r>
       <w:r>
@@ -523,7 +537,7 @@
           <w:sz w:val="22"/>
           <w:szCs w:val="22"/>
         </w:rPr>
-        <w:t xml:space="preserve"> (Table 1). Both samples were predominantly rural (approximately 83% in 2015 and 81% in 2024). Between survey rounds, all ANC indicators improved significantly (Table 2). Most notably, </w:t>
+        <w:t xml:space="preserve"> (Table 1). Both samples were predominantly rural (approximately 83% in 2015 and 81% in 2024). Between survey rounds, all ANC indicators improved significantly (Table 3). Most notably, </w:t>
       </w:r>
       <w:r>
         <w:rPr>
@@ -622,7 +636,7 @@
           <w:sz w:val="22"/>
           <w:szCs w:val="22"/>
         </w:rPr>
-        <w:t xml:space="preserve">Statistical fit criteria identified four distinct groups as optimal for 2015 (each comprising at least 7% of women) and three groups for 2024 (each at least 5%). Their profiles are summarised in Table 3, with a visual representation of individual women’s assignments shown in Figure 6.</w:t>
+        <w:t xml:space="preserve">Statistical fit criteria identified four distinct groups as optimal for 2015 (each comprising at least 7% of women) and three groups for 2024 (each at least 5%). Their profiles are summarised in Table 4, with a visual representation of individual women’s assignments shown in Figure 6.</w:t>
       </w:r>
     </w:p>
     <w:p>
@@ -838,7 +852,7 @@
           <w:sz w:val="22"/>
           <w:szCs w:val="22"/>
         </w:rPr>
-        <w:t xml:space="preserve">Cluster membership was significantly associated with residence in both survey rounds (Table 4). In 2015, the association was medium-strength (Cramér’s V = 0.123; p &lt; 0.001), with rural women showing markedly higher rates of minimal utilisation (9.7% vs 4.5%). By 2024, the association weakened substantially (V = 0.055; p &lt; 0.001), and the high-coverage cluster prevalence was 51.5% among urban women compared to 45.6% among rural women. Both groups showed large improvements, with rural women’s high-coverage rates increasing from 24.4% to 45.6%. A significant socioeconomic gradient was present in both years, though the effect size narrowed (2015: V = 0.090; 2024: V = 0.059; both p &lt; 0.001). In 2015, minimal utilisation was four times more common among the poorest quintile (11.6%) than the richest (4.6%). By 2024, both extremes showed large improvements: high-coverage care was present in 53.2% of the richest compared to 43.5% of the poorest women, with a gap of 9.7 percent. Age-group associations were significant in both years with stable but small effect sizes (2015: V = 0.046; 2024: V = 0.042). In 2015, adolescent women aged 15–19 showed the lowest rates of comprehensive care (19.7%) and the highest rates of late ANC/facility delivery (66.0%), compared with young adults aged 20–34, among whom comprehensive care stood at 24.6%. In 2024, adolescents showed a large absolute improvement, with 43.3% in the high-coverage cluster, yet a gap of 4.9 percent relative to young adults (48.2%) persisted. Education was significantly associated with cluster membership in both years (2015: V = 0.089; 2024: V = 0.066), with higher-educated women more likely to be in the comprehensive or high-coverage cluster.</w:t>
+        <w:t xml:space="preserve">Cluster membership was significantly associated with residence in both survey rounds (Table 5). In 2015, the association was medium-strength (Cramér’s V = 0.123; p &lt; 0.001), with rural women showing markedly higher rates of minimal utilisation (9.7% vs 4.5%). By 2024, the association weakened substantially (V = 0.055; p &lt; 0.001), and the high-coverage cluster prevalence was 51.5% among urban women compared to 45.6% among rural women. Both groups showed large improvements, with rural women’s high-coverage rates increasing from 24.4% to 45.6%. A significant socioeconomic gradient was present in both years, though the effect size narrowed (2015: V = 0.090; 2024: V = 0.059; both p &lt; 0.001). In 2015, minimal utilisation was four times more common among the poorest quintile (11.6%) than the richest (4.6%). By 2024, both extremes showed large improvements: high-coverage care was present in 53.2% of the richest compared to 43.5% of the poorest women, with a gap of 9.7 percent. Age-group associations were significant in both years with stable but small effect sizes (2015: V = 0.046; 2024: V = 0.042). In 2015, adolescent women aged 15–19 showed the lowest rates of comprehensive care (19.7%) and the highest rates of late ANC/facility delivery (66.0%), compared with young adults aged 20–34, among whom comprehensive care stood at 24.6%. In 2024, adolescents showed a large absolute improvement, with 43.3% in the high-coverage cluster, yet a gap of 4.9 percent relative to young adults (48.2%) persisted. Education was significantly associated with cluster membership in both years (2015: V = 0.089; 2024: V = 0.066), with higher-educated women more likely to be in the comprehensive or high-coverage cluster.</w:t>
       </w:r>
     </w:p>
     <w:p>
@@ -878,7 +892,7 @@
           <w:sz w:val="22"/>
           <w:szCs w:val="22"/>
         </w:rPr>
-        <w:t xml:space="preserve">The ability to predict group membership from sociodemographic factors alone was modest but improved between survey years (cross-validated overall accuracy: 0.21 in 2015 versus 0.33 in 2024). In 2024, the high-coverage and late ANC/facility groups were most accurately identified (accuracy scores of 0.43 and 0.46 respectively), while the small moderate ANC/limited delivery group was the hardest to distinguish sociodemographically (0.09), suggesting its members are sociodemographically diverse. In both years, parity and age were the strongest predictors of group membership (Table 5). In 2015, household wealth ranked third. By 2024, geographic region and perceived distance to a health facility had replaced wealth among the top five predictors. This shift suggests that as financial barriers to care have been progressively addressed, geographic access and social factors have become the dominant drivers of differences in care-seeking behaviour.</w:t>
+        <w:t xml:space="preserve">The ability to predict group membership from sociodemographic factors alone was modest but improved between survey years (cross-validated overall accuracy: 0.21 in 2015 versus 0.33 in 2024). In 2024, the high-coverage and late ANC/facility groups were most accurately identified (accuracy scores of 0.43 and 0.46 respectively), while the small moderate ANC/limited delivery group was the hardest to distinguish sociodemographically (0.09), suggesting its members are sociodemographically diverse. In both years, parity and age were the strongest predictors of group membership (Table 6). In 2015, household wealth ranked third. By 2024, geographic region and perceived distance to a health facility had replaced wealth among the top five predictors. This shift suggests that as financial barriers to care have been progressively addressed, geographic access and social factors have become the dominant drivers of differences in care-seeking behaviour.</w:t>
       </w:r>
     </w:p>
     <w:p>
@@ -918,7 +932,7 @@
           <w:sz w:val="22"/>
           <w:szCs w:val="22"/>
         </w:rPr>
-        <w:t xml:space="preserve">Multinomial logistic regression with the late ANC/facility delivery group as reference provided adjusted odds ratios for all sociodemographic predictors simultaneously (Table 6; McFadden R² = 0.023 in 2015 and 0.011 in 2024). In 2015, membership in the C-section group was significantly predicted by older age (OR per year: 1.06; 95% CI 1.04–1.08; p &lt; 0.001), lower parity (0.73; 0.68–0.79; p &lt; 0.001), urban residence (1.24; 1.02–1.50; p = 0.032), and higher wealth quintile (richer: 1.48, 1.17–1.88; richest: 1.81, 1.40–2.34; both p ≤0.001); all sub-higher education categories were associated with substantially reduced odds (OR 0.45–0.59; all p ≤0.004). The minimal utilisation group was characterised by higher parity (1.09; 1.04–1.16; p = 0.001), greater perceived distance barrier to care (1.39; 1.21–1.59; p &lt; 0.001), and lower urban residence odds (0.73; 0.57–0.94; p = 0.013). Women in the comprehensive care group were more likely to be married (1.14; 1.03–1.27; p = 0.010), from the richest wealth quintile (1.28; 1.09–1.50; p = 0.002), and less likely to reside in urban areas (0.82; 0.71–0.94; p = 0.004) or to have less than higher education (OR 0.62–0.69; all p ≤0.022). In 2024, women in the high-coverage group were significantly more likely to be married (1.22; 1.09–1.36; p &lt; 0.001), of lower parity (0.91; 0.86–0.96; p = 0.001), and marginally older (1.02; 1.00–1.03; p = 0.034); all sub-higher education categories were strongly associated with reduced membership odds (OR 0.43–0.50; all p &lt; 0.001). No predictor reached statistical significance for the moderate ANC/limited delivery group in 2024.</w:t>
+        <w:t xml:space="preserve">Multinomial logistic regression with the late ANC/facility delivery group as reference provided adjusted odds ratios for all sociodemographic predictors simultaneously (Table 7; McFadden R² = 0.023 in 2015 and 0.011 in 2024). In 2015, membership in the C-section group was significantly predicted by older age (OR per year: 1.06; 95% CI 1.04–1.08; p &lt; 0.001), lower parity (0.73; 0.68–0.79; p &lt; 0.001), urban residence (1.24; 1.02–1.50; p = 0.032), and higher wealth quintile (richer: 1.48, 1.17–1.88; richest: 1.81, 1.40–2.34; both p ≤0.001); all sub-higher education categories were associated with substantially reduced odds (OR 0.45–0.59; all p ≤0.004). The minimal utilisation group was characterised by higher parity (1.09; 1.04–1.16; p = 0.001), greater perceived distance barrier to care (1.39; 1.21–1.59; p &lt; 0.001), and lower urban residence odds (0.73; 0.57–0.94; p = 0.013). Women in the comprehensive care group were more likely to be married (1.14; 1.03–1.27; p = 0.010), from the richest wealth quintile (1.28; 1.09–1.50; p = 0.002), and less likely to reside in urban areas (0.82; 0.71–0.94; p = 0.004) or to have less than higher education (OR 0.62–0.69; all p ≤0.022). In 2024, women in the high-coverage group were significantly more likely to be married (1.22; 1.09–1.36; p &lt; 0.001), of lower parity (0.91; 0.86–0.96; p = 0.001), and marginally older (1.02; 1.00–1.03; p = 0.034); all sub-higher education categories were strongly associated with reduced membership odds (OR 0.43–0.50; all p &lt; 0.001). No predictor reached statistical significance for the moderate ANC/limited delivery group in 2024.</w:t>
       </w:r>
     </w:p>
     <w:p>
@@ -1156,7 +1170,3709 @@
           <w:sz w:val="22"/>
           <w:szCs w:val="22"/>
         </w:rPr>
-        <w:t xml:space="preserve">Table 1a. Sociodemographic Characteristics by Cluster: MDHS 2015 (K = 4)</w:t>
+        <w:t xml:space="preserve">Table 1. Sociodemographic Characteristics of the 2015 and 2024 Analytic Samples</w:t>
+      </w:r>
+    </w:p>
+    <w:tbl>
+      <w:tblPr>
+        <w:tblW w:type="dxa" w:w="9360"/>
+        <w:tblBorders>
+          <w:top w:val="single" w:color="auto" w:sz="4"/>
+          <w:left w:val="single" w:color="auto" w:sz="4"/>
+          <w:bottom w:val="single" w:color="auto" w:sz="4"/>
+          <w:right w:val="single" w:color="auto" w:sz="4"/>
+          <w:insideH w:val="single" w:color="auto" w:sz="4"/>
+          <w:insideV w:val="single" w:color="auto" w:sz="4"/>
+        </w:tblBorders>
+      </w:tblPr>
+      <w:tblGrid>
+        <w:gridCol w:w="3120"/>
+        <w:gridCol w:w="2040"/>
+        <w:gridCol w:w="2040"/>
+        <w:gridCol w:w="2160"/>
+      </w:tblGrid>
+      <w:tr>
+        <w:tc>
+          <w:tcPr>
+            <w:tcW w:type="dxa" w:w="3120"/>
+            <w:tcBorders>
+              <w:top w:val="single" w:color="AAAAAA" w:sz="4"/>
+              <w:left w:val="single" w:color="AAAAAA" w:sz="4"/>
+              <w:bottom w:val="single" w:color="AAAAAA" w:sz="4"/>
+              <w:right w:val="single" w:color="AAAAAA" w:sz="4"/>
+            </w:tcBorders>
+            <w:shd w:fill="1F3864" w:val="clear"/>
+            <w:tcMar>
+              <w:top w:type="dxa" w:w="80"/>
+              <w:left w:type="dxa" w:w="120"/>
+              <w:bottom w:type="dxa" w:w="80"/>
+              <w:right w:type="dxa" w:w="120"/>
+            </w:tcMar>
+            <w:vAlign w:val="center"/>
+          </w:tcPr>
+          <w:p>
+            <w:pPr>
+              <w:jc w:val="center"/>
+            </w:pPr>
+            <w:r>
+              <w:rPr>
+                <w:rFonts w:ascii="Times New Roman" w:cs="Times New Roman" w:eastAsia="Times New Roman" w:hAnsi="Times New Roman"/>
+                <w:b/>
+                <w:bCs/>
+                <w:color w:val="FFFFFF"/>
+                <w:sz w:val="18"/>
+                <w:szCs w:val="18"/>
+              </w:rPr>
+              <w:t xml:space="preserve">Characteristic</w:t>
+            </w:r>
+          </w:p>
+        </w:tc>
+        <w:tc>
+          <w:tcPr>
+            <w:tcW w:type="dxa" w:w="2040"/>
+            <w:tcBorders>
+              <w:top w:val="single" w:color="AAAAAA" w:sz="4"/>
+              <w:left w:val="single" w:color="AAAAAA" w:sz="4"/>
+              <w:bottom w:val="single" w:color="AAAAAA" w:sz="4"/>
+              <w:right w:val="single" w:color="AAAAAA" w:sz="4"/>
+            </w:tcBorders>
+            <w:shd w:fill="1F3864" w:val="clear"/>
+            <w:tcMar>
+              <w:top w:type="dxa" w:w="80"/>
+              <w:left w:type="dxa" w:w="120"/>
+              <w:bottom w:type="dxa" w:w="80"/>
+              <w:right w:type="dxa" w:w="120"/>
+            </w:tcMar>
+            <w:vAlign w:val="center"/>
+          </w:tcPr>
+          <w:p>
+            <w:pPr>
+              <w:jc w:val="center"/>
+            </w:pPr>
+            <w:r>
+              <w:rPr>
+                <w:rFonts w:ascii="Times New Roman" w:cs="Times New Roman" w:eastAsia="Times New Roman" w:hAnsi="Times New Roman"/>
+                <w:b/>
+                <w:bCs/>
+                <w:color w:val="FFFFFF"/>
+                <w:sz w:val="18"/>
+                <w:szCs w:val="18"/>
+              </w:rPr>
+              <w:t xml:space="preserve">MDHS 2015
+(n = 13,030)</w:t>
+            </w:r>
+          </w:p>
+        </w:tc>
+        <w:tc>
+          <w:tcPr>
+            <w:tcW w:type="dxa" w:w="2040"/>
+            <w:tcBorders>
+              <w:top w:val="single" w:color="AAAAAA" w:sz="4"/>
+              <w:left w:val="single" w:color="AAAAAA" w:sz="4"/>
+              <w:bottom w:val="single" w:color="AAAAAA" w:sz="4"/>
+              <w:right w:val="single" w:color="AAAAAA" w:sz="4"/>
+            </w:tcBorders>
+            <w:shd w:fill="1F3864" w:val="clear"/>
+            <w:tcMar>
+              <w:top w:type="dxa" w:w="80"/>
+              <w:left w:type="dxa" w:w="120"/>
+              <w:bottom w:type="dxa" w:w="80"/>
+              <w:right w:type="dxa" w:w="120"/>
+            </w:tcMar>
+            <w:vAlign w:val="center"/>
+          </w:tcPr>
+          <w:p>
+            <w:pPr>
+              <w:jc w:val="center"/>
+            </w:pPr>
+            <w:r>
+              <w:rPr>
+                <w:rFonts w:ascii="Times New Roman" w:cs="Times New Roman" w:eastAsia="Times New Roman" w:hAnsi="Times New Roman"/>
+                <w:b/>
+                <w:bCs/>
+                <w:color w:val="FFFFFF"/>
+                <w:sz w:val="18"/>
+                <w:szCs w:val="18"/>
+              </w:rPr>
+              <w:t xml:space="preserve">MDHS 2024
+(n = 6,925)</w:t>
+            </w:r>
+          </w:p>
+        </w:tc>
+        <w:tc>
+          <w:tcPr>
+            <w:tcW w:type="dxa" w:w="2160"/>
+            <w:tcBorders>
+              <w:top w:val="single" w:color="AAAAAA" w:sz="4"/>
+              <w:left w:val="single" w:color="AAAAAA" w:sz="4"/>
+              <w:bottom w:val="single" w:color="AAAAAA" w:sz="4"/>
+              <w:right w:val="single" w:color="AAAAAA" w:sz="4"/>
+            </w:tcBorders>
+            <w:shd w:fill="1F3864" w:val="clear"/>
+            <w:tcMar>
+              <w:top w:type="dxa" w:w="80"/>
+              <w:left w:type="dxa" w:w="120"/>
+              <w:bottom w:type="dxa" w:w="80"/>
+              <w:right w:type="dxa" w:w="120"/>
+            </w:tcMar>
+            <w:vAlign w:val="center"/>
+          </w:tcPr>
+          <w:p>
+            <w:pPr>
+              <w:jc w:val="center"/>
+            </w:pPr>
+            <w:r>
+              <w:rPr>
+                <w:rFonts w:ascii="Times New Roman" w:cs="Times New Roman" w:eastAsia="Times New Roman" w:hAnsi="Times New Roman"/>
+                <w:b/>
+                <w:bCs/>
+                <w:color w:val="FFFFFF"/>
+                <w:sz w:val="18"/>
+                <w:szCs w:val="18"/>
+              </w:rPr>
+              <w:t xml:space="preserve">p-value</w:t>
+            </w:r>
+          </w:p>
+        </w:tc>
+      </w:tr>
+      <w:tr>
+        <w:tc>
+          <w:tcPr>
+            <w:tcW w:type="dxa" w:w="3120"/>
+            <w:tcBorders>
+              <w:top w:val="single" w:color="AAAAAA" w:sz="4"/>
+              <w:left w:val="single" w:color="AAAAAA" w:sz="4"/>
+              <w:bottom w:val="single" w:color="AAAAAA" w:sz="4"/>
+              <w:right w:val="single" w:color="AAAAAA" w:sz="4"/>
+            </w:tcBorders>
+            <w:tcMar>
+              <w:top w:type="dxa" w:w="60"/>
+              <w:left w:type="dxa" w:w="100"/>
+              <w:bottom w:type="dxa" w:w="60"/>
+              <w:right w:type="dxa" w:w="100"/>
+            </w:tcMar>
+            <w:vAlign w:val="center"/>
+          </w:tcPr>
+          <w:p>
+            <w:pPr>
+              <w:jc w:val="left"/>
+            </w:pPr>
+            <w:r>
+              <w:rPr>
+                <w:rFonts w:ascii="Times New Roman" w:cs="Times New Roman" w:eastAsia="Times New Roman" w:hAnsi="Times New Roman"/>
+                <w:b/>
+                <w:bCs/>
+                <w:sz w:val="18"/>
+                <w:szCs w:val="18"/>
+              </w:rPr>
+              <w:t xml:space="preserve">Age, years (mean ± SD)</w:t>
+            </w:r>
+          </w:p>
+        </w:tc>
+        <w:tc>
+          <w:tcPr>
+            <w:tcW w:type="dxa" w:w="2040"/>
+            <w:tcBorders>
+              <w:top w:val="single" w:color="AAAAAA" w:sz="4"/>
+              <w:left w:val="single" w:color="AAAAAA" w:sz="4"/>
+              <w:bottom w:val="single" w:color="AAAAAA" w:sz="4"/>
+              <w:right w:val="single" w:color="AAAAAA" w:sz="4"/>
+            </w:tcBorders>
+            <w:tcMar>
+              <w:top w:type="dxa" w:w="60"/>
+              <w:left w:type="dxa" w:w="100"/>
+              <w:bottom w:type="dxa" w:w="60"/>
+              <w:right w:type="dxa" w:w="100"/>
+            </w:tcMar>
+            <w:vAlign w:val="center"/>
+          </w:tcPr>
+          <w:p>
+            <w:pPr>
+              <w:jc w:val="center"/>
+            </w:pPr>
+            <w:r>
+              <w:rPr>
+                <w:rFonts w:ascii="Times New Roman" w:cs="Times New Roman" w:eastAsia="Times New Roman" w:hAnsi="Times New Roman"/>
+                <w:b w:val="false"/>
+                <w:bCs w:val="false"/>
+                <w:sz w:val="18"/>
+                <w:szCs w:val="18"/>
+              </w:rPr>
+              <w:t xml:space="preserve">28.1 ± 7.0</w:t>
+            </w:r>
+          </w:p>
+        </w:tc>
+        <w:tc>
+          <w:tcPr>
+            <w:tcW w:type="dxa" w:w="2040"/>
+            <w:tcBorders>
+              <w:top w:val="single" w:color="AAAAAA" w:sz="4"/>
+              <w:left w:val="single" w:color="AAAAAA" w:sz="4"/>
+              <w:bottom w:val="single" w:color="AAAAAA" w:sz="4"/>
+              <w:right w:val="single" w:color="AAAAAA" w:sz="4"/>
+            </w:tcBorders>
+            <w:tcMar>
+              <w:top w:type="dxa" w:w="60"/>
+              <w:left w:type="dxa" w:w="100"/>
+              <w:bottom w:type="dxa" w:w="60"/>
+              <w:right w:type="dxa" w:w="100"/>
+            </w:tcMar>
+            <w:vAlign w:val="center"/>
+          </w:tcPr>
+          <w:p>
+            <w:pPr>
+              <w:jc w:val="center"/>
+            </w:pPr>
+            <w:r>
+              <w:rPr>
+                <w:rFonts w:ascii="Times New Roman" w:cs="Times New Roman" w:eastAsia="Times New Roman" w:hAnsi="Times New Roman"/>
+                <w:b w:val="false"/>
+                <w:bCs w:val="false"/>
+                <w:sz w:val="18"/>
+                <w:szCs w:val="18"/>
+              </w:rPr>
+              <w:t xml:space="preserve">26.9 ± 6.9</w:t>
+            </w:r>
+          </w:p>
+        </w:tc>
+        <w:tc>
+          <w:tcPr>
+            <w:tcW w:type="dxa" w:w="2160"/>
+            <w:tcBorders>
+              <w:top w:val="single" w:color="AAAAAA" w:sz="4"/>
+              <w:left w:val="single" w:color="AAAAAA" w:sz="4"/>
+              <w:bottom w:val="single" w:color="AAAAAA" w:sz="4"/>
+              <w:right w:val="single" w:color="AAAAAA" w:sz="4"/>
+            </w:tcBorders>
+            <w:tcMar>
+              <w:top w:type="dxa" w:w="60"/>
+              <w:left w:type="dxa" w:w="100"/>
+              <w:bottom w:type="dxa" w:w="60"/>
+              <w:right w:type="dxa" w:w="100"/>
+            </w:tcMar>
+            <w:vAlign w:val="center"/>
+          </w:tcPr>
+          <w:p>
+            <w:pPr>
+              <w:jc w:val="center"/>
+            </w:pPr>
+            <w:r>
+              <w:rPr>
+                <w:rFonts w:ascii="Times New Roman" w:cs="Times New Roman" w:eastAsia="Times New Roman" w:hAnsi="Times New Roman"/>
+                <w:b w:val="false"/>
+                <w:bCs w:val="false"/>
+                <w:sz w:val="18"/>
+                <w:szCs w:val="18"/>
+              </w:rPr>
+              <w:t xml:space="preserve">&lt;0.001</w:t>
+            </w:r>
+          </w:p>
+        </w:tc>
+      </w:tr>
+      <w:tr>
+        <w:tc>
+          <w:tcPr>
+            <w:tcW w:type="dxa" w:w="3120"/>
+            <w:tcBorders>
+              <w:top w:val="single" w:color="AAAAAA" w:sz="4"/>
+              <w:left w:val="single" w:color="AAAAAA" w:sz="4"/>
+              <w:bottom w:val="single" w:color="AAAAAA" w:sz="4"/>
+              <w:right w:val="single" w:color="AAAAAA" w:sz="4"/>
+            </w:tcBorders>
+            <w:shd w:fill="E0EAF6" w:val="clear"/>
+            <w:tcMar>
+              <w:top w:type="dxa" w:w="60"/>
+              <w:left w:type="dxa" w:w="100"/>
+              <w:bottom w:type="dxa" w:w="60"/>
+              <w:right w:type="dxa" w:w="100"/>
+            </w:tcMar>
+            <w:vAlign w:val="center"/>
+          </w:tcPr>
+          <w:p>
+            <w:pPr>
+              <w:jc w:val="left"/>
+            </w:pPr>
+            <w:r>
+              <w:rPr>
+                <w:rFonts w:ascii="Times New Roman" w:cs="Times New Roman" w:eastAsia="Times New Roman" w:hAnsi="Times New Roman"/>
+                <w:b/>
+                <w:bCs/>
+                <w:sz w:val="18"/>
+                <w:szCs w:val="18"/>
+              </w:rPr>
+              <w:t xml:space="preserve">Age group, n (%)</w:t>
+            </w:r>
+          </w:p>
+        </w:tc>
+        <w:tc>
+          <w:tcPr>
+            <w:tcW w:type="dxa" w:w="2040"/>
+            <w:tcBorders>
+              <w:top w:val="single" w:color="AAAAAA" w:sz="4"/>
+              <w:left w:val="single" w:color="AAAAAA" w:sz="4"/>
+              <w:bottom w:val="single" w:color="AAAAAA" w:sz="4"/>
+              <w:right w:val="single" w:color="AAAAAA" w:sz="4"/>
+            </w:tcBorders>
+            <w:shd w:fill="E0EAF6" w:val="clear"/>
+            <w:tcMar>
+              <w:top w:type="dxa" w:w="60"/>
+              <w:left w:type="dxa" w:w="100"/>
+              <w:bottom w:type="dxa" w:w="60"/>
+              <w:right w:type="dxa" w:w="100"/>
+            </w:tcMar>
+            <w:vAlign w:val="center"/>
+          </w:tcPr>
+          <w:p>
+            <w:pPr>
+              <w:jc w:val="center"/>
+            </w:pPr>
+            <w:r>
+              <w:rPr>
+                <w:rFonts w:ascii="Times New Roman" w:cs="Times New Roman" w:eastAsia="Times New Roman" w:hAnsi="Times New Roman"/>
+                <w:b w:val="false"/>
+                <w:bCs w:val="false"/>
+                <w:sz w:val="18"/>
+                <w:szCs w:val="18"/>
+              </w:rPr>
+              <w:t xml:space="preserve"/>
+            </w:r>
+          </w:p>
+        </w:tc>
+        <w:tc>
+          <w:tcPr>
+            <w:tcW w:type="dxa" w:w="2040"/>
+            <w:tcBorders>
+              <w:top w:val="single" w:color="AAAAAA" w:sz="4"/>
+              <w:left w:val="single" w:color="AAAAAA" w:sz="4"/>
+              <w:bottom w:val="single" w:color="AAAAAA" w:sz="4"/>
+              <w:right w:val="single" w:color="AAAAAA" w:sz="4"/>
+            </w:tcBorders>
+            <w:shd w:fill="E0EAF6" w:val="clear"/>
+            <w:tcMar>
+              <w:top w:type="dxa" w:w="60"/>
+              <w:left w:type="dxa" w:w="100"/>
+              <w:bottom w:type="dxa" w:w="60"/>
+              <w:right w:type="dxa" w:w="100"/>
+            </w:tcMar>
+            <w:vAlign w:val="center"/>
+          </w:tcPr>
+          <w:p>
+            <w:pPr>
+              <w:jc w:val="center"/>
+            </w:pPr>
+            <w:r>
+              <w:rPr>
+                <w:rFonts w:ascii="Times New Roman" w:cs="Times New Roman" w:eastAsia="Times New Roman" w:hAnsi="Times New Roman"/>
+                <w:b w:val="false"/>
+                <w:bCs w:val="false"/>
+                <w:sz w:val="18"/>
+                <w:szCs w:val="18"/>
+              </w:rPr>
+              <w:t xml:space="preserve"/>
+            </w:r>
+          </w:p>
+        </w:tc>
+        <w:tc>
+          <w:tcPr>
+            <w:tcW w:type="dxa" w:w="2160"/>
+            <w:tcBorders>
+              <w:top w:val="single" w:color="AAAAAA" w:sz="4"/>
+              <w:left w:val="single" w:color="AAAAAA" w:sz="4"/>
+              <w:bottom w:val="single" w:color="AAAAAA" w:sz="4"/>
+              <w:right w:val="single" w:color="AAAAAA" w:sz="4"/>
+            </w:tcBorders>
+            <w:shd w:fill="E0EAF6" w:val="clear"/>
+            <w:tcMar>
+              <w:top w:type="dxa" w:w="60"/>
+              <w:left w:type="dxa" w:w="100"/>
+              <w:bottom w:type="dxa" w:w="60"/>
+              <w:right w:type="dxa" w:w="100"/>
+            </w:tcMar>
+            <w:vAlign w:val="center"/>
+          </w:tcPr>
+          <w:p>
+            <w:pPr>
+              <w:jc w:val="center"/>
+            </w:pPr>
+            <w:r>
+              <w:rPr>
+                <w:rFonts w:ascii="Times New Roman" w:cs="Times New Roman" w:eastAsia="Times New Roman" w:hAnsi="Times New Roman"/>
+                <w:b w:val="false"/>
+                <w:bCs w:val="false"/>
+                <w:sz w:val="18"/>
+                <w:szCs w:val="18"/>
+              </w:rPr>
+              <w:t xml:space="preserve">&lt;0.001</w:t>
+            </w:r>
+          </w:p>
+        </w:tc>
+      </w:tr>
+      <w:tr>
+        <w:tc>
+          <w:tcPr>
+            <w:tcW w:type="dxa" w:w="3120"/>
+            <w:tcBorders>
+              <w:top w:val="single" w:color="AAAAAA" w:sz="4"/>
+              <w:left w:val="single" w:color="AAAAAA" w:sz="4"/>
+              <w:bottom w:val="single" w:color="AAAAAA" w:sz="4"/>
+              <w:right w:val="single" w:color="AAAAAA" w:sz="4"/>
+            </w:tcBorders>
+            <w:tcMar>
+              <w:top w:type="dxa" w:w="60"/>
+              <w:left w:type="dxa" w:w="100"/>
+              <w:bottom w:type="dxa" w:w="60"/>
+              <w:right w:type="dxa" w:w="100"/>
+            </w:tcMar>
+            <w:vAlign w:val="center"/>
+          </w:tcPr>
+          <w:p>
+            <w:pPr>
+              <w:jc w:val="left"/>
+            </w:pPr>
+            <w:r>
+              <w:rPr>
+                <w:rFonts w:ascii="Times New Roman" w:cs="Times New Roman" w:eastAsia="Times New Roman" w:hAnsi="Times New Roman"/>
+                <w:b w:val="false"/>
+                <w:bCs w:val="false"/>
+                <w:sz w:val="18"/>
+                <w:szCs w:val="18"/>
+              </w:rPr>
+              <w:t xml:space="preserve">  Adolescent (15–19)</w:t>
+            </w:r>
+          </w:p>
+        </w:tc>
+        <w:tc>
+          <w:tcPr>
+            <w:tcW w:type="dxa" w:w="2040"/>
+            <w:tcBorders>
+              <w:top w:val="single" w:color="AAAAAA" w:sz="4"/>
+              <w:left w:val="single" w:color="AAAAAA" w:sz="4"/>
+              <w:bottom w:val="single" w:color="AAAAAA" w:sz="4"/>
+              <w:right w:val="single" w:color="AAAAAA" w:sz="4"/>
+            </w:tcBorders>
+            <w:tcMar>
+              <w:top w:type="dxa" w:w="60"/>
+              <w:left w:type="dxa" w:w="100"/>
+              <w:bottom w:type="dxa" w:w="60"/>
+              <w:right w:type="dxa" w:w="100"/>
+            </w:tcMar>
+            <w:vAlign w:val="center"/>
+          </w:tcPr>
+          <w:p>
+            <w:pPr>
+              <w:jc w:val="center"/>
+            </w:pPr>
+            <w:r>
+              <w:rPr>
+                <w:rFonts w:ascii="Times New Roman" w:cs="Times New Roman" w:eastAsia="Times New Roman" w:hAnsi="Times New Roman"/>
+                <w:b w:val="false"/>
+                <w:bCs w:val="false"/>
+                <w:sz w:val="18"/>
+                <w:szCs w:val="18"/>
+              </w:rPr>
+              <w:t xml:space="preserve">1,109 (8.5%)</w:t>
+            </w:r>
+          </w:p>
+        </w:tc>
+        <w:tc>
+          <w:tcPr>
+            <w:tcW w:type="dxa" w:w="2040"/>
+            <w:tcBorders>
+              <w:top w:val="single" w:color="AAAAAA" w:sz="4"/>
+              <w:left w:val="single" w:color="AAAAAA" w:sz="4"/>
+              <w:bottom w:val="single" w:color="AAAAAA" w:sz="4"/>
+              <w:right w:val="single" w:color="AAAAAA" w:sz="4"/>
+            </w:tcBorders>
+            <w:tcMar>
+              <w:top w:type="dxa" w:w="60"/>
+              <w:left w:type="dxa" w:w="100"/>
+              <w:bottom w:type="dxa" w:w="60"/>
+              <w:right w:type="dxa" w:w="100"/>
+            </w:tcMar>
+            <w:vAlign w:val="center"/>
+          </w:tcPr>
+          <w:p>
+            <w:pPr>
+              <w:jc w:val="center"/>
+            </w:pPr>
+            <w:r>
+              <w:rPr>
+                <w:rFonts w:ascii="Times New Roman" w:cs="Times New Roman" w:eastAsia="Times New Roman" w:hAnsi="Times New Roman"/>
+                <w:b w:val="false"/>
+                <w:bCs w:val="false"/>
+                <w:sz w:val="18"/>
+                <w:szCs w:val="18"/>
+              </w:rPr>
+              <w:t xml:space="preserve">928 (13.4%)</w:t>
+            </w:r>
+          </w:p>
+        </w:tc>
+        <w:tc>
+          <w:tcPr>
+            <w:tcW w:type="dxa" w:w="2160"/>
+            <w:tcBorders>
+              <w:top w:val="single" w:color="AAAAAA" w:sz="4"/>
+              <w:left w:val="single" w:color="AAAAAA" w:sz="4"/>
+              <w:bottom w:val="single" w:color="AAAAAA" w:sz="4"/>
+              <w:right w:val="single" w:color="AAAAAA" w:sz="4"/>
+            </w:tcBorders>
+            <w:tcMar>
+              <w:top w:type="dxa" w:w="60"/>
+              <w:left w:type="dxa" w:w="100"/>
+              <w:bottom w:type="dxa" w:w="60"/>
+              <w:right w:type="dxa" w:w="100"/>
+            </w:tcMar>
+            <w:vAlign w:val="center"/>
+          </w:tcPr>
+          <w:p>
+            <w:pPr>
+              <w:jc w:val="center"/>
+            </w:pPr>
+            <w:r>
+              <w:rPr>
+                <w:rFonts w:ascii="Times New Roman" w:cs="Times New Roman" w:eastAsia="Times New Roman" w:hAnsi="Times New Roman"/>
+                <w:b w:val="false"/>
+                <w:bCs w:val="false"/>
+                <w:sz w:val="18"/>
+                <w:szCs w:val="18"/>
+              </w:rPr>
+              <w:t xml:space="preserve"/>
+            </w:r>
+          </w:p>
+        </w:tc>
+      </w:tr>
+      <w:tr>
+        <w:tc>
+          <w:tcPr>
+            <w:tcW w:type="dxa" w:w="3120"/>
+            <w:tcBorders>
+              <w:top w:val="single" w:color="AAAAAA" w:sz="4"/>
+              <w:left w:val="single" w:color="AAAAAA" w:sz="4"/>
+              <w:bottom w:val="single" w:color="AAAAAA" w:sz="4"/>
+              <w:right w:val="single" w:color="AAAAAA" w:sz="4"/>
+            </w:tcBorders>
+            <w:tcMar>
+              <w:top w:type="dxa" w:w="60"/>
+              <w:left w:type="dxa" w:w="100"/>
+              <w:bottom w:type="dxa" w:w="60"/>
+              <w:right w:type="dxa" w:w="100"/>
+            </w:tcMar>
+            <w:vAlign w:val="center"/>
+          </w:tcPr>
+          <w:p>
+            <w:pPr>
+              <w:jc w:val="left"/>
+            </w:pPr>
+            <w:r>
+              <w:rPr>
+                <w:rFonts w:ascii="Times New Roman" w:cs="Times New Roman" w:eastAsia="Times New Roman" w:hAnsi="Times New Roman"/>
+                <w:b w:val="false"/>
+                <w:bCs w:val="false"/>
+                <w:sz w:val="18"/>
+                <w:szCs w:val="18"/>
+              </w:rPr>
+              <w:t xml:space="preserve">  Young adult (20–34)</w:t>
+            </w:r>
+          </w:p>
+        </w:tc>
+        <w:tc>
+          <w:tcPr>
+            <w:tcW w:type="dxa" w:w="2040"/>
+            <w:tcBorders>
+              <w:top w:val="single" w:color="AAAAAA" w:sz="4"/>
+              <w:left w:val="single" w:color="AAAAAA" w:sz="4"/>
+              <w:bottom w:val="single" w:color="AAAAAA" w:sz="4"/>
+              <w:right w:val="single" w:color="AAAAAA" w:sz="4"/>
+            </w:tcBorders>
+            <w:tcMar>
+              <w:top w:type="dxa" w:w="60"/>
+              <w:left w:type="dxa" w:w="100"/>
+              <w:bottom w:type="dxa" w:w="60"/>
+              <w:right w:type="dxa" w:w="100"/>
+            </w:tcMar>
+            <w:vAlign w:val="center"/>
+          </w:tcPr>
+          <w:p>
+            <w:pPr>
+              <w:jc w:val="center"/>
+            </w:pPr>
+            <w:r>
+              <w:rPr>
+                <w:rFonts w:ascii="Times New Roman" w:cs="Times New Roman" w:eastAsia="Times New Roman" w:hAnsi="Times New Roman"/>
+                <w:b w:val="false"/>
+                <w:bCs w:val="false"/>
+                <w:sz w:val="18"/>
+                <w:szCs w:val="18"/>
+              </w:rPr>
+              <w:t xml:space="preserve">9,343 (71.7%)</w:t>
+            </w:r>
+          </w:p>
+        </w:tc>
+        <w:tc>
+          <w:tcPr>
+            <w:tcW w:type="dxa" w:w="2040"/>
+            <w:tcBorders>
+              <w:top w:val="single" w:color="AAAAAA" w:sz="4"/>
+              <w:left w:val="single" w:color="AAAAAA" w:sz="4"/>
+              <w:bottom w:val="single" w:color="AAAAAA" w:sz="4"/>
+              <w:right w:val="single" w:color="AAAAAA" w:sz="4"/>
+            </w:tcBorders>
+            <w:tcMar>
+              <w:top w:type="dxa" w:w="60"/>
+              <w:left w:type="dxa" w:w="100"/>
+              <w:bottom w:type="dxa" w:w="60"/>
+              <w:right w:type="dxa" w:w="100"/>
+            </w:tcMar>
+            <w:vAlign w:val="center"/>
+          </w:tcPr>
+          <w:p>
+            <w:pPr>
+              <w:jc w:val="center"/>
+            </w:pPr>
+            <w:r>
+              <w:rPr>
+                <w:rFonts w:ascii="Times New Roman" w:cs="Times New Roman" w:eastAsia="Times New Roman" w:hAnsi="Times New Roman"/>
+                <w:b w:val="false"/>
+                <w:bCs w:val="false"/>
+                <w:sz w:val="18"/>
+                <w:szCs w:val="18"/>
+              </w:rPr>
+              <w:t xml:space="preserve">4,861 (70.2%)</w:t>
+            </w:r>
+          </w:p>
+        </w:tc>
+        <w:tc>
+          <w:tcPr>
+            <w:tcW w:type="dxa" w:w="2160"/>
+            <w:tcBorders>
+              <w:top w:val="single" w:color="AAAAAA" w:sz="4"/>
+              <w:left w:val="single" w:color="AAAAAA" w:sz="4"/>
+              <w:bottom w:val="single" w:color="AAAAAA" w:sz="4"/>
+              <w:right w:val="single" w:color="AAAAAA" w:sz="4"/>
+            </w:tcBorders>
+            <w:tcMar>
+              <w:top w:type="dxa" w:w="60"/>
+              <w:left w:type="dxa" w:w="100"/>
+              <w:bottom w:type="dxa" w:w="60"/>
+              <w:right w:type="dxa" w:w="100"/>
+            </w:tcMar>
+            <w:vAlign w:val="center"/>
+          </w:tcPr>
+          <w:p>
+            <w:pPr>
+              <w:jc w:val="center"/>
+            </w:pPr>
+            <w:r>
+              <w:rPr>
+                <w:rFonts w:ascii="Times New Roman" w:cs="Times New Roman" w:eastAsia="Times New Roman" w:hAnsi="Times New Roman"/>
+                <w:b w:val="false"/>
+                <w:bCs w:val="false"/>
+                <w:sz w:val="18"/>
+                <w:szCs w:val="18"/>
+              </w:rPr>
+              <w:t xml:space="preserve"/>
+            </w:r>
+          </w:p>
+        </w:tc>
+      </w:tr>
+      <w:tr>
+        <w:tc>
+          <w:tcPr>
+            <w:tcW w:type="dxa" w:w="3120"/>
+            <w:tcBorders>
+              <w:top w:val="single" w:color="AAAAAA" w:sz="4"/>
+              <w:left w:val="single" w:color="AAAAAA" w:sz="4"/>
+              <w:bottom w:val="single" w:color="AAAAAA" w:sz="4"/>
+              <w:right w:val="single" w:color="AAAAAA" w:sz="4"/>
+            </w:tcBorders>
+            <w:tcMar>
+              <w:top w:type="dxa" w:w="60"/>
+              <w:left w:type="dxa" w:w="100"/>
+              <w:bottom w:type="dxa" w:w="60"/>
+              <w:right w:type="dxa" w:w="100"/>
+            </w:tcMar>
+            <w:vAlign w:val="center"/>
+          </w:tcPr>
+          <w:p>
+            <w:pPr>
+              <w:jc w:val="left"/>
+            </w:pPr>
+            <w:r>
+              <w:rPr>
+                <w:rFonts w:ascii="Times New Roman" w:cs="Times New Roman" w:eastAsia="Times New Roman" w:hAnsi="Times New Roman"/>
+                <w:b w:val="false"/>
+                <w:bCs w:val="false"/>
+                <w:sz w:val="18"/>
+                <w:szCs w:val="18"/>
+              </w:rPr>
+              <w:t xml:space="preserve">  Older (35–49)</w:t>
+            </w:r>
+          </w:p>
+        </w:tc>
+        <w:tc>
+          <w:tcPr>
+            <w:tcW w:type="dxa" w:w="2040"/>
+            <w:tcBorders>
+              <w:top w:val="single" w:color="AAAAAA" w:sz="4"/>
+              <w:left w:val="single" w:color="AAAAAA" w:sz="4"/>
+              <w:bottom w:val="single" w:color="AAAAAA" w:sz="4"/>
+              <w:right w:val="single" w:color="AAAAAA" w:sz="4"/>
+            </w:tcBorders>
+            <w:tcMar>
+              <w:top w:type="dxa" w:w="60"/>
+              <w:left w:type="dxa" w:w="100"/>
+              <w:bottom w:type="dxa" w:w="60"/>
+              <w:right w:type="dxa" w:w="100"/>
+            </w:tcMar>
+            <w:vAlign w:val="center"/>
+          </w:tcPr>
+          <w:p>
+            <w:pPr>
+              <w:jc w:val="center"/>
+            </w:pPr>
+            <w:r>
+              <w:rPr>
+                <w:rFonts w:ascii="Times New Roman" w:cs="Times New Roman" w:eastAsia="Times New Roman" w:hAnsi="Times New Roman"/>
+                <w:b w:val="false"/>
+                <w:bCs w:val="false"/>
+                <w:sz w:val="18"/>
+                <w:szCs w:val="18"/>
+              </w:rPr>
+              <w:t xml:space="preserve">2,578 (19.8%)</w:t>
+            </w:r>
+          </w:p>
+        </w:tc>
+        <w:tc>
+          <w:tcPr>
+            <w:tcW w:type="dxa" w:w="2040"/>
+            <w:tcBorders>
+              <w:top w:val="single" w:color="AAAAAA" w:sz="4"/>
+              <w:left w:val="single" w:color="AAAAAA" w:sz="4"/>
+              <w:bottom w:val="single" w:color="AAAAAA" w:sz="4"/>
+              <w:right w:val="single" w:color="AAAAAA" w:sz="4"/>
+            </w:tcBorders>
+            <w:tcMar>
+              <w:top w:type="dxa" w:w="60"/>
+              <w:left w:type="dxa" w:w="100"/>
+              <w:bottom w:type="dxa" w:w="60"/>
+              <w:right w:type="dxa" w:w="100"/>
+            </w:tcMar>
+            <w:vAlign w:val="center"/>
+          </w:tcPr>
+          <w:p>
+            <w:pPr>
+              <w:jc w:val="center"/>
+            </w:pPr>
+            <w:r>
+              <w:rPr>
+                <w:rFonts w:ascii="Times New Roman" w:cs="Times New Roman" w:eastAsia="Times New Roman" w:hAnsi="Times New Roman"/>
+                <w:b w:val="false"/>
+                <w:bCs w:val="false"/>
+                <w:sz w:val="18"/>
+                <w:szCs w:val="18"/>
+              </w:rPr>
+              <w:t xml:space="preserve">1,136 (16.4%)</w:t>
+            </w:r>
+          </w:p>
+        </w:tc>
+        <w:tc>
+          <w:tcPr>
+            <w:tcW w:type="dxa" w:w="2160"/>
+            <w:tcBorders>
+              <w:top w:val="single" w:color="AAAAAA" w:sz="4"/>
+              <w:left w:val="single" w:color="AAAAAA" w:sz="4"/>
+              <w:bottom w:val="single" w:color="AAAAAA" w:sz="4"/>
+              <w:right w:val="single" w:color="AAAAAA" w:sz="4"/>
+            </w:tcBorders>
+            <w:tcMar>
+              <w:top w:type="dxa" w:w="60"/>
+              <w:left w:type="dxa" w:w="100"/>
+              <w:bottom w:type="dxa" w:w="60"/>
+              <w:right w:type="dxa" w:w="100"/>
+            </w:tcMar>
+            <w:vAlign w:val="center"/>
+          </w:tcPr>
+          <w:p>
+            <w:pPr>
+              <w:jc w:val="center"/>
+            </w:pPr>
+            <w:r>
+              <w:rPr>
+                <w:rFonts w:ascii="Times New Roman" w:cs="Times New Roman" w:eastAsia="Times New Roman" w:hAnsi="Times New Roman"/>
+                <w:b w:val="false"/>
+                <w:bCs w:val="false"/>
+                <w:sz w:val="18"/>
+                <w:szCs w:val="18"/>
+              </w:rPr>
+              <w:t xml:space="preserve"/>
+            </w:r>
+          </w:p>
+        </w:tc>
+      </w:tr>
+      <w:tr>
+        <w:tc>
+          <w:tcPr>
+            <w:tcW w:type="dxa" w:w="3120"/>
+            <w:tcBorders>
+              <w:top w:val="single" w:color="AAAAAA" w:sz="4"/>
+              <w:left w:val="single" w:color="AAAAAA" w:sz="4"/>
+              <w:bottom w:val="single" w:color="AAAAAA" w:sz="4"/>
+              <w:right w:val="single" w:color="AAAAAA" w:sz="4"/>
+            </w:tcBorders>
+            <w:shd w:fill="E0EAF6" w:val="clear"/>
+            <w:tcMar>
+              <w:top w:type="dxa" w:w="60"/>
+              <w:left w:type="dxa" w:w="100"/>
+              <w:bottom w:type="dxa" w:w="60"/>
+              <w:right w:type="dxa" w:w="100"/>
+            </w:tcMar>
+            <w:vAlign w:val="center"/>
+          </w:tcPr>
+          <w:p>
+            <w:pPr>
+              <w:jc w:val="left"/>
+            </w:pPr>
+            <w:r>
+              <w:rPr>
+                <w:rFonts w:ascii="Times New Roman" w:cs="Times New Roman" w:eastAsia="Times New Roman" w:hAnsi="Times New Roman"/>
+                <w:b/>
+                <w:bCs/>
+                <w:sz w:val="18"/>
+                <w:szCs w:val="18"/>
+              </w:rPr>
+              <w:t xml:space="preserve">Residence, n (%)</w:t>
+            </w:r>
+          </w:p>
+        </w:tc>
+        <w:tc>
+          <w:tcPr>
+            <w:tcW w:type="dxa" w:w="2040"/>
+            <w:tcBorders>
+              <w:top w:val="single" w:color="AAAAAA" w:sz="4"/>
+              <w:left w:val="single" w:color="AAAAAA" w:sz="4"/>
+              <w:bottom w:val="single" w:color="AAAAAA" w:sz="4"/>
+              <w:right w:val="single" w:color="AAAAAA" w:sz="4"/>
+            </w:tcBorders>
+            <w:shd w:fill="E0EAF6" w:val="clear"/>
+            <w:tcMar>
+              <w:top w:type="dxa" w:w="60"/>
+              <w:left w:type="dxa" w:w="100"/>
+              <w:bottom w:type="dxa" w:w="60"/>
+              <w:right w:type="dxa" w:w="100"/>
+            </w:tcMar>
+            <w:vAlign w:val="center"/>
+          </w:tcPr>
+          <w:p>
+            <w:pPr>
+              <w:jc w:val="center"/>
+            </w:pPr>
+            <w:r>
+              <w:rPr>
+                <w:rFonts w:ascii="Times New Roman" w:cs="Times New Roman" w:eastAsia="Times New Roman" w:hAnsi="Times New Roman"/>
+                <w:b w:val="false"/>
+                <w:bCs w:val="false"/>
+                <w:sz w:val="18"/>
+                <w:szCs w:val="18"/>
+              </w:rPr>
+              <w:t xml:space="preserve"/>
+            </w:r>
+          </w:p>
+        </w:tc>
+        <w:tc>
+          <w:tcPr>
+            <w:tcW w:type="dxa" w:w="2040"/>
+            <w:tcBorders>
+              <w:top w:val="single" w:color="AAAAAA" w:sz="4"/>
+              <w:left w:val="single" w:color="AAAAAA" w:sz="4"/>
+              <w:bottom w:val="single" w:color="AAAAAA" w:sz="4"/>
+              <w:right w:val="single" w:color="AAAAAA" w:sz="4"/>
+            </w:tcBorders>
+            <w:shd w:fill="E0EAF6" w:val="clear"/>
+            <w:tcMar>
+              <w:top w:type="dxa" w:w="60"/>
+              <w:left w:type="dxa" w:w="100"/>
+              <w:bottom w:type="dxa" w:w="60"/>
+              <w:right w:type="dxa" w:w="100"/>
+            </w:tcMar>
+            <w:vAlign w:val="center"/>
+          </w:tcPr>
+          <w:p>
+            <w:pPr>
+              <w:jc w:val="center"/>
+            </w:pPr>
+            <w:r>
+              <w:rPr>
+                <w:rFonts w:ascii="Times New Roman" w:cs="Times New Roman" w:eastAsia="Times New Roman" w:hAnsi="Times New Roman"/>
+                <w:b w:val="false"/>
+                <w:bCs w:val="false"/>
+                <w:sz w:val="18"/>
+                <w:szCs w:val="18"/>
+              </w:rPr>
+              <w:t xml:space="preserve"/>
+            </w:r>
+          </w:p>
+        </w:tc>
+        <w:tc>
+          <w:tcPr>
+            <w:tcW w:type="dxa" w:w="2160"/>
+            <w:tcBorders>
+              <w:top w:val="single" w:color="AAAAAA" w:sz="4"/>
+              <w:left w:val="single" w:color="AAAAAA" w:sz="4"/>
+              <w:bottom w:val="single" w:color="AAAAAA" w:sz="4"/>
+              <w:right w:val="single" w:color="AAAAAA" w:sz="4"/>
+            </w:tcBorders>
+            <w:shd w:fill="E0EAF6" w:val="clear"/>
+            <w:tcMar>
+              <w:top w:type="dxa" w:w="60"/>
+              <w:left w:type="dxa" w:w="100"/>
+              <w:bottom w:type="dxa" w:w="60"/>
+              <w:right w:type="dxa" w:w="100"/>
+            </w:tcMar>
+            <w:vAlign w:val="center"/>
+          </w:tcPr>
+          <w:p>
+            <w:pPr>
+              <w:jc w:val="center"/>
+            </w:pPr>
+            <w:r>
+              <w:rPr>
+                <w:rFonts w:ascii="Times New Roman" w:cs="Times New Roman" w:eastAsia="Times New Roman" w:hAnsi="Times New Roman"/>
+                <w:b w:val="false"/>
+                <w:bCs w:val="false"/>
+                <w:sz w:val="18"/>
+                <w:szCs w:val="18"/>
+              </w:rPr>
+              <w:t xml:space="preserve">0.013</w:t>
+            </w:r>
+          </w:p>
+        </w:tc>
+      </w:tr>
+      <w:tr>
+        <w:tc>
+          <w:tcPr>
+            <w:tcW w:type="dxa" w:w="3120"/>
+            <w:tcBorders>
+              <w:top w:val="single" w:color="AAAAAA" w:sz="4"/>
+              <w:left w:val="single" w:color="AAAAAA" w:sz="4"/>
+              <w:bottom w:val="single" w:color="AAAAAA" w:sz="4"/>
+              <w:right w:val="single" w:color="AAAAAA" w:sz="4"/>
+            </w:tcBorders>
+            <w:tcMar>
+              <w:top w:type="dxa" w:w="60"/>
+              <w:left w:type="dxa" w:w="100"/>
+              <w:bottom w:type="dxa" w:w="60"/>
+              <w:right w:type="dxa" w:w="100"/>
+            </w:tcMar>
+            <w:vAlign w:val="center"/>
+          </w:tcPr>
+          <w:p>
+            <w:pPr>
+              <w:jc w:val="left"/>
+            </w:pPr>
+            <w:r>
+              <w:rPr>
+                <w:rFonts w:ascii="Times New Roman" w:cs="Times New Roman" w:eastAsia="Times New Roman" w:hAnsi="Times New Roman"/>
+                <w:b w:val="false"/>
+                <w:bCs w:val="false"/>
+                <w:sz w:val="18"/>
+                <w:szCs w:val="18"/>
+              </w:rPr>
+              <w:t xml:space="preserve">  Urban</w:t>
+            </w:r>
+          </w:p>
+        </w:tc>
+        <w:tc>
+          <w:tcPr>
+            <w:tcW w:type="dxa" w:w="2040"/>
+            <w:tcBorders>
+              <w:top w:val="single" w:color="AAAAAA" w:sz="4"/>
+              <w:left w:val="single" w:color="AAAAAA" w:sz="4"/>
+              <w:bottom w:val="single" w:color="AAAAAA" w:sz="4"/>
+              <w:right w:val="single" w:color="AAAAAA" w:sz="4"/>
+            </w:tcBorders>
+            <w:tcMar>
+              <w:top w:type="dxa" w:w="60"/>
+              <w:left w:type="dxa" w:w="100"/>
+              <w:bottom w:type="dxa" w:w="60"/>
+              <w:right w:type="dxa" w:w="100"/>
+            </w:tcMar>
+            <w:vAlign w:val="center"/>
+          </w:tcPr>
+          <w:p>
+            <w:pPr>
+              <w:jc w:val="center"/>
+            </w:pPr>
+            <w:r>
+              <w:rPr>
+                <w:rFonts w:ascii="Times New Roman" w:cs="Times New Roman" w:eastAsia="Times New Roman" w:hAnsi="Times New Roman"/>
+                <w:b w:val="false"/>
+                <w:bCs w:val="false"/>
+                <w:sz w:val="18"/>
+                <w:szCs w:val="18"/>
+              </w:rPr>
+              <w:t xml:space="preserve">2,257 (17.3%)</w:t>
+            </w:r>
+          </w:p>
+        </w:tc>
+        <w:tc>
+          <w:tcPr>
+            <w:tcW w:type="dxa" w:w="2040"/>
+            <w:tcBorders>
+              <w:top w:val="single" w:color="AAAAAA" w:sz="4"/>
+              <w:left w:val="single" w:color="AAAAAA" w:sz="4"/>
+              <w:bottom w:val="single" w:color="AAAAAA" w:sz="4"/>
+              <w:right w:val="single" w:color="AAAAAA" w:sz="4"/>
+            </w:tcBorders>
+            <w:tcMar>
+              <w:top w:type="dxa" w:w="60"/>
+              <w:left w:type="dxa" w:w="100"/>
+              <w:bottom w:type="dxa" w:w="60"/>
+              <w:right w:type="dxa" w:w="100"/>
+            </w:tcMar>
+            <w:vAlign w:val="center"/>
+          </w:tcPr>
+          <w:p>
+            <w:pPr>
+              <w:jc w:val="center"/>
+            </w:pPr>
+            <w:r>
+              <w:rPr>
+                <w:rFonts w:ascii="Times New Roman" w:cs="Times New Roman" w:eastAsia="Times New Roman" w:hAnsi="Times New Roman"/>
+                <w:b w:val="false"/>
+                <w:bCs w:val="false"/>
+                <w:sz w:val="18"/>
+                <w:szCs w:val="18"/>
+              </w:rPr>
+              <w:t xml:space="preserve">1,298 (18.7%)</w:t>
+            </w:r>
+          </w:p>
+        </w:tc>
+        <w:tc>
+          <w:tcPr>
+            <w:tcW w:type="dxa" w:w="2160"/>
+            <w:tcBorders>
+              <w:top w:val="single" w:color="AAAAAA" w:sz="4"/>
+              <w:left w:val="single" w:color="AAAAAA" w:sz="4"/>
+              <w:bottom w:val="single" w:color="AAAAAA" w:sz="4"/>
+              <w:right w:val="single" w:color="AAAAAA" w:sz="4"/>
+            </w:tcBorders>
+            <w:tcMar>
+              <w:top w:type="dxa" w:w="60"/>
+              <w:left w:type="dxa" w:w="100"/>
+              <w:bottom w:type="dxa" w:w="60"/>
+              <w:right w:type="dxa" w:w="100"/>
+            </w:tcMar>
+            <w:vAlign w:val="center"/>
+          </w:tcPr>
+          <w:p>
+            <w:pPr>
+              <w:jc w:val="center"/>
+            </w:pPr>
+            <w:r>
+              <w:rPr>
+                <w:rFonts w:ascii="Times New Roman" w:cs="Times New Roman" w:eastAsia="Times New Roman" w:hAnsi="Times New Roman"/>
+                <w:b w:val="false"/>
+                <w:bCs w:val="false"/>
+                <w:sz w:val="18"/>
+                <w:szCs w:val="18"/>
+              </w:rPr>
+              <w:t xml:space="preserve"/>
+            </w:r>
+          </w:p>
+        </w:tc>
+      </w:tr>
+      <w:tr>
+        <w:tc>
+          <w:tcPr>
+            <w:tcW w:type="dxa" w:w="3120"/>
+            <w:tcBorders>
+              <w:top w:val="single" w:color="AAAAAA" w:sz="4"/>
+              <w:left w:val="single" w:color="AAAAAA" w:sz="4"/>
+              <w:bottom w:val="single" w:color="AAAAAA" w:sz="4"/>
+              <w:right w:val="single" w:color="AAAAAA" w:sz="4"/>
+            </w:tcBorders>
+            <w:tcMar>
+              <w:top w:type="dxa" w:w="60"/>
+              <w:left w:type="dxa" w:w="100"/>
+              <w:bottom w:type="dxa" w:w="60"/>
+              <w:right w:type="dxa" w:w="100"/>
+            </w:tcMar>
+            <w:vAlign w:val="center"/>
+          </w:tcPr>
+          <w:p>
+            <w:pPr>
+              <w:jc w:val="left"/>
+            </w:pPr>
+            <w:r>
+              <w:rPr>
+                <w:rFonts w:ascii="Times New Roman" w:cs="Times New Roman" w:eastAsia="Times New Roman" w:hAnsi="Times New Roman"/>
+                <w:b w:val="false"/>
+                <w:bCs w:val="false"/>
+                <w:sz w:val="18"/>
+                <w:szCs w:val="18"/>
+              </w:rPr>
+              <w:t xml:space="preserve">  Rural</w:t>
+            </w:r>
+          </w:p>
+        </w:tc>
+        <w:tc>
+          <w:tcPr>
+            <w:tcW w:type="dxa" w:w="2040"/>
+            <w:tcBorders>
+              <w:top w:val="single" w:color="AAAAAA" w:sz="4"/>
+              <w:left w:val="single" w:color="AAAAAA" w:sz="4"/>
+              <w:bottom w:val="single" w:color="AAAAAA" w:sz="4"/>
+              <w:right w:val="single" w:color="AAAAAA" w:sz="4"/>
+            </w:tcBorders>
+            <w:tcMar>
+              <w:top w:type="dxa" w:w="60"/>
+              <w:left w:type="dxa" w:w="100"/>
+              <w:bottom w:type="dxa" w:w="60"/>
+              <w:right w:type="dxa" w:w="100"/>
+            </w:tcMar>
+            <w:vAlign w:val="center"/>
+          </w:tcPr>
+          <w:p>
+            <w:pPr>
+              <w:jc w:val="center"/>
+            </w:pPr>
+            <w:r>
+              <w:rPr>
+                <w:rFonts w:ascii="Times New Roman" w:cs="Times New Roman" w:eastAsia="Times New Roman" w:hAnsi="Times New Roman"/>
+                <w:b w:val="false"/>
+                <w:bCs w:val="false"/>
+                <w:sz w:val="18"/>
+                <w:szCs w:val="18"/>
+              </w:rPr>
+              <w:t xml:space="preserve">10,773 (82.7%)</w:t>
+            </w:r>
+          </w:p>
+        </w:tc>
+        <w:tc>
+          <w:tcPr>
+            <w:tcW w:type="dxa" w:w="2040"/>
+            <w:tcBorders>
+              <w:top w:val="single" w:color="AAAAAA" w:sz="4"/>
+              <w:left w:val="single" w:color="AAAAAA" w:sz="4"/>
+              <w:bottom w:val="single" w:color="AAAAAA" w:sz="4"/>
+              <w:right w:val="single" w:color="AAAAAA" w:sz="4"/>
+            </w:tcBorders>
+            <w:tcMar>
+              <w:top w:type="dxa" w:w="60"/>
+              <w:left w:type="dxa" w:w="100"/>
+              <w:bottom w:type="dxa" w:w="60"/>
+              <w:right w:type="dxa" w:w="100"/>
+            </w:tcMar>
+            <w:vAlign w:val="center"/>
+          </w:tcPr>
+          <w:p>
+            <w:pPr>
+              <w:jc w:val="center"/>
+            </w:pPr>
+            <w:r>
+              <w:rPr>
+                <w:rFonts w:ascii="Times New Roman" w:cs="Times New Roman" w:eastAsia="Times New Roman" w:hAnsi="Times New Roman"/>
+                <w:b w:val="false"/>
+                <w:bCs w:val="false"/>
+                <w:sz w:val="18"/>
+                <w:szCs w:val="18"/>
+              </w:rPr>
+              <w:t xml:space="preserve">5,627 (81.3%)</w:t>
+            </w:r>
+          </w:p>
+        </w:tc>
+        <w:tc>
+          <w:tcPr>
+            <w:tcW w:type="dxa" w:w="2160"/>
+            <w:tcBorders>
+              <w:top w:val="single" w:color="AAAAAA" w:sz="4"/>
+              <w:left w:val="single" w:color="AAAAAA" w:sz="4"/>
+              <w:bottom w:val="single" w:color="AAAAAA" w:sz="4"/>
+              <w:right w:val="single" w:color="AAAAAA" w:sz="4"/>
+            </w:tcBorders>
+            <w:tcMar>
+              <w:top w:type="dxa" w:w="60"/>
+              <w:left w:type="dxa" w:w="100"/>
+              <w:bottom w:type="dxa" w:w="60"/>
+              <w:right w:type="dxa" w:w="100"/>
+            </w:tcMar>
+            <w:vAlign w:val="center"/>
+          </w:tcPr>
+          <w:p>
+            <w:pPr>
+              <w:jc w:val="center"/>
+            </w:pPr>
+            <w:r>
+              <w:rPr>
+                <w:rFonts w:ascii="Times New Roman" w:cs="Times New Roman" w:eastAsia="Times New Roman" w:hAnsi="Times New Roman"/>
+                <w:b w:val="false"/>
+                <w:bCs w:val="false"/>
+                <w:sz w:val="18"/>
+                <w:szCs w:val="18"/>
+              </w:rPr>
+              <w:t xml:space="preserve"/>
+            </w:r>
+          </w:p>
+        </w:tc>
+      </w:tr>
+      <w:tr>
+        <w:tc>
+          <w:tcPr>
+            <w:tcW w:type="dxa" w:w="3120"/>
+            <w:tcBorders>
+              <w:top w:val="single" w:color="AAAAAA" w:sz="4"/>
+              <w:left w:val="single" w:color="AAAAAA" w:sz="4"/>
+              <w:bottom w:val="single" w:color="AAAAAA" w:sz="4"/>
+              <w:right w:val="single" w:color="AAAAAA" w:sz="4"/>
+            </w:tcBorders>
+            <w:shd w:fill="E0EAF6" w:val="clear"/>
+            <w:tcMar>
+              <w:top w:type="dxa" w:w="60"/>
+              <w:left w:type="dxa" w:w="100"/>
+              <w:bottom w:type="dxa" w:w="60"/>
+              <w:right w:type="dxa" w:w="100"/>
+            </w:tcMar>
+            <w:vAlign w:val="center"/>
+          </w:tcPr>
+          <w:p>
+            <w:pPr>
+              <w:jc w:val="left"/>
+            </w:pPr>
+            <w:r>
+              <w:rPr>
+                <w:rFonts w:ascii="Times New Roman" w:cs="Times New Roman" w:eastAsia="Times New Roman" w:hAnsi="Times New Roman"/>
+                <w:b/>
+                <w:bCs/>
+                <w:sz w:val="18"/>
+                <w:szCs w:val="18"/>
+              </w:rPr>
+              <w:t xml:space="preserve">Wealth quintile, n (%)</w:t>
+            </w:r>
+          </w:p>
+        </w:tc>
+        <w:tc>
+          <w:tcPr>
+            <w:tcW w:type="dxa" w:w="2040"/>
+            <w:tcBorders>
+              <w:top w:val="single" w:color="AAAAAA" w:sz="4"/>
+              <w:left w:val="single" w:color="AAAAAA" w:sz="4"/>
+              <w:bottom w:val="single" w:color="AAAAAA" w:sz="4"/>
+              <w:right w:val="single" w:color="AAAAAA" w:sz="4"/>
+            </w:tcBorders>
+            <w:shd w:fill="E0EAF6" w:val="clear"/>
+            <w:tcMar>
+              <w:top w:type="dxa" w:w="60"/>
+              <w:left w:type="dxa" w:w="100"/>
+              <w:bottom w:type="dxa" w:w="60"/>
+              <w:right w:type="dxa" w:w="100"/>
+            </w:tcMar>
+            <w:vAlign w:val="center"/>
+          </w:tcPr>
+          <w:p>
+            <w:pPr>
+              <w:jc w:val="center"/>
+            </w:pPr>
+            <w:r>
+              <w:rPr>
+                <w:rFonts w:ascii="Times New Roman" w:cs="Times New Roman" w:eastAsia="Times New Roman" w:hAnsi="Times New Roman"/>
+                <w:b w:val="false"/>
+                <w:bCs w:val="false"/>
+                <w:sz w:val="18"/>
+                <w:szCs w:val="18"/>
+              </w:rPr>
+              <w:t xml:space="preserve"/>
+            </w:r>
+          </w:p>
+        </w:tc>
+        <w:tc>
+          <w:tcPr>
+            <w:tcW w:type="dxa" w:w="2040"/>
+            <w:tcBorders>
+              <w:top w:val="single" w:color="AAAAAA" w:sz="4"/>
+              <w:left w:val="single" w:color="AAAAAA" w:sz="4"/>
+              <w:bottom w:val="single" w:color="AAAAAA" w:sz="4"/>
+              <w:right w:val="single" w:color="AAAAAA" w:sz="4"/>
+            </w:tcBorders>
+            <w:shd w:fill="E0EAF6" w:val="clear"/>
+            <w:tcMar>
+              <w:top w:type="dxa" w:w="60"/>
+              <w:left w:type="dxa" w:w="100"/>
+              <w:bottom w:type="dxa" w:w="60"/>
+              <w:right w:type="dxa" w:w="100"/>
+            </w:tcMar>
+            <w:vAlign w:val="center"/>
+          </w:tcPr>
+          <w:p>
+            <w:pPr>
+              <w:jc w:val="center"/>
+            </w:pPr>
+            <w:r>
+              <w:rPr>
+                <w:rFonts w:ascii="Times New Roman" w:cs="Times New Roman" w:eastAsia="Times New Roman" w:hAnsi="Times New Roman"/>
+                <w:b w:val="false"/>
+                <w:bCs w:val="false"/>
+                <w:sz w:val="18"/>
+                <w:szCs w:val="18"/>
+              </w:rPr>
+              <w:t xml:space="preserve"/>
+            </w:r>
+          </w:p>
+        </w:tc>
+        <w:tc>
+          <w:tcPr>
+            <w:tcW w:type="dxa" w:w="2160"/>
+            <w:tcBorders>
+              <w:top w:val="single" w:color="AAAAAA" w:sz="4"/>
+              <w:left w:val="single" w:color="AAAAAA" w:sz="4"/>
+              <w:bottom w:val="single" w:color="AAAAAA" w:sz="4"/>
+              <w:right w:val="single" w:color="AAAAAA" w:sz="4"/>
+            </w:tcBorders>
+            <w:shd w:fill="E0EAF6" w:val="clear"/>
+            <w:tcMar>
+              <w:top w:type="dxa" w:w="60"/>
+              <w:left w:type="dxa" w:w="100"/>
+              <w:bottom w:type="dxa" w:w="60"/>
+              <w:right w:type="dxa" w:w="100"/>
+            </w:tcMar>
+            <w:vAlign w:val="center"/>
+          </w:tcPr>
+          <w:p>
+            <w:pPr>
+              <w:jc w:val="center"/>
+            </w:pPr>
+            <w:r>
+              <w:rPr>
+                <w:rFonts w:ascii="Times New Roman" w:cs="Times New Roman" w:eastAsia="Times New Roman" w:hAnsi="Times New Roman"/>
+                <w:b w:val="false"/>
+                <w:bCs w:val="false"/>
+                <w:sz w:val="18"/>
+                <w:szCs w:val="18"/>
+              </w:rPr>
+              <w:t xml:space="preserve">&lt;0.001</w:t>
+            </w:r>
+          </w:p>
+        </w:tc>
+      </w:tr>
+      <w:tr>
+        <w:tc>
+          <w:tcPr>
+            <w:tcW w:type="dxa" w:w="3120"/>
+            <w:tcBorders>
+              <w:top w:val="single" w:color="AAAAAA" w:sz="4"/>
+              <w:left w:val="single" w:color="AAAAAA" w:sz="4"/>
+              <w:bottom w:val="single" w:color="AAAAAA" w:sz="4"/>
+              <w:right w:val="single" w:color="AAAAAA" w:sz="4"/>
+            </w:tcBorders>
+            <w:tcMar>
+              <w:top w:type="dxa" w:w="60"/>
+              <w:left w:type="dxa" w:w="100"/>
+              <w:bottom w:type="dxa" w:w="60"/>
+              <w:right w:type="dxa" w:w="100"/>
+            </w:tcMar>
+            <w:vAlign w:val="center"/>
+          </w:tcPr>
+          <w:p>
+            <w:pPr>
+              <w:jc w:val="left"/>
+            </w:pPr>
+            <w:r>
+              <w:rPr>
+                <w:rFonts w:ascii="Times New Roman" w:cs="Times New Roman" w:eastAsia="Times New Roman" w:hAnsi="Times New Roman"/>
+                <w:b w:val="false"/>
+                <w:bCs w:val="false"/>
+                <w:sz w:val="18"/>
+                <w:szCs w:val="18"/>
+              </w:rPr>
+              <w:t xml:space="preserve">  Poorest</w:t>
+            </w:r>
+          </w:p>
+        </w:tc>
+        <w:tc>
+          <w:tcPr>
+            <w:tcW w:type="dxa" w:w="2040"/>
+            <w:tcBorders>
+              <w:top w:val="single" w:color="AAAAAA" w:sz="4"/>
+              <w:left w:val="single" w:color="AAAAAA" w:sz="4"/>
+              <w:bottom w:val="single" w:color="AAAAAA" w:sz="4"/>
+              <w:right w:val="single" w:color="AAAAAA" w:sz="4"/>
+            </w:tcBorders>
+            <w:tcMar>
+              <w:top w:type="dxa" w:w="60"/>
+              <w:left w:type="dxa" w:w="100"/>
+              <w:bottom w:type="dxa" w:w="60"/>
+              <w:right w:type="dxa" w:w="100"/>
+            </w:tcMar>
+            <w:vAlign w:val="center"/>
+          </w:tcPr>
+          <w:p>
+            <w:pPr>
+              <w:jc w:val="center"/>
+            </w:pPr>
+            <w:r>
+              <w:rPr>
+                <w:rFonts w:ascii="Times New Roman" w:cs="Times New Roman" w:eastAsia="Times New Roman" w:hAnsi="Times New Roman"/>
+                <w:b w:val="false"/>
+                <w:bCs w:val="false"/>
+                <w:sz w:val="18"/>
+                <w:szCs w:val="18"/>
+              </w:rPr>
+              <w:t xml:space="preserve">2,767 (21.2%)</w:t>
+            </w:r>
+          </w:p>
+        </w:tc>
+        <w:tc>
+          <w:tcPr>
+            <w:tcW w:type="dxa" w:w="2040"/>
+            <w:tcBorders>
+              <w:top w:val="single" w:color="AAAAAA" w:sz="4"/>
+              <w:left w:val="single" w:color="AAAAAA" w:sz="4"/>
+              <w:bottom w:val="single" w:color="AAAAAA" w:sz="4"/>
+              <w:right w:val="single" w:color="AAAAAA" w:sz="4"/>
+            </w:tcBorders>
+            <w:tcMar>
+              <w:top w:type="dxa" w:w="60"/>
+              <w:left w:type="dxa" w:w="100"/>
+              <w:bottom w:type="dxa" w:w="60"/>
+              <w:right w:type="dxa" w:w="100"/>
+            </w:tcMar>
+            <w:vAlign w:val="center"/>
+          </w:tcPr>
+          <w:p>
+            <w:pPr>
+              <w:jc w:val="center"/>
+            </w:pPr>
+            <w:r>
+              <w:rPr>
+                <w:rFonts w:ascii="Times New Roman" w:cs="Times New Roman" w:eastAsia="Times New Roman" w:hAnsi="Times New Roman"/>
+                <w:b w:val="false"/>
+                <w:bCs w:val="false"/>
+                <w:sz w:val="18"/>
+                <w:szCs w:val="18"/>
+              </w:rPr>
+              <w:t xml:space="preserve">1,527 (22.1%)</w:t>
+            </w:r>
+          </w:p>
+        </w:tc>
+        <w:tc>
+          <w:tcPr>
+            <w:tcW w:type="dxa" w:w="2160"/>
+            <w:tcBorders>
+              <w:top w:val="single" w:color="AAAAAA" w:sz="4"/>
+              <w:left w:val="single" w:color="AAAAAA" w:sz="4"/>
+              <w:bottom w:val="single" w:color="AAAAAA" w:sz="4"/>
+              <w:right w:val="single" w:color="AAAAAA" w:sz="4"/>
+            </w:tcBorders>
+            <w:tcMar>
+              <w:top w:type="dxa" w:w="60"/>
+              <w:left w:type="dxa" w:w="100"/>
+              <w:bottom w:type="dxa" w:w="60"/>
+              <w:right w:type="dxa" w:w="100"/>
+            </w:tcMar>
+            <w:vAlign w:val="center"/>
+          </w:tcPr>
+          <w:p>
+            <w:pPr>
+              <w:jc w:val="center"/>
+            </w:pPr>
+            <w:r>
+              <w:rPr>
+                <w:rFonts w:ascii="Times New Roman" w:cs="Times New Roman" w:eastAsia="Times New Roman" w:hAnsi="Times New Roman"/>
+                <w:b w:val="false"/>
+                <w:bCs w:val="false"/>
+                <w:sz w:val="18"/>
+                <w:szCs w:val="18"/>
+              </w:rPr>
+              <w:t xml:space="preserve"/>
+            </w:r>
+          </w:p>
+        </w:tc>
+      </w:tr>
+      <w:tr>
+        <w:tc>
+          <w:tcPr>
+            <w:tcW w:type="dxa" w:w="3120"/>
+            <w:tcBorders>
+              <w:top w:val="single" w:color="AAAAAA" w:sz="4"/>
+              <w:left w:val="single" w:color="AAAAAA" w:sz="4"/>
+              <w:bottom w:val="single" w:color="AAAAAA" w:sz="4"/>
+              <w:right w:val="single" w:color="AAAAAA" w:sz="4"/>
+            </w:tcBorders>
+            <w:tcMar>
+              <w:top w:type="dxa" w:w="60"/>
+              <w:left w:type="dxa" w:w="100"/>
+              <w:bottom w:type="dxa" w:w="60"/>
+              <w:right w:type="dxa" w:w="100"/>
+            </w:tcMar>
+            <w:vAlign w:val="center"/>
+          </w:tcPr>
+          <w:p>
+            <w:pPr>
+              <w:jc w:val="left"/>
+            </w:pPr>
+            <w:r>
+              <w:rPr>
+                <w:rFonts w:ascii="Times New Roman" w:cs="Times New Roman" w:eastAsia="Times New Roman" w:hAnsi="Times New Roman"/>
+                <w:b w:val="false"/>
+                <w:bCs w:val="false"/>
+                <w:sz w:val="18"/>
+                <w:szCs w:val="18"/>
+              </w:rPr>
+              <w:t xml:space="preserve">  Poorer</w:t>
+            </w:r>
+          </w:p>
+        </w:tc>
+        <w:tc>
+          <w:tcPr>
+            <w:tcW w:type="dxa" w:w="2040"/>
+            <w:tcBorders>
+              <w:top w:val="single" w:color="AAAAAA" w:sz="4"/>
+              <w:left w:val="single" w:color="AAAAAA" w:sz="4"/>
+              <w:bottom w:val="single" w:color="AAAAAA" w:sz="4"/>
+              <w:right w:val="single" w:color="AAAAAA" w:sz="4"/>
+            </w:tcBorders>
+            <w:tcMar>
+              <w:top w:type="dxa" w:w="60"/>
+              <w:left w:type="dxa" w:w="100"/>
+              <w:bottom w:type="dxa" w:w="60"/>
+              <w:right w:type="dxa" w:w="100"/>
+            </w:tcMar>
+            <w:vAlign w:val="center"/>
+          </w:tcPr>
+          <w:p>
+            <w:pPr>
+              <w:jc w:val="center"/>
+            </w:pPr>
+            <w:r>
+              <w:rPr>
+                <w:rFonts w:ascii="Times New Roman" w:cs="Times New Roman" w:eastAsia="Times New Roman" w:hAnsi="Times New Roman"/>
+                <w:b w:val="false"/>
+                <w:bCs w:val="false"/>
+                <w:sz w:val="18"/>
+                <w:szCs w:val="18"/>
+              </w:rPr>
+              <w:t xml:space="preserve">2,715 (20.8%)</w:t>
+            </w:r>
+          </w:p>
+        </w:tc>
+        <w:tc>
+          <w:tcPr>
+            <w:tcW w:type="dxa" w:w="2040"/>
+            <w:tcBorders>
+              <w:top w:val="single" w:color="AAAAAA" w:sz="4"/>
+              <w:left w:val="single" w:color="AAAAAA" w:sz="4"/>
+              <w:bottom w:val="single" w:color="AAAAAA" w:sz="4"/>
+              <w:right w:val="single" w:color="AAAAAA" w:sz="4"/>
+            </w:tcBorders>
+            <w:tcMar>
+              <w:top w:type="dxa" w:w="60"/>
+              <w:left w:type="dxa" w:w="100"/>
+              <w:bottom w:type="dxa" w:w="60"/>
+              <w:right w:type="dxa" w:w="100"/>
+            </w:tcMar>
+            <w:vAlign w:val="center"/>
+          </w:tcPr>
+          <w:p>
+            <w:pPr>
+              <w:jc w:val="center"/>
+            </w:pPr>
+            <w:r>
+              <w:rPr>
+                <w:rFonts w:ascii="Times New Roman" w:cs="Times New Roman" w:eastAsia="Times New Roman" w:hAnsi="Times New Roman"/>
+                <w:b w:val="false"/>
+                <w:bCs w:val="false"/>
+                <w:sz w:val="18"/>
+                <w:szCs w:val="18"/>
+              </w:rPr>
+              <w:t xml:space="preserve">1,208 (17.4%)</w:t>
+            </w:r>
+          </w:p>
+        </w:tc>
+        <w:tc>
+          <w:tcPr>
+            <w:tcW w:type="dxa" w:w="2160"/>
+            <w:tcBorders>
+              <w:top w:val="single" w:color="AAAAAA" w:sz="4"/>
+              <w:left w:val="single" w:color="AAAAAA" w:sz="4"/>
+              <w:bottom w:val="single" w:color="AAAAAA" w:sz="4"/>
+              <w:right w:val="single" w:color="AAAAAA" w:sz="4"/>
+            </w:tcBorders>
+            <w:tcMar>
+              <w:top w:type="dxa" w:w="60"/>
+              <w:left w:type="dxa" w:w="100"/>
+              <w:bottom w:type="dxa" w:w="60"/>
+              <w:right w:type="dxa" w:w="100"/>
+            </w:tcMar>
+            <w:vAlign w:val="center"/>
+          </w:tcPr>
+          <w:p>
+            <w:pPr>
+              <w:jc w:val="center"/>
+            </w:pPr>
+            <w:r>
+              <w:rPr>
+                <w:rFonts w:ascii="Times New Roman" w:cs="Times New Roman" w:eastAsia="Times New Roman" w:hAnsi="Times New Roman"/>
+                <w:b w:val="false"/>
+                <w:bCs w:val="false"/>
+                <w:sz w:val="18"/>
+                <w:szCs w:val="18"/>
+              </w:rPr>
+              <w:t xml:space="preserve"/>
+            </w:r>
+          </w:p>
+        </w:tc>
+      </w:tr>
+      <w:tr>
+        <w:tc>
+          <w:tcPr>
+            <w:tcW w:type="dxa" w:w="3120"/>
+            <w:tcBorders>
+              <w:top w:val="single" w:color="AAAAAA" w:sz="4"/>
+              <w:left w:val="single" w:color="AAAAAA" w:sz="4"/>
+              <w:bottom w:val="single" w:color="AAAAAA" w:sz="4"/>
+              <w:right w:val="single" w:color="AAAAAA" w:sz="4"/>
+            </w:tcBorders>
+            <w:tcMar>
+              <w:top w:type="dxa" w:w="60"/>
+              <w:left w:type="dxa" w:w="100"/>
+              <w:bottom w:type="dxa" w:w="60"/>
+              <w:right w:type="dxa" w:w="100"/>
+            </w:tcMar>
+            <w:vAlign w:val="center"/>
+          </w:tcPr>
+          <w:p>
+            <w:pPr>
+              <w:jc w:val="left"/>
+            </w:pPr>
+            <w:r>
+              <w:rPr>
+                <w:rFonts w:ascii="Times New Roman" w:cs="Times New Roman" w:eastAsia="Times New Roman" w:hAnsi="Times New Roman"/>
+                <w:b w:val="false"/>
+                <w:bCs w:val="false"/>
+                <w:sz w:val="18"/>
+                <w:szCs w:val="18"/>
+              </w:rPr>
+              <w:t xml:space="preserve">  Middle</w:t>
+            </w:r>
+          </w:p>
+        </w:tc>
+        <w:tc>
+          <w:tcPr>
+            <w:tcW w:type="dxa" w:w="2040"/>
+            <w:tcBorders>
+              <w:top w:val="single" w:color="AAAAAA" w:sz="4"/>
+              <w:left w:val="single" w:color="AAAAAA" w:sz="4"/>
+              <w:bottom w:val="single" w:color="AAAAAA" w:sz="4"/>
+              <w:right w:val="single" w:color="AAAAAA" w:sz="4"/>
+            </w:tcBorders>
+            <w:tcMar>
+              <w:top w:type="dxa" w:w="60"/>
+              <w:left w:type="dxa" w:w="100"/>
+              <w:bottom w:type="dxa" w:w="60"/>
+              <w:right w:type="dxa" w:w="100"/>
+            </w:tcMar>
+            <w:vAlign w:val="center"/>
+          </w:tcPr>
+          <w:p>
+            <w:pPr>
+              <w:jc w:val="center"/>
+            </w:pPr>
+            <w:r>
+              <w:rPr>
+                <w:rFonts w:ascii="Times New Roman" w:cs="Times New Roman" w:eastAsia="Times New Roman" w:hAnsi="Times New Roman"/>
+                <w:b w:val="false"/>
+                <w:bCs w:val="false"/>
+                <w:sz w:val="18"/>
+                <w:szCs w:val="18"/>
+              </w:rPr>
+              <w:t xml:space="preserve">2,511 (19.3%)</w:t>
+            </w:r>
+          </w:p>
+        </w:tc>
+        <w:tc>
+          <w:tcPr>
+            <w:tcW w:type="dxa" w:w="2040"/>
+            <w:tcBorders>
+              <w:top w:val="single" w:color="AAAAAA" w:sz="4"/>
+              <w:left w:val="single" w:color="AAAAAA" w:sz="4"/>
+              <w:bottom w:val="single" w:color="AAAAAA" w:sz="4"/>
+              <w:right w:val="single" w:color="AAAAAA" w:sz="4"/>
+            </w:tcBorders>
+            <w:tcMar>
+              <w:top w:type="dxa" w:w="60"/>
+              <w:left w:type="dxa" w:w="100"/>
+              <w:bottom w:type="dxa" w:w="60"/>
+              <w:right w:type="dxa" w:w="100"/>
+            </w:tcMar>
+            <w:vAlign w:val="center"/>
+          </w:tcPr>
+          <w:p>
+            <w:pPr>
+              <w:jc w:val="center"/>
+            </w:pPr>
+            <w:r>
+              <w:rPr>
+                <w:rFonts w:ascii="Times New Roman" w:cs="Times New Roman" w:eastAsia="Times New Roman" w:hAnsi="Times New Roman"/>
+                <w:b w:val="false"/>
+                <w:bCs w:val="false"/>
+                <w:sz w:val="18"/>
+                <w:szCs w:val="18"/>
+              </w:rPr>
+              <w:t xml:space="preserve">1,196 (17.3%)</w:t>
+            </w:r>
+          </w:p>
+        </w:tc>
+        <w:tc>
+          <w:tcPr>
+            <w:tcW w:type="dxa" w:w="2160"/>
+            <w:tcBorders>
+              <w:top w:val="single" w:color="AAAAAA" w:sz="4"/>
+              <w:left w:val="single" w:color="AAAAAA" w:sz="4"/>
+              <w:bottom w:val="single" w:color="AAAAAA" w:sz="4"/>
+              <w:right w:val="single" w:color="AAAAAA" w:sz="4"/>
+            </w:tcBorders>
+            <w:tcMar>
+              <w:top w:type="dxa" w:w="60"/>
+              <w:left w:type="dxa" w:w="100"/>
+              <w:bottom w:type="dxa" w:w="60"/>
+              <w:right w:type="dxa" w:w="100"/>
+            </w:tcMar>
+            <w:vAlign w:val="center"/>
+          </w:tcPr>
+          <w:p>
+            <w:pPr>
+              <w:jc w:val="center"/>
+            </w:pPr>
+            <w:r>
+              <w:rPr>
+                <w:rFonts w:ascii="Times New Roman" w:cs="Times New Roman" w:eastAsia="Times New Roman" w:hAnsi="Times New Roman"/>
+                <w:b w:val="false"/>
+                <w:bCs w:val="false"/>
+                <w:sz w:val="18"/>
+                <w:szCs w:val="18"/>
+              </w:rPr>
+              <w:t xml:space="preserve"/>
+            </w:r>
+          </w:p>
+        </w:tc>
+      </w:tr>
+      <w:tr>
+        <w:tc>
+          <w:tcPr>
+            <w:tcW w:type="dxa" w:w="3120"/>
+            <w:tcBorders>
+              <w:top w:val="single" w:color="AAAAAA" w:sz="4"/>
+              <w:left w:val="single" w:color="AAAAAA" w:sz="4"/>
+              <w:bottom w:val="single" w:color="AAAAAA" w:sz="4"/>
+              <w:right w:val="single" w:color="AAAAAA" w:sz="4"/>
+            </w:tcBorders>
+            <w:tcMar>
+              <w:top w:type="dxa" w:w="60"/>
+              <w:left w:type="dxa" w:w="100"/>
+              <w:bottom w:type="dxa" w:w="60"/>
+              <w:right w:type="dxa" w:w="100"/>
+            </w:tcMar>
+            <w:vAlign w:val="center"/>
+          </w:tcPr>
+          <w:p>
+            <w:pPr>
+              <w:jc w:val="left"/>
+            </w:pPr>
+            <w:r>
+              <w:rPr>
+                <w:rFonts w:ascii="Times New Roman" w:cs="Times New Roman" w:eastAsia="Times New Roman" w:hAnsi="Times New Roman"/>
+                <w:b w:val="false"/>
+                <w:bCs w:val="false"/>
+                <w:sz w:val="18"/>
+                <w:szCs w:val="18"/>
+              </w:rPr>
+              <w:t xml:space="preserve">  Richer</w:t>
+            </w:r>
+          </w:p>
+        </w:tc>
+        <w:tc>
+          <w:tcPr>
+            <w:tcW w:type="dxa" w:w="2040"/>
+            <w:tcBorders>
+              <w:top w:val="single" w:color="AAAAAA" w:sz="4"/>
+              <w:left w:val="single" w:color="AAAAAA" w:sz="4"/>
+              <w:bottom w:val="single" w:color="AAAAAA" w:sz="4"/>
+              <w:right w:val="single" w:color="AAAAAA" w:sz="4"/>
+            </w:tcBorders>
+            <w:tcMar>
+              <w:top w:type="dxa" w:w="60"/>
+              <w:left w:type="dxa" w:w="100"/>
+              <w:bottom w:type="dxa" w:w="60"/>
+              <w:right w:type="dxa" w:w="100"/>
+            </w:tcMar>
+            <w:vAlign w:val="center"/>
+          </w:tcPr>
+          <w:p>
+            <w:pPr>
+              <w:jc w:val="center"/>
+            </w:pPr>
+            <w:r>
+              <w:rPr>
+                <w:rFonts w:ascii="Times New Roman" w:cs="Times New Roman" w:eastAsia="Times New Roman" w:hAnsi="Times New Roman"/>
+                <w:b w:val="false"/>
+                <w:bCs w:val="false"/>
+                <w:sz w:val="18"/>
+                <w:szCs w:val="18"/>
+              </w:rPr>
+              <w:t xml:space="preserve">2,510 (19.3%)</w:t>
+            </w:r>
+          </w:p>
+        </w:tc>
+        <w:tc>
+          <w:tcPr>
+            <w:tcW w:type="dxa" w:w="2040"/>
+            <w:tcBorders>
+              <w:top w:val="single" w:color="AAAAAA" w:sz="4"/>
+              <w:left w:val="single" w:color="AAAAAA" w:sz="4"/>
+              <w:bottom w:val="single" w:color="AAAAAA" w:sz="4"/>
+              <w:right w:val="single" w:color="AAAAAA" w:sz="4"/>
+            </w:tcBorders>
+            <w:tcMar>
+              <w:top w:type="dxa" w:w="60"/>
+              <w:left w:type="dxa" w:w="100"/>
+              <w:bottom w:type="dxa" w:w="60"/>
+              <w:right w:type="dxa" w:w="100"/>
+            </w:tcMar>
+            <w:vAlign w:val="center"/>
+          </w:tcPr>
+          <w:p>
+            <w:pPr>
+              <w:jc w:val="center"/>
+            </w:pPr>
+            <w:r>
+              <w:rPr>
+                <w:rFonts w:ascii="Times New Roman" w:cs="Times New Roman" w:eastAsia="Times New Roman" w:hAnsi="Times New Roman"/>
+                <w:b w:val="false"/>
+                <w:bCs w:val="false"/>
+                <w:sz w:val="18"/>
+                <w:szCs w:val="18"/>
+              </w:rPr>
+              <w:t xml:space="preserve">1,289 (18.6%)</w:t>
+            </w:r>
+          </w:p>
+        </w:tc>
+        <w:tc>
+          <w:tcPr>
+            <w:tcW w:type="dxa" w:w="2160"/>
+            <w:tcBorders>
+              <w:top w:val="single" w:color="AAAAAA" w:sz="4"/>
+              <w:left w:val="single" w:color="AAAAAA" w:sz="4"/>
+              <w:bottom w:val="single" w:color="AAAAAA" w:sz="4"/>
+              <w:right w:val="single" w:color="AAAAAA" w:sz="4"/>
+            </w:tcBorders>
+            <w:tcMar>
+              <w:top w:type="dxa" w:w="60"/>
+              <w:left w:type="dxa" w:w="100"/>
+              <w:bottom w:type="dxa" w:w="60"/>
+              <w:right w:type="dxa" w:w="100"/>
+            </w:tcMar>
+            <w:vAlign w:val="center"/>
+          </w:tcPr>
+          <w:p>
+            <w:pPr>
+              <w:jc w:val="center"/>
+            </w:pPr>
+            <w:r>
+              <w:rPr>
+                <w:rFonts w:ascii="Times New Roman" w:cs="Times New Roman" w:eastAsia="Times New Roman" w:hAnsi="Times New Roman"/>
+                <w:b w:val="false"/>
+                <w:bCs w:val="false"/>
+                <w:sz w:val="18"/>
+                <w:szCs w:val="18"/>
+              </w:rPr>
+              <w:t xml:space="preserve"/>
+            </w:r>
+          </w:p>
+        </w:tc>
+      </w:tr>
+      <w:tr>
+        <w:tc>
+          <w:tcPr>
+            <w:tcW w:type="dxa" w:w="3120"/>
+            <w:tcBorders>
+              <w:top w:val="single" w:color="AAAAAA" w:sz="4"/>
+              <w:left w:val="single" w:color="AAAAAA" w:sz="4"/>
+              <w:bottom w:val="single" w:color="AAAAAA" w:sz="4"/>
+              <w:right w:val="single" w:color="AAAAAA" w:sz="4"/>
+            </w:tcBorders>
+            <w:tcMar>
+              <w:top w:type="dxa" w:w="60"/>
+              <w:left w:type="dxa" w:w="100"/>
+              <w:bottom w:type="dxa" w:w="60"/>
+              <w:right w:type="dxa" w:w="100"/>
+            </w:tcMar>
+            <w:vAlign w:val="center"/>
+          </w:tcPr>
+          <w:p>
+            <w:pPr>
+              <w:jc w:val="left"/>
+            </w:pPr>
+            <w:r>
+              <w:rPr>
+                <w:rFonts w:ascii="Times New Roman" w:cs="Times New Roman" w:eastAsia="Times New Roman" w:hAnsi="Times New Roman"/>
+                <w:b w:val="false"/>
+                <w:bCs w:val="false"/>
+                <w:sz w:val="18"/>
+                <w:szCs w:val="18"/>
+              </w:rPr>
+              <w:t xml:space="preserve">  Richest</w:t>
+            </w:r>
+          </w:p>
+        </w:tc>
+        <w:tc>
+          <w:tcPr>
+            <w:tcW w:type="dxa" w:w="2040"/>
+            <w:tcBorders>
+              <w:top w:val="single" w:color="AAAAAA" w:sz="4"/>
+              <w:left w:val="single" w:color="AAAAAA" w:sz="4"/>
+              <w:bottom w:val="single" w:color="AAAAAA" w:sz="4"/>
+              <w:right w:val="single" w:color="AAAAAA" w:sz="4"/>
+            </w:tcBorders>
+            <w:tcMar>
+              <w:top w:type="dxa" w:w="60"/>
+              <w:left w:type="dxa" w:w="100"/>
+              <w:bottom w:type="dxa" w:w="60"/>
+              <w:right w:type="dxa" w:w="100"/>
+            </w:tcMar>
+            <w:vAlign w:val="center"/>
+          </w:tcPr>
+          <w:p>
+            <w:pPr>
+              <w:jc w:val="center"/>
+            </w:pPr>
+            <w:r>
+              <w:rPr>
+                <w:rFonts w:ascii="Times New Roman" w:cs="Times New Roman" w:eastAsia="Times New Roman" w:hAnsi="Times New Roman"/>
+                <w:b w:val="false"/>
+                <w:bCs w:val="false"/>
+                <w:sz w:val="18"/>
+                <w:szCs w:val="18"/>
+              </w:rPr>
+              <w:t xml:space="preserve">2,527 (19.4%)</w:t>
+            </w:r>
+          </w:p>
+        </w:tc>
+        <w:tc>
+          <w:tcPr>
+            <w:tcW w:type="dxa" w:w="2040"/>
+            <w:tcBorders>
+              <w:top w:val="single" w:color="AAAAAA" w:sz="4"/>
+              <w:left w:val="single" w:color="AAAAAA" w:sz="4"/>
+              <w:bottom w:val="single" w:color="AAAAAA" w:sz="4"/>
+              <w:right w:val="single" w:color="AAAAAA" w:sz="4"/>
+            </w:tcBorders>
+            <w:tcMar>
+              <w:top w:type="dxa" w:w="60"/>
+              <w:left w:type="dxa" w:w="100"/>
+              <w:bottom w:type="dxa" w:w="60"/>
+              <w:right w:type="dxa" w:w="100"/>
+            </w:tcMar>
+            <w:vAlign w:val="center"/>
+          </w:tcPr>
+          <w:p>
+            <w:pPr>
+              <w:jc w:val="center"/>
+            </w:pPr>
+            <w:r>
+              <w:rPr>
+                <w:rFonts w:ascii="Times New Roman" w:cs="Times New Roman" w:eastAsia="Times New Roman" w:hAnsi="Times New Roman"/>
+                <w:b w:val="false"/>
+                <w:bCs w:val="false"/>
+                <w:sz w:val="18"/>
+                <w:szCs w:val="18"/>
+              </w:rPr>
+              <w:t xml:space="preserve">1,448 (20.9%)</w:t>
+            </w:r>
+          </w:p>
+        </w:tc>
+        <w:tc>
+          <w:tcPr>
+            <w:tcW w:type="dxa" w:w="2160"/>
+            <w:tcBorders>
+              <w:top w:val="single" w:color="AAAAAA" w:sz="4"/>
+              <w:left w:val="single" w:color="AAAAAA" w:sz="4"/>
+              <w:bottom w:val="single" w:color="AAAAAA" w:sz="4"/>
+              <w:right w:val="single" w:color="AAAAAA" w:sz="4"/>
+            </w:tcBorders>
+            <w:tcMar>
+              <w:top w:type="dxa" w:w="60"/>
+              <w:left w:type="dxa" w:w="100"/>
+              <w:bottom w:type="dxa" w:w="60"/>
+              <w:right w:type="dxa" w:w="100"/>
+            </w:tcMar>
+            <w:vAlign w:val="center"/>
+          </w:tcPr>
+          <w:p>
+            <w:pPr>
+              <w:jc w:val="center"/>
+            </w:pPr>
+            <w:r>
+              <w:rPr>
+                <w:rFonts w:ascii="Times New Roman" w:cs="Times New Roman" w:eastAsia="Times New Roman" w:hAnsi="Times New Roman"/>
+                <w:b w:val="false"/>
+                <w:bCs w:val="false"/>
+                <w:sz w:val="18"/>
+                <w:szCs w:val="18"/>
+              </w:rPr>
+              <w:t xml:space="preserve"/>
+            </w:r>
+          </w:p>
+        </w:tc>
+      </w:tr>
+      <w:tr>
+        <w:tc>
+          <w:tcPr>
+            <w:tcW w:type="dxa" w:w="3120"/>
+            <w:tcBorders>
+              <w:top w:val="single" w:color="AAAAAA" w:sz="4"/>
+              <w:left w:val="single" w:color="AAAAAA" w:sz="4"/>
+              <w:bottom w:val="single" w:color="AAAAAA" w:sz="4"/>
+              <w:right w:val="single" w:color="AAAAAA" w:sz="4"/>
+            </w:tcBorders>
+            <w:shd w:fill="E0EAF6" w:val="clear"/>
+            <w:tcMar>
+              <w:top w:type="dxa" w:w="60"/>
+              <w:left w:type="dxa" w:w="100"/>
+              <w:bottom w:type="dxa" w:w="60"/>
+              <w:right w:type="dxa" w:w="100"/>
+            </w:tcMar>
+            <w:vAlign w:val="center"/>
+          </w:tcPr>
+          <w:p>
+            <w:pPr>
+              <w:jc w:val="left"/>
+            </w:pPr>
+            <w:r>
+              <w:rPr>
+                <w:rFonts w:ascii="Times New Roman" w:cs="Times New Roman" w:eastAsia="Times New Roman" w:hAnsi="Times New Roman"/>
+                <w:b/>
+                <w:bCs/>
+                <w:sz w:val="18"/>
+                <w:szCs w:val="18"/>
+              </w:rPr>
+              <w:t xml:space="preserve">Education level, n (%)</w:t>
+            </w:r>
+          </w:p>
+        </w:tc>
+        <w:tc>
+          <w:tcPr>
+            <w:tcW w:type="dxa" w:w="2040"/>
+            <w:tcBorders>
+              <w:top w:val="single" w:color="AAAAAA" w:sz="4"/>
+              <w:left w:val="single" w:color="AAAAAA" w:sz="4"/>
+              <w:bottom w:val="single" w:color="AAAAAA" w:sz="4"/>
+              <w:right w:val="single" w:color="AAAAAA" w:sz="4"/>
+            </w:tcBorders>
+            <w:shd w:fill="E0EAF6" w:val="clear"/>
+            <w:tcMar>
+              <w:top w:type="dxa" w:w="60"/>
+              <w:left w:type="dxa" w:w="100"/>
+              <w:bottom w:type="dxa" w:w="60"/>
+              <w:right w:type="dxa" w:w="100"/>
+            </w:tcMar>
+            <w:vAlign w:val="center"/>
+          </w:tcPr>
+          <w:p>
+            <w:pPr>
+              <w:jc w:val="center"/>
+            </w:pPr>
+            <w:r>
+              <w:rPr>
+                <w:rFonts w:ascii="Times New Roman" w:cs="Times New Roman" w:eastAsia="Times New Roman" w:hAnsi="Times New Roman"/>
+                <w:b w:val="false"/>
+                <w:bCs w:val="false"/>
+                <w:sz w:val="18"/>
+                <w:szCs w:val="18"/>
+              </w:rPr>
+              <w:t xml:space="preserve"/>
+            </w:r>
+          </w:p>
+        </w:tc>
+        <w:tc>
+          <w:tcPr>
+            <w:tcW w:type="dxa" w:w="2040"/>
+            <w:tcBorders>
+              <w:top w:val="single" w:color="AAAAAA" w:sz="4"/>
+              <w:left w:val="single" w:color="AAAAAA" w:sz="4"/>
+              <w:bottom w:val="single" w:color="AAAAAA" w:sz="4"/>
+              <w:right w:val="single" w:color="AAAAAA" w:sz="4"/>
+            </w:tcBorders>
+            <w:shd w:fill="E0EAF6" w:val="clear"/>
+            <w:tcMar>
+              <w:top w:type="dxa" w:w="60"/>
+              <w:left w:type="dxa" w:w="100"/>
+              <w:bottom w:type="dxa" w:w="60"/>
+              <w:right w:type="dxa" w:w="100"/>
+            </w:tcMar>
+            <w:vAlign w:val="center"/>
+          </w:tcPr>
+          <w:p>
+            <w:pPr>
+              <w:jc w:val="center"/>
+            </w:pPr>
+            <w:r>
+              <w:rPr>
+                <w:rFonts w:ascii="Times New Roman" w:cs="Times New Roman" w:eastAsia="Times New Roman" w:hAnsi="Times New Roman"/>
+                <w:b w:val="false"/>
+                <w:bCs w:val="false"/>
+                <w:sz w:val="18"/>
+                <w:szCs w:val="18"/>
+              </w:rPr>
+              <w:t xml:space="preserve"/>
+            </w:r>
+          </w:p>
+        </w:tc>
+        <w:tc>
+          <w:tcPr>
+            <w:tcW w:type="dxa" w:w="2160"/>
+            <w:tcBorders>
+              <w:top w:val="single" w:color="AAAAAA" w:sz="4"/>
+              <w:left w:val="single" w:color="AAAAAA" w:sz="4"/>
+              <w:bottom w:val="single" w:color="AAAAAA" w:sz="4"/>
+              <w:right w:val="single" w:color="AAAAAA" w:sz="4"/>
+            </w:tcBorders>
+            <w:shd w:fill="E0EAF6" w:val="clear"/>
+            <w:tcMar>
+              <w:top w:type="dxa" w:w="60"/>
+              <w:left w:type="dxa" w:w="100"/>
+              <w:bottom w:type="dxa" w:w="60"/>
+              <w:right w:type="dxa" w:w="100"/>
+            </w:tcMar>
+            <w:vAlign w:val="center"/>
+          </w:tcPr>
+          <w:p>
+            <w:pPr>
+              <w:jc w:val="center"/>
+            </w:pPr>
+            <w:r>
+              <w:rPr>
+                <w:rFonts w:ascii="Times New Roman" w:cs="Times New Roman" w:eastAsia="Times New Roman" w:hAnsi="Times New Roman"/>
+                <w:b w:val="false"/>
+                <w:bCs w:val="false"/>
+                <w:sz w:val="18"/>
+                <w:szCs w:val="18"/>
+              </w:rPr>
+              <w:t xml:space="preserve">&lt;0.001</w:t>
+            </w:r>
+          </w:p>
+        </w:tc>
+      </w:tr>
+      <w:tr>
+        <w:tc>
+          <w:tcPr>
+            <w:tcW w:type="dxa" w:w="3120"/>
+            <w:tcBorders>
+              <w:top w:val="single" w:color="AAAAAA" w:sz="4"/>
+              <w:left w:val="single" w:color="AAAAAA" w:sz="4"/>
+              <w:bottom w:val="single" w:color="AAAAAA" w:sz="4"/>
+              <w:right w:val="single" w:color="AAAAAA" w:sz="4"/>
+            </w:tcBorders>
+            <w:tcMar>
+              <w:top w:type="dxa" w:w="60"/>
+              <w:left w:type="dxa" w:w="100"/>
+              <w:bottom w:type="dxa" w:w="60"/>
+              <w:right w:type="dxa" w:w="100"/>
+            </w:tcMar>
+            <w:vAlign w:val="center"/>
+          </w:tcPr>
+          <w:p>
+            <w:pPr>
+              <w:jc w:val="left"/>
+            </w:pPr>
+            <w:r>
+              <w:rPr>
+                <w:rFonts w:ascii="Times New Roman" w:cs="Times New Roman" w:eastAsia="Times New Roman" w:hAnsi="Times New Roman"/>
+                <w:b w:val="false"/>
+                <w:bCs w:val="false"/>
+                <w:sz w:val="18"/>
+                <w:szCs w:val="18"/>
+              </w:rPr>
+              <w:t xml:space="preserve">  No education</w:t>
+            </w:r>
+          </w:p>
+        </w:tc>
+        <w:tc>
+          <w:tcPr>
+            <w:tcW w:type="dxa" w:w="2040"/>
+            <w:tcBorders>
+              <w:top w:val="single" w:color="AAAAAA" w:sz="4"/>
+              <w:left w:val="single" w:color="AAAAAA" w:sz="4"/>
+              <w:bottom w:val="single" w:color="AAAAAA" w:sz="4"/>
+              <w:right w:val="single" w:color="AAAAAA" w:sz="4"/>
+            </w:tcBorders>
+            <w:tcMar>
+              <w:top w:type="dxa" w:w="60"/>
+              <w:left w:type="dxa" w:w="100"/>
+              <w:bottom w:type="dxa" w:w="60"/>
+              <w:right w:type="dxa" w:w="100"/>
+            </w:tcMar>
+            <w:vAlign w:val="center"/>
+          </w:tcPr>
+          <w:p>
+            <w:pPr>
+              <w:jc w:val="center"/>
+            </w:pPr>
+            <w:r>
+              <w:rPr>
+                <w:rFonts w:ascii="Times New Roman" w:cs="Times New Roman" w:eastAsia="Times New Roman" w:hAnsi="Times New Roman"/>
+                <w:b w:val="false"/>
+                <w:bCs w:val="false"/>
+                <w:sz w:val="18"/>
+                <w:szCs w:val="18"/>
+              </w:rPr>
+              <w:t xml:space="preserve">1,516 (11.6%)</w:t>
+            </w:r>
+          </w:p>
+        </w:tc>
+        <w:tc>
+          <w:tcPr>
+            <w:tcW w:type="dxa" w:w="2040"/>
+            <w:tcBorders>
+              <w:top w:val="single" w:color="AAAAAA" w:sz="4"/>
+              <w:left w:val="single" w:color="AAAAAA" w:sz="4"/>
+              <w:bottom w:val="single" w:color="AAAAAA" w:sz="4"/>
+              <w:right w:val="single" w:color="AAAAAA" w:sz="4"/>
+            </w:tcBorders>
+            <w:tcMar>
+              <w:top w:type="dxa" w:w="60"/>
+              <w:left w:type="dxa" w:w="100"/>
+              <w:bottom w:type="dxa" w:w="60"/>
+              <w:right w:type="dxa" w:w="100"/>
+            </w:tcMar>
+            <w:vAlign w:val="center"/>
+          </w:tcPr>
+          <w:p>
+            <w:pPr>
+              <w:jc w:val="center"/>
+            </w:pPr>
+            <w:r>
+              <w:rPr>
+                <w:rFonts w:ascii="Times New Roman" w:cs="Times New Roman" w:eastAsia="Times New Roman" w:hAnsi="Times New Roman"/>
+                <w:b w:val="false"/>
+                <w:bCs w:val="false"/>
+                <w:sz w:val="18"/>
+                <w:szCs w:val="18"/>
+              </w:rPr>
+              <w:t xml:space="preserve">427 (6.2%)</w:t>
+            </w:r>
+          </w:p>
+        </w:tc>
+        <w:tc>
+          <w:tcPr>
+            <w:tcW w:type="dxa" w:w="2160"/>
+            <w:tcBorders>
+              <w:top w:val="single" w:color="AAAAAA" w:sz="4"/>
+              <w:left w:val="single" w:color="AAAAAA" w:sz="4"/>
+              <w:bottom w:val="single" w:color="AAAAAA" w:sz="4"/>
+              <w:right w:val="single" w:color="AAAAAA" w:sz="4"/>
+            </w:tcBorders>
+            <w:tcMar>
+              <w:top w:type="dxa" w:w="60"/>
+              <w:left w:type="dxa" w:w="100"/>
+              <w:bottom w:type="dxa" w:w="60"/>
+              <w:right w:type="dxa" w:w="100"/>
+            </w:tcMar>
+            <w:vAlign w:val="center"/>
+          </w:tcPr>
+          <w:p>
+            <w:pPr>
+              <w:jc w:val="center"/>
+            </w:pPr>
+            <w:r>
+              <w:rPr>
+                <w:rFonts w:ascii="Times New Roman" w:cs="Times New Roman" w:eastAsia="Times New Roman" w:hAnsi="Times New Roman"/>
+                <w:b w:val="false"/>
+                <w:bCs w:val="false"/>
+                <w:sz w:val="18"/>
+                <w:szCs w:val="18"/>
+              </w:rPr>
+              <w:t xml:space="preserve"/>
+            </w:r>
+          </w:p>
+        </w:tc>
+      </w:tr>
+      <w:tr>
+        <w:tc>
+          <w:tcPr>
+            <w:tcW w:type="dxa" w:w="3120"/>
+            <w:tcBorders>
+              <w:top w:val="single" w:color="AAAAAA" w:sz="4"/>
+              <w:left w:val="single" w:color="AAAAAA" w:sz="4"/>
+              <w:bottom w:val="single" w:color="AAAAAA" w:sz="4"/>
+              <w:right w:val="single" w:color="AAAAAA" w:sz="4"/>
+            </w:tcBorders>
+            <w:tcMar>
+              <w:top w:type="dxa" w:w="60"/>
+              <w:left w:type="dxa" w:w="100"/>
+              <w:bottom w:type="dxa" w:w="60"/>
+              <w:right w:type="dxa" w:w="100"/>
+            </w:tcMar>
+            <w:vAlign w:val="center"/>
+          </w:tcPr>
+          <w:p>
+            <w:pPr>
+              <w:jc w:val="left"/>
+            </w:pPr>
+            <w:r>
+              <w:rPr>
+                <w:rFonts w:ascii="Times New Roman" w:cs="Times New Roman" w:eastAsia="Times New Roman" w:hAnsi="Times New Roman"/>
+                <w:b w:val="false"/>
+                <w:bCs w:val="false"/>
+                <w:sz w:val="18"/>
+                <w:szCs w:val="18"/>
+              </w:rPr>
+              <w:t xml:space="preserve">  Primary</w:t>
+            </w:r>
+          </w:p>
+        </w:tc>
+        <w:tc>
+          <w:tcPr>
+            <w:tcW w:type="dxa" w:w="2040"/>
+            <w:tcBorders>
+              <w:top w:val="single" w:color="AAAAAA" w:sz="4"/>
+              <w:left w:val="single" w:color="AAAAAA" w:sz="4"/>
+              <w:bottom w:val="single" w:color="AAAAAA" w:sz="4"/>
+              <w:right w:val="single" w:color="AAAAAA" w:sz="4"/>
+            </w:tcBorders>
+            <w:tcMar>
+              <w:top w:type="dxa" w:w="60"/>
+              <w:left w:type="dxa" w:w="100"/>
+              <w:bottom w:type="dxa" w:w="60"/>
+              <w:right w:type="dxa" w:w="100"/>
+            </w:tcMar>
+            <w:vAlign w:val="center"/>
+          </w:tcPr>
+          <w:p>
+            <w:pPr>
+              <w:jc w:val="center"/>
+            </w:pPr>
+            <w:r>
+              <w:rPr>
+                <w:rFonts w:ascii="Times New Roman" w:cs="Times New Roman" w:eastAsia="Times New Roman" w:hAnsi="Times New Roman"/>
+                <w:b w:val="false"/>
+                <w:bCs w:val="false"/>
+                <w:sz w:val="18"/>
+                <w:szCs w:val="18"/>
+              </w:rPr>
+              <w:t xml:space="preserve">8,484 (65.1%)</w:t>
+            </w:r>
+          </w:p>
+        </w:tc>
+        <w:tc>
+          <w:tcPr>
+            <w:tcW w:type="dxa" w:w="2040"/>
+            <w:tcBorders>
+              <w:top w:val="single" w:color="AAAAAA" w:sz="4"/>
+              <w:left w:val="single" w:color="AAAAAA" w:sz="4"/>
+              <w:bottom w:val="single" w:color="AAAAAA" w:sz="4"/>
+              <w:right w:val="single" w:color="AAAAAA" w:sz="4"/>
+            </w:tcBorders>
+            <w:tcMar>
+              <w:top w:type="dxa" w:w="60"/>
+              <w:left w:type="dxa" w:w="100"/>
+              <w:bottom w:type="dxa" w:w="60"/>
+              <w:right w:type="dxa" w:w="100"/>
+            </w:tcMar>
+            <w:vAlign w:val="center"/>
+          </w:tcPr>
+          <w:p>
+            <w:pPr>
+              <w:jc w:val="center"/>
+            </w:pPr>
+            <w:r>
+              <w:rPr>
+                <w:rFonts w:ascii="Times New Roman" w:cs="Times New Roman" w:eastAsia="Times New Roman" w:hAnsi="Times New Roman"/>
+                <w:b w:val="false"/>
+                <w:bCs w:val="false"/>
+                <w:sz w:val="18"/>
+                <w:szCs w:val="18"/>
+              </w:rPr>
+              <w:t xml:space="preserve">4,522 (65.3%)</w:t>
+            </w:r>
+          </w:p>
+        </w:tc>
+        <w:tc>
+          <w:tcPr>
+            <w:tcW w:type="dxa" w:w="2160"/>
+            <w:tcBorders>
+              <w:top w:val="single" w:color="AAAAAA" w:sz="4"/>
+              <w:left w:val="single" w:color="AAAAAA" w:sz="4"/>
+              <w:bottom w:val="single" w:color="AAAAAA" w:sz="4"/>
+              <w:right w:val="single" w:color="AAAAAA" w:sz="4"/>
+            </w:tcBorders>
+            <w:tcMar>
+              <w:top w:type="dxa" w:w="60"/>
+              <w:left w:type="dxa" w:w="100"/>
+              <w:bottom w:type="dxa" w:w="60"/>
+              <w:right w:type="dxa" w:w="100"/>
+            </w:tcMar>
+            <w:vAlign w:val="center"/>
+          </w:tcPr>
+          <w:p>
+            <w:pPr>
+              <w:jc w:val="center"/>
+            </w:pPr>
+            <w:r>
+              <w:rPr>
+                <w:rFonts w:ascii="Times New Roman" w:cs="Times New Roman" w:eastAsia="Times New Roman" w:hAnsi="Times New Roman"/>
+                <w:b w:val="false"/>
+                <w:bCs w:val="false"/>
+                <w:sz w:val="18"/>
+                <w:szCs w:val="18"/>
+              </w:rPr>
+              <w:t xml:space="preserve"/>
+            </w:r>
+          </w:p>
+        </w:tc>
+      </w:tr>
+      <w:tr>
+        <w:tc>
+          <w:tcPr>
+            <w:tcW w:type="dxa" w:w="3120"/>
+            <w:tcBorders>
+              <w:top w:val="single" w:color="AAAAAA" w:sz="4"/>
+              <w:left w:val="single" w:color="AAAAAA" w:sz="4"/>
+              <w:bottom w:val="single" w:color="AAAAAA" w:sz="4"/>
+              <w:right w:val="single" w:color="AAAAAA" w:sz="4"/>
+            </w:tcBorders>
+            <w:tcMar>
+              <w:top w:type="dxa" w:w="60"/>
+              <w:left w:type="dxa" w:w="100"/>
+              <w:bottom w:type="dxa" w:w="60"/>
+              <w:right w:type="dxa" w:w="100"/>
+            </w:tcMar>
+            <w:vAlign w:val="center"/>
+          </w:tcPr>
+          <w:p>
+            <w:pPr>
+              <w:jc w:val="left"/>
+            </w:pPr>
+            <w:r>
+              <w:rPr>
+                <w:rFonts w:ascii="Times New Roman" w:cs="Times New Roman" w:eastAsia="Times New Roman" w:hAnsi="Times New Roman"/>
+                <w:b w:val="false"/>
+                <w:bCs w:val="false"/>
+                <w:sz w:val="18"/>
+                <w:szCs w:val="18"/>
+              </w:rPr>
+              <w:t xml:space="preserve">  Secondary</w:t>
+            </w:r>
+          </w:p>
+        </w:tc>
+        <w:tc>
+          <w:tcPr>
+            <w:tcW w:type="dxa" w:w="2040"/>
+            <w:tcBorders>
+              <w:top w:val="single" w:color="AAAAAA" w:sz="4"/>
+              <w:left w:val="single" w:color="AAAAAA" w:sz="4"/>
+              <w:bottom w:val="single" w:color="AAAAAA" w:sz="4"/>
+              <w:right w:val="single" w:color="AAAAAA" w:sz="4"/>
+            </w:tcBorders>
+            <w:tcMar>
+              <w:top w:type="dxa" w:w="60"/>
+              <w:left w:type="dxa" w:w="100"/>
+              <w:bottom w:type="dxa" w:w="60"/>
+              <w:right w:type="dxa" w:w="100"/>
+            </w:tcMar>
+            <w:vAlign w:val="center"/>
+          </w:tcPr>
+          <w:p>
+            <w:pPr>
+              <w:jc w:val="center"/>
+            </w:pPr>
+            <w:r>
+              <w:rPr>
+                <w:rFonts w:ascii="Times New Roman" w:cs="Times New Roman" w:eastAsia="Times New Roman" w:hAnsi="Times New Roman"/>
+                <w:b w:val="false"/>
+                <w:bCs w:val="false"/>
+                <w:sz w:val="18"/>
+                <w:szCs w:val="18"/>
+              </w:rPr>
+              <w:t xml:space="preserve">2,786 (21.4%)</w:t>
+            </w:r>
+          </w:p>
+        </w:tc>
+        <w:tc>
+          <w:tcPr>
+            <w:tcW w:type="dxa" w:w="2040"/>
+            <w:tcBorders>
+              <w:top w:val="single" w:color="AAAAAA" w:sz="4"/>
+              <w:left w:val="single" w:color="AAAAAA" w:sz="4"/>
+              <w:bottom w:val="single" w:color="AAAAAA" w:sz="4"/>
+              <w:right w:val="single" w:color="AAAAAA" w:sz="4"/>
+            </w:tcBorders>
+            <w:tcMar>
+              <w:top w:type="dxa" w:w="60"/>
+              <w:left w:type="dxa" w:w="100"/>
+              <w:bottom w:type="dxa" w:w="60"/>
+              <w:right w:type="dxa" w:w="100"/>
+            </w:tcMar>
+            <w:vAlign w:val="center"/>
+          </w:tcPr>
+          <w:p>
+            <w:pPr>
+              <w:jc w:val="center"/>
+            </w:pPr>
+            <w:r>
+              <w:rPr>
+                <w:rFonts w:ascii="Times New Roman" w:cs="Times New Roman" w:eastAsia="Times New Roman" w:hAnsi="Times New Roman"/>
+                <w:b w:val="false"/>
+                <w:bCs w:val="false"/>
+                <w:sz w:val="18"/>
+                <w:szCs w:val="18"/>
+              </w:rPr>
+              <w:t xml:space="preserve">1,786 (25.8%)</w:t>
+            </w:r>
+          </w:p>
+        </w:tc>
+        <w:tc>
+          <w:tcPr>
+            <w:tcW w:type="dxa" w:w="2160"/>
+            <w:tcBorders>
+              <w:top w:val="single" w:color="AAAAAA" w:sz="4"/>
+              <w:left w:val="single" w:color="AAAAAA" w:sz="4"/>
+              <w:bottom w:val="single" w:color="AAAAAA" w:sz="4"/>
+              <w:right w:val="single" w:color="AAAAAA" w:sz="4"/>
+            </w:tcBorders>
+            <w:tcMar>
+              <w:top w:type="dxa" w:w="60"/>
+              <w:left w:type="dxa" w:w="100"/>
+              <w:bottom w:type="dxa" w:w="60"/>
+              <w:right w:type="dxa" w:w="100"/>
+            </w:tcMar>
+            <w:vAlign w:val="center"/>
+          </w:tcPr>
+          <w:p>
+            <w:pPr>
+              <w:jc w:val="center"/>
+            </w:pPr>
+            <w:r>
+              <w:rPr>
+                <w:rFonts w:ascii="Times New Roman" w:cs="Times New Roman" w:eastAsia="Times New Roman" w:hAnsi="Times New Roman"/>
+                <w:b w:val="false"/>
+                <w:bCs w:val="false"/>
+                <w:sz w:val="18"/>
+                <w:szCs w:val="18"/>
+              </w:rPr>
+              <w:t xml:space="preserve"/>
+            </w:r>
+          </w:p>
+        </w:tc>
+      </w:tr>
+      <w:tr>
+        <w:tc>
+          <w:tcPr>
+            <w:tcW w:type="dxa" w:w="3120"/>
+            <w:tcBorders>
+              <w:top w:val="single" w:color="AAAAAA" w:sz="4"/>
+              <w:left w:val="single" w:color="AAAAAA" w:sz="4"/>
+              <w:bottom w:val="single" w:color="AAAAAA" w:sz="4"/>
+              <w:right w:val="single" w:color="AAAAAA" w:sz="4"/>
+            </w:tcBorders>
+            <w:tcMar>
+              <w:top w:type="dxa" w:w="60"/>
+              <w:left w:type="dxa" w:w="100"/>
+              <w:bottom w:type="dxa" w:w="60"/>
+              <w:right w:type="dxa" w:w="100"/>
+            </w:tcMar>
+            <w:vAlign w:val="center"/>
+          </w:tcPr>
+          <w:p>
+            <w:pPr>
+              <w:jc w:val="left"/>
+            </w:pPr>
+            <w:r>
+              <w:rPr>
+                <w:rFonts w:ascii="Times New Roman" w:cs="Times New Roman" w:eastAsia="Times New Roman" w:hAnsi="Times New Roman"/>
+                <w:b w:val="false"/>
+                <w:bCs w:val="false"/>
+                <w:sz w:val="18"/>
+                <w:szCs w:val="18"/>
+              </w:rPr>
+              <w:t xml:space="preserve">  Higher</w:t>
+            </w:r>
+          </w:p>
+        </w:tc>
+        <w:tc>
+          <w:tcPr>
+            <w:tcW w:type="dxa" w:w="2040"/>
+            <w:tcBorders>
+              <w:top w:val="single" w:color="AAAAAA" w:sz="4"/>
+              <w:left w:val="single" w:color="AAAAAA" w:sz="4"/>
+              <w:bottom w:val="single" w:color="AAAAAA" w:sz="4"/>
+              <w:right w:val="single" w:color="AAAAAA" w:sz="4"/>
+            </w:tcBorders>
+            <w:tcMar>
+              <w:top w:type="dxa" w:w="60"/>
+              <w:left w:type="dxa" w:w="100"/>
+              <w:bottom w:type="dxa" w:w="60"/>
+              <w:right w:type="dxa" w:w="100"/>
+            </w:tcMar>
+            <w:vAlign w:val="center"/>
+          </w:tcPr>
+          <w:p>
+            <w:pPr>
+              <w:jc w:val="center"/>
+            </w:pPr>
+            <w:r>
+              <w:rPr>
+                <w:rFonts w:ascii="Times New Roman" w:cs="Times New Roman" w:eastAsia="Times New Roman" w:hAnsi="Times New Roman"/>
+                <w:b w:val="false"/>
+                <w:bCs w:val="false"/>
+                <w:sz w:val="18"/>
+                <w:szCs w:val="18"/>
+              </w:rPr>
+              <w:t xml:space="preserve">244 (1.9%)</w:t>
+            </w:r>
+          </w:p>
+        </w:tc>
+        <w:tc>
+          <w:tcPr>
+            <w:tcW w:type="dxa" w:w="2040"/>
+            <w:tcBorders>
+              <w:top w:val="single" w:color="AAAAAA" w:sz="4"/>
+              <w:left w:val="single" w:color="AAAAAA" w:sz="4"/>
+              <w:bottom w:val="single" w:color="AAAAAA" w:sz="4"/>
+              <w:right w:val="single" w:color="AAAAAA" w:sz="4"/>
+            </w:tcBorders>
+            <w:tcMar>
+              <w:top w:type="dxa" w:w="60"/>
+              <w:left w:type="dxa" w:w="100"/>
+              <w:bottom w:type="dxa" w:w="60"/>
+              <w:right w:type="dxa" w:w="100"/>
+            </w:tcMar>
+            <w:vAlign w:val="center"/>
+          </w:tcPr>
+          <w:p>
+            <w:pPr>
+              <w:jc w:val="center"/>
+            </w:pPr>
+            <w:r>
+              <w:rPr>
+                <w:rFonts w:ascii="Times New Roman" w:cs="Times New Roman" w:eastAsia="Times New Roman" w:hAnsi="Times New Roman"/>
+                <w:b w:val="false"/>
+                <w:bCs w:val="false"/>
+                <w:sz w:val="18"/>
+                <w:szCs w:val="18"/>
+              </w:rPr>
+              <w:t xml:space="preserve">190 (2.7%)</w:t>
+            </w:r>
+          </w:p>
+        </w:tc>
+        <w:tc>
+          <w:tcPr>
+            <w:tcW w:type="dxa" w:w="2160"/>
+            <w:tcBorders>
+              <w:top w:val="single" w:color="AAAAAA" w:sz="4"/>
+              <w:left w:val="single" w:color="AAAAAA" w:sz="4"/>
+              <w:bottom w:val="single" w:color="AAAAAA" w:sz="4"/>
+              <w:right w:val="single" w:color="AAAAAA" w:sz="4"/>
+            </w:tcBorders>
+            <w:tcMar>
+              <w:top w:type="dxa" w:w="60"/>
+              <w:left w:type="dxa" w:w="100"/>
+              <w:bottom w:type="dxa" w:w="60"/>
+              <w:right w:type="dxa" w:w="100"/>
+            </w:tcMar>
+            <w:vAlign w:val="center"/>
+          </w:tcPr>
+          <w:p>
+            <w:pPr>
+              <w:jc w:val="center"/>
+            </w:pPr>
+            <w:r>
+              <w:rPr>
+                <w:rFonts w:ascii="Times New Roman" w:cs="Times New Roman" w:eastAsia="Times New Roman" w:hAnsi="Times New Roman"/>
+                <w:b w:val="false"/>
+                <w:bCs w:val="false"/>
+                <w:sz w:val="18"/>
+                <w:szCs w:val="18"/>
+              </w:rPr>
+              <w:t xml:space="preserve"/>
+            </w:r>
+          </w:p>
+        </w:tc>
+      </w:tr>
+      <w:tr>
+        <w:tc>
+          <w:tcPr>
+            <w:tcW w:type="dxa" w:w="3120"/>
+            <w:tcBorders>
+              <w:top w:val="single" w:color="AAAAAA" w:sz="4"/>
+              <w:left w:val="single" w:color="AAAAAA" w:sz="4"/>
+              <w:bottom w:val="single" w:color="AAAAAA" w:sz="4"/>
+              <w:right w:val="single" w:color="AAAAAA" w:sz="4"/>
+            </w:tcBorders>
+            <w:tcMar>
+              <w:top w:type="dxa" w:w="60"/>
+              <w:left w:type="dxa" w:w="100"/>
+              <w:bottom w:type="dxa" w:w="60"/>
+              <w:right w:type="dxa" w:w="100"/>
+            </w:tcMar>
+            <w:vAlign w:val="center"/>
+          </w:tcPr>
+          <w:p>
+            <w:pPr>
+              <w:jc w:val="left"/>
+            </w:pPr>
+            <w:r>
+              <w:rPr>
+                <w:rFonts w:ascii="Times New Roman" w:cs="Times New Roman" w:eastAsia="Times New Roman" w:hAnsi="Times New Roman"/>
+                <w:b/>
+                <w:bCs/>
+                <w:sz w:val="18"/>
+                <w:szCs w:val="18"/>
+              </w:rPr>
+              <w:t xml:space="preserve">Parity (mean ± SD)</w:t>
+            </w:r>
+          </w:p>
+        </w:tc>
+        <w:tc>
+          <w:tcPr>
+            <w:tcW w:type="dxa" w:w="2040"/>
+            <w:tcBorders>
+              <w:top w:val="single" w:color="AAAAAA" w:sz="4"/>
+              <w:left w:val="single" w:color="AAAAAA" w:sz="4"/>
+              <w:bottom w:val="single" w:color="AAAAAA" w:sz="4"/>
+              <w:right w:val="single" w:color="AAAAAA" w:sz="4"/>
+            </w:tcBorders>
+            <w:tcMar>
+              <w:top w:type="dxa" w:w="60"/>
+              <w:left w:type="dxa" w:w="100"/>
+              <w:bottom w:type="dxa" w:w="60"/>
+              <w:right w:type="dxa" w:w="100"/>
+            </w:tcMar>
+            <w:vAlign w:val="center"/>
+          </w:tcPr>
+          <w:p>
+            <w:pPr>
+              <w:jc w:val="center"/>
+            </w:pPr>
+            <w:r>
+              <w:rPr>
+                <w:rFonts w:ascii="Times New Roman" w:cs="Times New Roman" w:eastAsia="Times New Roman" w:hAnsi="Times New Roman"/>
+                <w:b w:val="false"/>
+                <w:bCs w:val="false"/>
+                <w:sz w:val="18"/>
+                <w:szCs w:val="18"/>
+              </w:rPr>
+              <w:t xml:space="preserve">3.3 ± 2.1</w:t>
+            </w:r>
+          </w:p>
+        </w:tc>
+        <w:tc>
+          <w:tcPr>
+            <w:tcW w:type="dxa" w:w="2040"/>
+            <w:tcBorders>
+              <w:top w:val="single" w:color="AAAAAA" w:sz="4"/>
+              <w:left w:val="single" w:color="AAAAAA" w:sz="4"/>
+              <w:bottom w:val="single" w:color="AAAAAA" w:sz="4"/>
+              <w:right w:val="single" w:color="AAAAAA" w:sz="4"/>
+            </w:tcBorders>
+            <w:tcMar>
+              <w:top w:type="dxa" w:w="60"/>
+              <w:left w:type="dxa" w:w="100"/>
+              <w:bottom w:type="dxa" w:w="60"/>
+              <w:right w:type="dxa" w:w="100"/>
+            </w:tcMar>
+            <w:vAlign w:val="center"/>
+          </w:tcPr>
+          <w:p>
+            <w:pPr>
+              <w:jc w:val="center"/>
+            </w:pPr>
+            <w:r>
+              <w:rPr>
+                <w:rFonts w:ascii="Times New Roman" w:cs="Times New Roman" w:eastAsia="Times New Roman" w:hAnsi="Times New Roman"/>
+                <w:b w:val="false"/>
+                <w:bCs w:val="false"/>
+                <w:sz w:val="18"/>
+                <w:szCs w:val="18"/>
+              </w:rPr>
+              <w:t xml:space="preserve">2.7 ± 1.8</w:t>
+            </w:r>
+          </w:p>
+        </w:tc>
+        <w:tc>
+          <w:tcPr>
+            <w:tcW w:type="dxa" w:w="2160"/>
+            <w:tcBorders>
+              <w:top w:val="single" w:color="AAAAAA" w:sz="4"/>
+              <w:left w:val="single" w:color="AAAAAA" w:sz="4"/>
+              <w:bottom w:val="single" w:color="AAAAAA" w:sz="4"/>
+              <w:right w:val="single" w:color="AAAAAA" w:sz="4"/>
+            </w:tcBorders>
+            <w:tcMar>
+              <w:top w:type="dxa" w:w="60"/>
+              <w:left w:type="dxa" w:w="100"/>
+              <w:bottom w:type="dxa" w:w="60"/>
+              <w:right w:type="dxa" w:w="100"/>
+            </w:tcMar>
+            <w:vAlign w:val="center"/>
+          </w:tcPr>
+          <w:p>
+            <w:pPr>
+              <w:jc w:val="center"/>
+            </w:pPr>
+            <w:r>
+              <w:rPr>
+                <w:rFonts w:ascii="Times New Roman" w:cs="Times New Roman" w:eastAsia="Times New Roman" w:hAnsi="Times New Roman"/>
+                <w:b w:val="false"/>
+                <w:bCs w:val="false"/>
+                <w:sz w:val="18"/>
+                <w:szCs w:val="18"/>
+              </w:rPr>
+              <w:t xml:space="preserve">&lt;0.001</w:t>
+            </w:r>
+          </w:p>
+        </w:tc>
+      </w:tr>
+      <w:tr>
+        <w:tc>
+          <w:tcPr>
+            <w:tcW w:type="dxa" w:w="3120"/>
+            <w:tcBorders>
+              <w:top w:val="single" w:color="AAAAAA" w:sz="4"/>
+              <w:left w:val="single" w:color="AAAAAA" w:sz="4"/>
+              <w:bottom w:val="single" w:color="AAAAAA" w:sz="4"/>
+              <w:right w:val="single" w:color="AAAAAA" w:sz="4"/>
+            </w:tcBorders>
+            <w:tcMar>
+              <w:top w:type="dxa" w:w="60"/>
+              <w:left w:type="dxa" w:w="100"/>
+              <w:bottom w:type="dxa" w:w="60"/>
+              <w:right w:type="dxa" w:w="100"/>
+            </w:tcMar>
+            <w:vAlign w:val="center"/>
+          </w:tcPr>
+          <w:p>
+            <w:pPr>
+              <w:jc w:val="left"/>
+            </w:pPr>
+            <w:r>
+              <w:rPr>
+                <w:rFonts w:ascii="Times New Roman" w:cs="Times New Roman" w:eastAsia="Times New Roman" w:hAnsi="Times New Roman"/>
+                <w:b/>
+                <w:bCs/>
+                <w:sz w:val="18"/>
+                <w:szCs w:val="18"/>
+              </w:rPr>
+              <w:t xml:space="preserve">Married, n (%)</w:t>
+            </w:r>
+          </w:p>
+        </w:tc>
+        <w:tc>
+          <w:tcPr>
+            <w:tcW w:type="dxa" w:w="2040"/>
+            <w:tcBorders>
+              <w:top w:val="single" w:color="AAAAAA" w:sz="4"/>
+              <w:left w:val="single" w:color="AAAAAA" w:sz="4"/>
+              <w:bottom w:val="single" w:color="AAAAAA" w:sz="4"/>
+              <w:right w:val="single" w:color="AAAAAA" w:sz="4"/>
+            </w:tcBorders>
+            <w:tcMar>
+              <w:top w:type="dxa" w:w="60"/>
+              <w:left w:type="dxa" w:w="100"/>
+              <w:bottom w:type="dxa" w:w="60"/>
+              <w:right w:type="dxa" w:w="100"/>
+            </w:tcMar>
+            <w:vAlign w:val="center"/>
+          </w:tcPr>
+          <w:p>
+            <w:pPr>
+              <w:jc w:val="center"/>
+            </w:pPr>
+            <w:r>
+              <w:rPr>
+                <w:rFonts w:ascii="Times New Roman" w:cs="Times New Roman" w:eastAsia="Times New Roman" w:hAnsi="Times New Roman"/>
+                <w:b w:val="false"/>
+                <w:bCs w:val="false"/>
+                <w:sz w:val="18"/>
+                <w:szCs w:val="18"/>
+              </w:rPr>
+              <w:t xml:space="preserve">10,022 (76.9%)</w:t>
+            </w:r>
+          </w:p>
+        </w:tc>
+        <w:tc>
+          <w:tcPr>
+            <w:tcW w:type="dxa" w:w="2040"/>
+            <w:tcBorders>
+              <w:top w:val="single" w:color="AAAAAA" w:sz="4"/>
+              <w:left w:val="single" w:color="AAAAAA" w:sz="4"/>
+              <w:bottom w:val="single" w:color="AAAAAA" w:sz="4"/>
+              <w:right w:val="single" w:color="AAAAAA" w:sz="4"/>
+            </w:tcBorders>
+            <w:tcMar>
+              <w:top w:type="dxa" w:w="60"/>
+              <w:left w:type="dxa" w:w="100"/>
+              <w:bottom w:type="dxa" w:w="60"/>
+              <w:right w:type="dxa" w:w="100"/>
+            </w:tcMar>
+            <w:vAlign w:val="center"/>
+          </w:tcPr>
+          <w:p>
+            <w:pPr>
+              <w:jc w:val="center"/>
+            </w:pPr>
+            <w:r>
+              <w:rPr>
+                <w:rFonts w:ascii="Times New Roman" w:cs="Times New Roman" w:eastAsia="Times New Roman" w:hAnsi="Times New Roman"/>
+                <w:b w:val="false"/>
+                <w:bCs w:val="false"/>
+                <w:sz w:val="18"/>
+                <w:szCs w:val="18"/>
+              </w:rPr>
+              <w:t xml:space="preserve">4,820 (69.6%)</w:t>
+            </w:r>
+          </w:p>
+        </w:tc>
+        <w:tc>
+          <w:tcPr>
+            <w:tcW w:type="dxa" w:w="2160"/>
+            <w:tcBorders>
+              <w:top w:val="single" w:color="AAAAAA" w:sz="4"/>
+              <w:left w:val="single" w:color="AAAAAA" w:sz="4"/>
+              <w:bottom w:val="single" w:color="AAAAAA" w:sz="4"/>
+              <w:right w:val="single" w:color="AAAAAA" w:sz="4"/>
+            </w:tcBorders>
+            <w:tcMar>
+              <w:top w:type="dxa" w:w="60"/>
+              <w:left w:type="dxa" w:w="100"/>
+              <w:bottom w:type="dxa" w:w="60"/>
+              <w:right w:type="dxa" w:w="100"/>
+            </w:tcMar>
+            <w:vAlign w:val="center"/>
+          </w:tcPr>
+          <w:p>
+            <w:pPr>
+              <w:jc w:val="center"/>
+            </w:pPr>
+            <w:r>
+              <w:rPr>
+                <w:rFonts w:ascii="Times New Roman" w:cs="Times New Roman" w:eastAsia="Times New Roman" w:hAnsi="Times New Roman"/>
+                <w:b w:val="false"/>
+                <w:bCs w:val="false"/>
+                <w:sz w:val="18"/>
+                <w:szCs w:val="18"/>
+              </w:rPr>
+              <w:t xml:space="preserve">&lt;0.001</w:t>
+            </w:r>
+          </w:p>
+        </w:tc>
+      </w:tr>
+      <w:tr>
+        <w:tc>
+          <w:tcPr>
+            <w:tcW w:type="dxa" w:w="3120"/>
+            <w:tcBorders>
+              <w:top w:val="single" w:color="AAAAAA" w:sz="4"/>
+              <w:left w:val="single" w:color="AAAAAA" w:sz="4"/>
+              <w:bottom w:val="single" w:color="AAAAAA" w:sz="4"/>
+              <w:right w:val="single" w:color="AAAAAA" w:sz="4"/>
+            </w:tcBorders>
+            <w:tcMar>
+              <w:top w:type="dxa" w:w="60"/>
+              <w:left w:type="dxa" w:w="100"/>
+              <w:bottom w:type="dxa" w:w="60"/>
+              <w:right w:type="dxa" w:w="100"/>
+            </w:tcMar>
+            <w:vAlign w:val="center"/>
+          </w:tcPr>
+          <w:p>
+            <w:pPr>
+              <w:jc w:val="left"/>
+            </w:pPr>
+            <w:r>
+              <w:rPr>
+                <w:rFonts w:ascii="Times New Roman" w:cs="Times New Roman" w:eastAsia="Times New Roman" w:hAnsi="Times New Roman"/>
+                <w:b/>
+                <w:bCs/>
+                <w:sz w:val="18"/>
+                <w:szCs w:val="18"/>
+              </w:rPr>
+              <w:t xml:space="preserve">Distance barrier to care, n (%)</w:t>
+            </w:r>
+          </w:p>
+        </w:tc>
+        <w:tc>
+          <w:tcPr>
+            <w:tcW w:type="dxa" w:w="2040"/>
+            <w:tcBorders>
+              <w:top w:val="single" w:color="AAAAAA" w:sz="4"/>
+              <w:left w:val="single" w:color="AAAAAA" w:sz="4"/>
+              <w:bottom w:val="single" w:color="AAAAAA" w:sz="4"/>
+              <w:right w:val="single" w:color="AAAAAA" w:sz="4"/>
+            </w:tcBorders>
+            <w:tcMar>
+              <w:top w:type="dxa" w:w="60"/>
+              <w:left w:type="dxa" w:w="100"/>
+              <w:bottom w:type="dxa" w:w="60"/>
+              <w:right w:type="dxa" w:w="100"/>
+            </w:tcMar>
+            <w:vAlign w:val="center"/>
+          </w:tcPr>
+          <w:p>
+            <w:pPr>
+              <w:jc w:val="center"/>
+            </w:pPr>
+            <w:r>
+              <w:rPr>
+                <w:rFonts w:ascii="Times New Roman" w:cs="Times New Roman" w:eastAsia="Times New Roman" w:hAnsi="Times New Roman"/>
+                <w:b w:val="false"/>
+                <w:bCs w:val="false"/>
+                <w:sz w:val="18"/>
+                <w:szCs w:val="18"/>
+              </w:rPr>
+              <w:t xml:space="preserve">6,963 (53.4%)</w:t>
+            </w:r>
+          </w:p>
+        </w:tc>
+        <w:tc>
+          <w:tcPr>
+            <w:tcW w:type="dxa" w:w="2040"/>
+            <w:tcBorders>
+              <w:top w:val="single" w:color="AAAAAA" w:sz="4"/>
+              <w:left w:val="single" w:color="AAAAAA" w:sz="4"/>
+              <w:bottom w:val="single" w:color="AAAAAA" w:sz="4"/>
+              <w:right w:val="single" w:color="AAAAAA" w:sz="4"/>
+            </w:tcBorders>
+            <w:tcMar>
+              <w:top w:type="dxa" w:w="60"/>
+              <w:left w:type="dxa" w:w="100"/>
+              <w:bottom w:type="dxa" w:w="60"/>
+              <w:right w:type="dxa" w:w="100"/>
+            </w:tcMar>
+            <w:vAlign w:val="center"/>
+          </w:tcPr>
+          <w:p>
+            <w:pPr>
+              <w:jc w:val="center"/>
+            </w:pPr>
+            <w:r>
+              <w:rPr>
+                <w:rFonts w:ascii="Times New Roman" w:cs="Times New Roman" w:eastAsia="Times New Roman" w:hAnsi="Times New Roman"/>
+                <w:b w:val="false"/>
+                <w:bCs w:val="false"/>
+                <w:sz w:val="18"/>
+                <w:szCs w:val="18"/>
+              </w:rPr>
+              <w:t xml:space="preserve">3,417 (49.3%)</w:t>
+            </w:r>
+          </w:p>
+        </w:tc>
+        <w:tc>
+          <w:tcPr>
+            <w:tcW w:type="dxa" w:w="2160"/>
+            <w:tcBorders>
+              <w:top w:val="single" w:color="AAAAAA" w:sz="4"/>
+              <w:left w:val="single" w:color="AAAAAA" w:sz="4"/>
+              <w:bottom w:val="single" w:color="AAAAAA" w:sz="4"/>
+              <w:right w:val="single" w:color="AAAAAA" w:sz="4"/>
+            </w:tcBorders>
+            <w:tcMar>
+              <w:top w:type="dxa" w:w="60"/>
+              <w:left w:type="dxa" w:w="100"/>
+              <w:bottom w:type="dxa" w:w="60"/>
+              <w:right w:type="dxa" w:w="100"/>
+            </w:tcMar>
+            <w:vAlign w:val="center"/>
+          </w:tcPr>
+          <w:p>
+            <w:pPr>
+              <w:jc w:val="center"/>
+            </w:pPr>
+            <w:r>
+              <w:rPr>
+                <w:rFonts w:ascii="Times New Roman" w:cs="Times New Roman" w:eastAsia="Times New Roman" w:hAnsi="Times New Roman"/>
+                <w:b w:val="false"/>
+                <w:bCs w:val="false"/>
+                <w:sz w:val="18"/>
+                <w:szCs w:val="18"/>
+              </w:rPr>
+              <w:t xml:space="preserve">&lt;0.001</w:t>
+            </w:r>
+          </w:p>
+        </w:tc>
+      </w:tr>
+      <w:tr>
+        <w:tc>
+          <w:tcPr>
+            <w:tcW w:type="dxa" w:w="3120"/>
+            <w:tcBorders>
+              <w:top w:val="single" w:color="AAAAAA" w:sz="4"/>
+              <w:left w:val="single" w:color="AAAAAA" w:sz="4"/>
+              <w:bottom w:val="single" w:color="AAAAAA" w:sz="4"/>
+              <w:right w:val="single" w:color="AAAAAA" w:sz="4"/>
+            </w:tcBorders>
+            <w:shd w:fill="E0EAF6" w:val="clear"/>
+            <w:tcMar>
+              <w:top w:type="dxa" w:w="60"/>
+              <w:left w:type="dxa" w:w="100"/>
+              <w:bottom w:type="dxa" w:w="60"/>
+              <w:right w:type="dxa" w:w="100"/>
+            </w:tcMar>
+            <w:vAlign w:val="center"/>
+          </w:tcPr>
+          <w:p>
+            <w:pPr>
+              <w:jc w:val="left"/>
+            </w:pPr>
+            <w:r>
+              <w:rPr>
+                <w:rFonts w:ascii="Times New Roman" w:cs="Times New Roman" w:eastAsia="Times New Roman" w:hAnsi="Times New Roman"/>
+                <w:b/>
+                <w:bCs/>
+                <w:sz w:val="18"/>
+                <w:szCs w:val="18"/>
+              </w:rPr>
+              <w:t xml:space="preserve">Region, n (%)</w:t>
+            </w:r>
+          </w:p>
+        </w:tc>
+        <w:tc>
+          <w:tcPr>
+            <w:tcW w:type="dxa" w:w="2040"/>
+            <w:tcBorders>
+              <w:top w:val="single" w:color="AAAAAA" w:sz="4"/>
+              <w:left w:val="single" w:color="AAAAAA" w:sz="4"/>
+              <w:bottom w:val="single" w:color="AAAAAA" w:sz="4"/>
+              <w:right w:val="single" w:color="AAAAAA" w:sz="4"/>
+            </w:tcBorders>
+            <w:shd w:fill="E0EAF6" w:val="clear"/>
+            <w:tcMar>
+              <w:top w:type="dxa" w:w="60"/>
+              <w:left w:type="dxa" w:w="100"/>
+              <w:bottom w:type="dxa" w:w="60"/>
+              <w:right w:type="dxa" w:w="100"/>
+            </w:tcMar>
+            <w:vAlign w:val="center"/>
+          </w:tcPr>
+          <w:p>
+            <w:pPr>
+              <w:jc w:val="center"/>
+            </w:pPr>
+            <w:r>
+              <w:rPr>
+                <w:rFonts w:ascii="Times New Roman" w:cs="Times New Roman" w:eastAsia="Times New Roman" w:hAnsi="Times New Roman"/>
+                <w:b w:val="false"/>
+                <w:bCs w:val="false"/>
+                <w:sz w:val="18"/>
+                <w:szCs w:val="18"/>
+              </w:rPr>
+              <w:t xml:space="preserve"/>
+            </w:r>
+          </w:p>
+        </w:tc>
+        <w:tc>
+          <w:tcPr>
+            <w:tcW w:type="dxa" w:w="2040"/>
+            <w:tcBorders>
+              <w:top w:val="single" w:color="AAAAAA" w:sz="4"/>
+              <w:left w:val="single" w:color="AAAAAA" w:sz="4"/>
+              <w:bottom w:val="single" w:color="AAAAAA" w:sz="4"/>
+              <w:right w:val="single" w:color="AAAAAA" w:sz="4"/>
+            </w:tcBorders>
+            <w:shd w:fill="E0EAF6" w:val="clear"/>
+            <w:tcMar>
+              <w:top w:type="dxa" w:w="60"/>
+              <w:left w:type="dxa" w:w="100"/>
+              <w:bottom w:type="dxa" w:w="60"/>
+              <w:right w:type="dxa" w:w="100"/>
+            </w:tcMar>
+            <w:vAlign w:val="center"/>
+          </w:tcPr>
+          <w:p>
+            <w:pPr>
+              <w:jc w:val="center"/>
+            </w:pPr>
+            <w:r>
+              <w:rPr>
+                <w:rFonts w:ascii="Times New Roman" w:cs="Times New Roman" w:eastAsia="Times New Roman" w:hAnsi="Times New Roman"/>
+                <w:b w:val="false"/>
+                <w:bCs w:val="false"/>
+                <w:sz w:val="18"/>
+                <w:szCs w:val="18"/>
+              </w:rPr>
+              <w:t xml:space="preserve"/>
+            </w:r>
+          </w:p>
+        </w:tc>
+        <w:tc>
+          <w:tcPr>
+            <w:tcW w:type="dxa" w:w="2160"/>
+            <w:tcBorders>
+              <w:top w:val="single" w:color="AAAAAA" w:sz="4"/>
+              <w:left w:val="single" w:color="AAAAAA" w:sz="4"/>
+              <w:bottom w:val="single" w:color="AAAAAA" w:sz="4"/>
+              <w:right w:val="single" w:color="AAAAAA" w:sz="4"/>
+            </w:tcBorders>
+            <w:shd w:fill="E0EAF6" w:val="clear"/>
+            <w:tcMar>
+              <w:top w:type="dxa" w:w="60"/>
+              <w:left w:type="dxa" w:w="100"/>
+              <w:bottom w:type="dxa" w:w="60"/>
+              <w:right w:type="dxa" w:w="100"/>
+            </w:tcMar>
+            <w:vAlign w:val="center"/>
+          </w:tcPr>
+          <w:p>
+            <w:pPr>
+              <w:jc w:val="center"/>
+            </w:pPr>
+            <w:r>
+              <w:rPr>
+                <w:rFonts w:ascii="Times New Roman" w:cs="Times New Roman" w:eastAsia="Times New Roman" w:hAnsi="Times New Roman"/>
+                <w:b w:val="false"/>
+                <w:bCs w:val="false"/>
+                <w:sz w:val="18"/>
+                <w:szCs w:val="18"/>
+              </w:rPr>
+              <w:t xml:space="preserve">0.058</w:t>
+            </w:r>
+          </w:p>
+        </w:tc>
+      </w:tr>
+      <w:tr>
+        <w:tc>
+          <w:tcPr>
+            <w:tcW w:type="dxa" w:w="3120"/>
+            <w:tcBorders>
+              <w:top w:val="single" w:color="AAAAAA" w:sz="4"/>
+              <w:left w:val="single" w:color="AAAAAA" w:sz="4"/>
+              <w:bottom w:val="single" w:color="AAAAAA" w:sz="4"/>
+              <w:right w:val="single" w:color="AAAAAA" w:sz="4"/>
+            </w:tcBorders>
+            <w:tcMar>
+              <w:top w:type="dxa" w:w="60"/>
+              <w:left w:type="dxa" w:w="100"/>
+              <w:bottom w:type="dxa" w:w="60"/>
+              <w:right w:type="dxa" w:w="100"/>
+            </w:tcMar>
+            <w:vAlign w:val="center"/>
+          </w:tcPr>
+          <w:p>
+            <w:pPr>
+              <w:jc w:val="left"/>
+            </w:pPr>
+            <w:r>
+              <w:rPr>
+                <w:rFonts w:ascii="Times New Roman" w:cs="Times New Roman" w:eastAsia="Times New Roman" w:hAnsi="Times New Roman"/>
+                <w:b w:val="false"/>
+                <w:bCs w:val="false"/>
+                <w:sz w:val="18"/>
+                <w:szCs w:val="18"/>
+              </w:rPr>
+              <w:t xml:space="preserve">  Northern</w:t>
+            </w:r>
+          </w:p>
+        </w:tc>
+        <w:tc>
+          <w:tcPr>
+            <w:tcW w:type="dxa" w:w="2040"/>
+            <w:tcBorders>
+              <w:top w:val="single" w:color="AAAAAA" w:sz="4"/>
+              <w:left w:val="single" w:color="AAAAAA" w:sz="4"/>
+              <w:bottom w:val="single" w:color="AAAAAA" w:sz="4"/>
+              <w:right w:val="single" w:color="AAAAAA" w:sz="4"/>
+            </w:tcBorders>
+            <w:tcMar>
+              <w:top w:type="dxa" w:w="60"/>
+              <w:left w:type="dxa" w:w="100"/>
+              <w:bottom w:type="dxa" w:w="60"/>
+              <w:right w:type="dxa" w:w="100"/>
+            </w:tcMar>
+            <w:vAlign w:val="center"/>
+          </w:tcPr>
+          <w:p>
+            <w:pPr>
+              <w:jc w:val="center"/>
+            </w:pPr>
+            <w:r>
+              <w:rPr>
+                <w:rFonts w:ascii="Times New Roman" w:cs="Times New Roman" w:eastAsia="Times New Roman" w:hAnsi="Times New Roman"/>
+                <w:b w:val="false"/>
+                <w:bCs w:val="false"/>
+                <w:sz w:val="18"/>
+                <w:szCs w:val="18"/>
+              </w:rPr>
+              <w:t xml:space="preserve">2,490 (19.1%)</w:t>
+            </w:r>
+          </w:p>
+        </w:tc>
+        <w:tc>
+          <w:tcPr>
+            <w:tcW w:type="dxa" w:w="2040"/>
+            <w:tcBorders>
+              <w:top w:val="single" w:color="AAAAAA" w:sz="4"/>
+              <w:left w:val="single" w:color="AAAAAA" w:sz="4"/>
+              <w:bottom w:val="single" w:color="AAAAAA" w:sz="4"/>
+              <w:right w:val="single" w:color="AAAAAA" w:sz="4"/>
+            </w:tcBorders>
+            <w:tcMar>
+              <w:top w:type="dxa" w:w="60"/>
+              <w:left w:type="dxa" w:w="100"/>
+              <w:bottom w:type="dxa" w:w="60"/>
+              <w:right w:type="dxa" w:w="100"/>
+            </w:tcMar>
+            <w:vAlign w:val="center"/>
+          </w:tcPr>
+          <w:p>
+            <w:pPr>
+              <w:jc w:val="center"/>
+            </w:pPr>
+            <w:r>
+              <w:rPr>
+                <w:rFonts w:ascii="Times New Roman" w:cs="Times New Roman" w:eastAsia="Times New Roman" w:hAnsi="Times New Roman"/>
+                <w:b w:val="false"/>
+                <w:bCs w:val="false"/>
+                <w:sz w:val="18"/>
+                <w:szCs w:val="18"/>
+              </w:rPr>
+              <w:t xml:space="preserve">1,418 (20.5%)</w:t>
+            </w:r>
+          </w:p>
+        </w:tc>
+        <w:tc>
+          <w:tcPr>
+            <w:tcW w:type="dxa" w:w="2160"/>
+            <w:tcBorders>
+              <w:top w:val="single" w:color="AAAAAA" w:sz="4"/>
+              <w:left w:val="single" w:color="AAAAAA" w:sz="4"/>
+              <w:bottom w:val="single" w:color="AAAAAA" w:sz="4"/>
+              <w:right w:val="single" w:color="AAAAAA" w:sz="4"/>
+            </w:tcBorders>
+            <w:tcMar>
+              <w:top w:type="dxa" w:w="60"/>
+              <w:left w:type="dxa" w:w="100"/>
+              <w:bottom w:type="dxa" w:w="60"/>
+              <w:right w:type="dxa" w:w="100"/>
+            </w:tcMar>
+            <w:vAlign w:val="center"/>
+          </w:tcPr>
+          <w:p>
+            <w:pPr>
+              <w:jc w:val="center"/>
+            </w:pPr>
+            <w:r>
+              <w:rPr>
+                <w:rFonts w:ascii="Times New Roman" w:cs="Times New Roman" w:eastAsia="Times New Roman" w:hAnsi="Times New Roman"/>
+                <w:b w:val="false"/>
+                <w:bCs w:val="false"/>
+                <w:sz w:val="18"/>
+                <w:szCs w:val="18"/>
+              </w:rPr>
+              <w:t xml:space="preserve"/>
+            </w:r>
+          </w:p>
+        </w:tc>
+      </w:tr>
+      <w:tr>
+        <w:tc>
+          <w:tcPr>
+            <w:tcW w:type="dxa" w:w="3120"/>
+            <w:tcBorders>
+              <w:top w:val="single" w:color="AAAAAA" w:sz="4"/>
+              <w:left w:val="single" w:color="AAAAAA" w:sz="4"/>
+              <w:bottom w:val="single" w:color="AAAAAA" w:sz="4"/>
+              <w:right w:val="single" w:color="AAAAAA" w:sz="4"/>
+            </w:tcBorders>
+            <w:tcMar>
+              <w:top w:type="dxa" w:w="60"/>
+              <w:left w:type="dxa" w:w="100"/>
+              <w:bottom w:type="dxa" w:w="60"/>
+              <w:right w:type="dxa" w:w="100"/>
+            </w:tcMar>
+            <w:vAlign w:val="center"/>
+          </w:tcPr>
+          <w:p>
+            <w:pPr>
+              <w:jc w:val="left"/>
+            </w:pPr>
+            <w:r>
+              <w:rPr>
+                <w:rFonts w:ascii="Times New Roman" w:cs="Times New Roman" w:eastAsia="Times New Roman" w:hAnsi="Times New Roman"/>
+                <w:b w:val="false"/>
+                <w:bCs w:val="false"/>
+                <w:sz w:val="18"/>
+                <w:szCs w:val="18"/>
+              </w:rPr>
+              <w:t xml:space="preserve">  Central</w:t>
+            </w:r>
+          </w:p>
+        </w:tc>
+        <w:tc>
+          <w:tcPr>
+            <w:tcW w:type="dxa" w:w="2040"/>
+            <w:tcBorders>
+              <w:top w:val="single" w:color="AAAAAA" w:sz="4"/>
+              <w:left w:val="single" w:color="AAAAAA" w:sz="4"/>
+              <w:bottom w:val="single" w:color="AAAAAA" w:sz="4"/>
+              <w:right w:val="single" w:color="AAAAAA" w:sz="4"/>
+            </w:tcBorders>
+            <w:tcMar>
+              <w:top w:type="dxa" w:w="60"/>
+              <w:left w:type="dxa" w:w="100"/>
+              <w:bottom w:type="dxa" w:w="60"/>
+              <w:right w:type="dxa" w:w="100"/>
+            </w:tcMar>
+            <w:vAlign w:val="center"/>
+          </w:tcPr>
+          <w:p>
+            <w:pPr>
+              <w:jc w:val="center"/>
+            </w:pPr>
+            <w:r>
+              <w:rPr>
+                <w:rFonts w:ascii="Times New Roman" w:cs="Times New Roman" w:eastAsia="Times New Roman" w:hAnsi="Times New Roman"/>
+                <w:b w:val="false"/>
+                <w:bCs w:val="false"/>
+                <w:sz w:val="18"/>
+                <w:szCs w:val="18"/>
+              </w:rPr>
+              <w:t xml:space="preserve">4,514 (34.6%)</w:t>
+            </w:r>
+          </w:p>
+        </w:tc>
+        <w:tc>
+          <w:tcPr>
+            <w:tcW w:type="dxa" w:w="2040"/>
+            <w:tcBorders>
+              <w:top w:val="single" w:color="AAAAAA" w:sz="4"/>
+              <w:left w:val="single" w:color="AAAAAA" w:sz="4"/>
+              <w:bottom w:val="single" w:color="AAAAAA" w:sz="4"/>
+              <w:right w:val="single" w:color="AAAAAA" w:sz="4"/>
+            </w:tcBorders>
+            <w:tcMar>
+              <w:top w:type="dxa" w:w="60"/>
+              <w:left w:type="dxa" w:w="100"/>
+              <w:bottom w:type="dxa" w:w="60"/>
+              <w:right w:type="dxa" w:w="100"/>
+            </w:tcMar>
+            <w:vAlign w:val="center"/>
+          </w:tcPr>
+          <w:p>
+            <w:pPr>
+              <w:jc w:val="center"/>
+            </w:pPr>
+            <w:r>
+              <w:rPr>
+                <w:rFonts w:ascii="Times New Roman" w:cs="Times New Roman" w:eastAsia="Times New Roman" w:hAnsi="Times New Roman"/>
+                <w:b w:val="false"/>
+                <w:bCs w:val="false"/>
+                <w:sz w:val="18"/>
+                <w:szCs w:val="18"/>
+              </w:rPr>
+              <w:t xml:space="preserve">2,332 (33.7%)</w:t>
+            </w:r>
+          </w:p>
+        </w:tc>
+        <w:tc>
+          <w:tcPr>
+            <w:tcW w:type="dxa" w:w="2160"/>
+            <w:tcBorders>
+              <w:top w:val="single" w:color="AAAAAA" w:sz="4"/>
+              <w:left w:val="single" w:color="AAAAAA" w:sz="4"/>
+              <w:bottom w:val="single" w:color="AAAAAA" w:sz="4"/>
+              <w:right w:val="single" w:color="AAAAAA" w:sz="4"/>
+            </w:tcBorders>
+            <w:tcMar>
+              <w:top w:type="dxa" w:w="60"/>
+              <w:left w:type="dxa" w:w="100"/>
+              <w:bottom w:type="dxa" w:w="60"/>
+              <w:right w:type="dxa" w:w="100"/>
+            </w:tcMar>
+            <w:vAlign w:val="center"/>
+          </w:tcPr>
+          <w:p>
+            <w:pPr>
+              <w:jc w:val="center"/>
+            </w:pPr>
+            <w:r>
+              <w:rPr>
+                <w:rFonts w:ascii="Times New Roman" w:cs="Times New Roman" w:eastAsia="Times New Roman" w:hAnsi="Times New Roman"/>
+                <w:b w:val="false"/>
+                <w:bCs w:val="false"/>
+                <w:sz w:val="18"/>
+                <w:szCs w:val="18"/>
+              </w:rPr>
+              <w:t xml:space="preserve"/>
+            </w:r>
+          </w:p>
+        </w:tc>
+      </w:tr>
+      <w:tr>
+        <w:tc>
+          <w:tcPr>
+            <w:tcW w:type="dxa" w:w="3120"/>
+            <w:tcBorders>
+              <w:top w:val="single" w:color="AAAAAA" w:sz="4"/>
+              <w:left w:val="single" w:color="AAAAAA" w:sz="4"/>
+              <w:bottom w:val="single" w:color="AAAAAA" w:sz="4"/>
+              <w:right w:val="single" w:color="AAAAAA" w:sz="4"/>
+            </w:tcBorders>
+            <w:tcMar>
+              <w:top w:type="dxa" w:w="60"/>
+              <w:left w:type="dxa" w:w="100"/>
+              <w:bottom w:type="dxa" w:w="60"/>
+              <w:right w:type="dxa" w:w="100"/>
+            </w:tcMar>
+            <w:vAlign w:val="center"/>
+          </w:tcPr>
+          <w:p>
+            <w:pPr>
+              <w:jc w:val="left"/>
+            </w:pPr>
+            <w:r>
+              <w:rPr>
+                <w:rFonts w:ascii="Times New Roman" w:cs="Times New Roman" w:eastAsia="Times New Roman" w:hAnsi="Times New Roman"/>
+                <w:b w:val="false"/>
+                <w:bCs w:val="false"/>
+                <w:sz w:val="18"/>
+                <w:szCs w:val="18"/>
+              </w:rPr>
+              <w:t xml:space="preserve">  Southern</w:t>
+            </w:r>
+          </w:p>
+        </w:tc>
+        <w:tc>
+          <w:tcPr>
+            <w:tcW w:type="dxa" w:w="2040"/>
+            <w:tcBorders>
+              <w:top w:val="single" w:color="AAAAAA" w:sz="4"/>
+              <w:left w:val="single" w:color="AAAAAA" w:sz="4"/>
+              <w:bottom w:val="single" w:color="AAAAAA" w:sz="4"/>
+              <w:right w:val="single" w:color="AAAAAA" w:sz="4"/>
+            </w:tcBorders>
+            <w:tcMar>
+              <w:top w:type="dxa" w:w="60"/>
+              <w:left w:type="dxa" w:w="100"/>
+              <w:bottom w:type="dxa" w:w="60"/>
+              <w:right w:type="dxa" w:w="100"/>
+            </w:tcMar>
+            <w:vAlign w:val="center"/>
+          </w:tcPr>
+          <w:p>
+            <w:pPr>
+              <w:jc w:val="center"/>
+            </w:pPr>
+            <w:r>
+              <w:rPr>
+                <w:rFonts w:ascii="Times New Roman" w:cs="Times New Roman" w:eastAsia="Times New Roman" w:hAnsi="Times New Roman"/>
+                <w:b w:val="false"/>
+                <w:bCs w:val="false"/>
+                <w:sz w:val="18"/>
+                <w:szCs w:val="18"/>
+              </w:rPr>
+              <w:t xml:space="preserve">6,026 (46.2%)</w:t>
+            </w:r>
+          </w:p>
+        </w:tc>
+        <w:tc>
+          <w:tcPr>
+            <w:tcW w:type="dxa" w:w="2040"/>
+            <w:tcBorders>
+              <w:top w:val="single" w:color="AAAAAA" w:sz="4"/>
+              <w:left w:val="single" w:color="AAAAAA" w:sz="4"/>
+              <w:bottom w:val="single" w:color="AAAAAA" w:sz="4"/>
+              <w:right w:val="single" w:color="AAAAAA" w:sz="4"/>
+            </w:tcBorders>
+            <w:tcMar>
+              <w:top w:type="dxa" w:w="60"/>
+              <w:left w:type="dxa" w:w="100"/>
+              <w:bottom w:type="dxa" w:w="60"/>
+              <w:right w:type="dxa" w:w="100"/>
+            </w:tcMar>
+            <w:vAlign w:val="center"/>
+          </w:tcPr>
+          <w:p>
+            <w:pPr>
+              <w:jc w:val="center"/>
+            </w:pPr>
+            <w:r>
+              <w:rPr>
+                <w:rFonts w:ascii="Times New Roman" w:cs="Times New Roman" w:eastAsia="Times New Roman" w:hAnsi="Times New Roman"/>
+                <w:b w:val="false"/>
+                <w:bCs w:val="false"/>
+                <w:sz w:val="18"/>
+                <w:szCs w:val="18"/>
+              </w:rPr>
+              <w:t xml:space="preserve">3,175 (45.8%)</w:t>
+            </w:r>
+          </w:p>
+        </w:tc>
+        <w:tc>
+          <w:tcPr>
+            <w:tcW w:type="dxa" w:w="2160"/>
+            <w:tcBorders>
+              <w:top w:val="single" w:color="AAAAAA" w:sz="4"/>
+              <w:left w:val="single" w:color="AAAAAA" w:sz="4"/>
+              <w:bottom w:val="single" w:color="AAAAAA" w:sz="4"/>
+              <w:right w:val="single" w:color="AAAAAA" w:sz="4"/>
+            </w:tcBorders>
+            <w:tcMar>
+              <w:top w:type="dxa" w:w="60"/>
+              <w:left w:type="dxa" w:w="100"/>
+              <w:bottom w:type="dxa" w:w="60"/>
+              <w:right w:type="dxa" w:w="100"/>
+            </w:tcMar>
+            <w:vAlign w:val="center"/>
+          </w:tcPr>
+          <w:p>
+            <w:pPr>
+              <w:jc w:val="center"/>
+            </w:pPr>
+            <w:r>
+              <w:rPr>
+                <w:rFonts w:ascii="Times New Roman" w:cs="Times New Roman" w:eastAsia="Times New Roman" w:hAnsi="Times New Roman"/>
+                <w:b w:val="false"/>
+                <w:bCs w:val="false"/>
+                <w:sz w:val="18"/>
+                <w:szCs w:val="18"/>
+              </w:rPr>
+              <w:t xml:space="preserve"/>
+            </w:r>
+          </w:p>
+        </w:tc>
+      </w:tr>
+    </w:tbl>
+    <w:p>
+      <w:pPr>
+        <w:spacing w:after="80" w:before="40"/>
+      </w:pPr>
+      <w:r>
+        <w:rPr>
+          <w:rFonts w:ascii="Times New Roman" w:cs="Times New Roman" w:eastAsia="Times New Roman" w:hAnsi="Times New Roman"/>
+          <w:i/>
+          <w:iCs/>
+          <w:sz w:val="18"/>
+          <w:szCs w:val="18"/>
+        </w:rPr>
+        <w:t xml:space="preserve">p-values: Welch’s t-test (continuous), chi-square test (categorical). p-value shown on the category header row for multi-level variables.</w:t>
+      </w:r>
+    </w:p>
+    <w:p>
+      <w:pPr>
+        <w:spacing w:after="0" w:before="280"/>
+      </w:pPr>
+    </w:p>
+    <w:p>
+      <w:pPr>
+        <w:spacing w:after="60" w:before="240"/>
+      </w:pPr>
+      <w:r>
+        <w:rPr>
+          <w:rFonts w:ascii="Times New Roman" w:cs="Times New Roman" w:eastAsia="Times New Roman" w:hAnsi="Times New Roman"/>
+          <w:b/>
+          <w:bCs/>
+          <w:sz w:val="22"/>
+          <w:szCs w:val="22"/>
+        </w:rPr>
+        <w:t xml:space="preserve">Table 2a. Sociodemographic Characteristics by Cluster: MDHS 2015 (K = 4)</w:t>
       </w:r>
     </w:p>
     <w:tbl>
@@ -6062,7 +9778,7 @@
           <w:sz w:val="22"/>
           <w:szCs w:val="22"/>
         </w:rPr>
-        <w:t xml:space="preserve">Table 1b. Sociodemographic Characteristics by Cluster: MDHS 2024 (K = 3)</w:t>
+        <w:t xml:space="preserve">Table 2b. Sociodemographic Characteristics by Cluster: MDHS 2024 (K = 3)</w:t>
       </w:r>
     </w:p>
     <w:tbl>
@@ -10166,7 +13882,7 @@
           <w:sz w:val="22"/>
           <w:szCs w:val="22"/>
         </w:rPr>
-        <w:t xml:space="preserve">Table 2. Maternal Care Utilisation Indicators: MDHS 2015 vs 2024</w:t>
+        <w:t xml:space="preserve">Table 3. Maternal Care Utilisation Indicators: MDHS 2015 vs 2024</w:t>
       </w:r>
     </w:p>
     <w:tbl>
@@ -12240,7 +15956,7 @@
           <w:sz w:val="22"/>
           <w:szCs w:val="22"/>
         </w:rPr>
-        <w:t xml:space="preserve">Table 3. Cluster Profiles: MDHS 2015 (K = 4) and MDHS 2024 (K = 3)</w:t>
+        <w:t xml:space="preserve">Table 4. Cluster Profiles: MDHS 2015 (K = 4) and MDHS 2024 (K = 3)</w:t>
       </w:r>
     </w:p>
     <w:tbl>
@@ -15521,7 +19237,7 @@
           <w:sz w:val="22"/>
           <w:szCs w:val="22"/>
         </w:rPr>
-        <w:t xml:space="preserve">Table 4. Subgroup Association with Cluster Membership (Cramér’s V)</w:t>
+        <w:t xml:space="preserve">Table 5. Subgroup Association with Cluster Membership (Cramér’s V)</w:t>
       </w:r>
     </w:p>
     <w:tbl>
@@ -16930,7 +20646,7 @@
           <w:sz w:val="22"/>
           <w:szCs w:val="22"/>
         </w:rPr>
-        <w:t xml:space="preserve">Table 5. Top 5 Predictors of Cluster Membership (Random Forest Variable Importance)</w:t>
+        <w:t xml:space="preserve">Table 6. Top 5 Predictors of Cluster Membership (Random Forest Variable Importance)</w:t>
       </w:r>
     </w:p>
     <w:tbl>
@@ -17999,7 +21715,7 @@
           <w:sz w:val="22"/>
           <w:szCs w:val="22"/>
         </w:rPr>
-        <w:t xml:space="preserve">Table 6. Adjusted Odds Ratios from Multinomial Logistic Regression: Predictors of Cluster Membership</w:t>
+        <w:t xml:space="preserve">Table 7. Adjusted Odds Ratios from Multinomial Logistic Regression: Predictors of Cluster Membership</w:t>
       </w:r>
     </w:p>
     <w:p>

</xml_diff>

<commit_message>
Change MNLogit reference categories: wealth=Poorest, education=No education
- Updated 05_predictors_membership.py: switched from drop_first=True to
  explicit reference category dropping (wealth_quintile=Poorest,
  education=No education, residence=Rural)
- Re-ran multinomial logistic regression and Random Forest; all results
  updated in results/ CSVs and figures/
- Updated Table 6 (OR table) in manuscript and create_docx.js with new
  OR values, relabelled wealth/education rows to show comparison vs
  reference, updated footnote to reflect new reference categories
- Updated Table 5 (RF importance) with new MDI values and corrected
  predictor names/order
- Revised results paragraphs in both manuscript and docx to reflect new
  reference category interpretations
- Regenerated Word document
</commit_message>
<xml_diff>
--- a/manuscript/maternal_health_malawi_comparative_2015_2024.docx
+++ b/manuscript/maternal_health_malawi_comparative_2015_2024.docx
@@ -892,7 +892,7 @@
           <w:sz w:val="22"/>
           <w:szCs w:val="22"/>
         </w:rPr>
-        <w:t xml:space="preserve">The ability to predict group membership from sociodemographic factors alone was modest but improved between survey years (cross-validated overall accuracy: 0.21 in 2015 versus 0.33 in 2024). In 2024, the high-coverage and late ANC/facility groups were most accurately identified (accuracy scores of 0.43 and 0.46 respectively), while the small moderate ANC/limited delivery group was the hardest to distinguish sociodemographically (0.09), suggesting its members are sociodemographically diverse. In both years, parity and age were the strongest predictors of group membership (Table 6). In 2015, household wealth ranked third. By 2024, geographic region and perceived distance to a health facility had replaced wealth among the top five predictors. This shift suggests that as financial barriers to care have been progressively addressed, geographic access and social factors have become the dominant drivers of differences in care-seeking behaviour.</w:t>
+        <w:t xml:space="preserve">The ability to predict group membership from sociodemographic factors alone was modest but improved between survey years (cross-validated macro F1: 0.22 in 2015 versus 0.33 in 2024). In 2024, the high-coverage and late ANC/facility groups were most accurately identified (F1 scores of 0.43 and 0.47 respectively), while the small moderate ANC/limited delivery group was the hardest to distinguish sociodemographically (F1 = 0.09), suggesting its members are sociodemographically diverse. In both years, parity and age were the strongest predictors of group membership (Table 6). In 2015, the ranking was: parity (MDI = 0.185), age (0.182), richest wealth quintile (0.119), urban residence (0.106), and region (0.081). By 2024, the ordering shifted to: age (0.287), parity (0.173), region (0.100), perceived distance to facility (0.064), and marital status (0.057). This shift suggests that as financial barriers to care have been progressively addressed, geographic access and social factors have become the dominant drivers of differences in care-seeking behaviour.</w:t>
       </w:r>
     </w:p>
     <w:p>
@@ -932,7 +932,7 @@
           <w:sz w:val="22"/>
           <w:szCs w:val="22"/>
         </w:rPr>
-        <w:t xml:space="preserve">Multinomial logistic regression with the late ANC/facility delivery group as reference provided adjusted odds ratios for all sociodemographic predictors simultaneously (Table 7; McFadden R² = 0.023 in 2015 and 0.011 in 2024). In 2015, membership in the C-section group was significantly predicted by older age (OR per year: 1.06; 95% CI 1.04–1.08; p &lt; 0.001), lower parity (0.73; 0.68–0.79; p &lt; 0.001), urban residence (1.24; 1.02–1.50; p = 0.032), and higher wealth quintile (richer: 1.48, 1.17–1.88; richest: 1.81, 1.40–2.34; both p ≤0.001); all sub-higher education categories were associated with substantially reduced odds (OR 0.45–0.59; all p ≤0.004). The minimal utilisation group was characterised by higher parity (1.09; 1.04–1.16; p = 0.001), greater perceived distance barrier to care (1.39; 1.21–1.59; p &lt; 0.001), and lower urban residence odds (0.73; 0.57–0.94; p = 0.013). Women in the comprehensive care group were more likely to be married (1.14; 1.03–1.27; p = 0.010), from the richest wealth quintile (1.28; 1.09–1.50; p = 0.002), and less likely to reside in urban areas (0.82; 0.71–0.94; p = 0.004) or to have less than higher education (OR 0.62–0.69; all p ≤0.022). In 2024, women in the high-coverage group were significantly more likely to be married (1.22; 1.09–1.36; p &lt; 0.001), of lower parity (0.91; 0.86–0.96; p = 0.001), and marginally older (1.02; 1.00–1.03; p = 0.034); all sub-higher education categories were strongly associated with reduced membership odds (OR 0.43–0.50; all p &lt; 0.001). No predictor reached statistical significance for the moderate ANC/limited delivery group in 2024.</w:t>
+        <w:t xml:space="preserve">Multinomial logistic regression with the late ANC/facility delivery group as reference provided adjusted odds ratios for all sociodemographic predictors simultaneously (Table 7; McFadden R² = 0.023 in 2015 and 0.011 in 2024). Reference categories within predictors were rural residence, poorest wealth quintile, and no education. In 2015, membership in the C-section group was significantly predicted by older age (OR per year: 1.06; 95% CI 1.04–1.08; p &lt; 0.001), lower parity (0.73; 0.68–0.79; p &lt; 0.001), urban residence (1.24; 1.02–1.50; p = 0.031), higher wealth (richer vs poorest: 1.71, 1.33–2.19; richest vs poorest: 2.09, 1.58–2.75; both p &lt; 0.001), and higher education compared with no education (2.25; 1.41–3.61; p &lt; 0.001). The minimal utilisation group was characterised by higher parity (1.09; 1.04–1.16; p = 0.001), greater perceived distance barrier to care (1.39; 1.22–1.59; p &lt; 0.001), lower urban residence odds (0.74; 0.58–0.94; p = 0.015), lower odds among richer (0.81; 0.67–0.99; p = 0.043) and richest (0.74; 0.57–0.97; p = 0.030) women compared to the poorest quintile, and markedly lower odds among women with secondary education (0.61; 0.47–0.79; p &lt; 0.001). Women in the comprehensive care group were more likely to be married (1.14; 1.03–1.27; p = 0.010), from the richest compared to the poorest wealth quintile (1.33; 1.13–1.56; p &lt; 0.001), to have higher education compared with no education (1.62; 1.14–2.28; p = 0.007), and less likely to reside in urban areas (0.82; 0.71–0.94; p = 0.004). In 2024, women in the high-coverage group were significantly more likely to be married (1.22; 1.09–1.36; p &lt; 0.001), of lower parity (0.91; 0.86–0.96; p = 0.001), marginally older (1.02; 1.00–1.03; p = 0.034), and to have higher education compared with no education (2.34; 1.53–3.58; p &lt; 0.001). No predictor reached statistical significance for the moderate ANC/limited delivery group in 2024.</w:t>
       </w:r>
     </w:p>
     <w:p>
@@ -20941,7 +20941,7 @@
                 <w:sz w:val="18"/>
                 <w:szCs w:val="18"/>
               </w:rPr>
-              <w:t xml:space="preserve">0.180</w:t>
+              <w:t xml:space="preserve">0.185</w:t>
             </w:r>
           </w:p>
         </w:tc>
@@ -21009,7 +21009,7 @@
                 <w:sz w:val="18"/>
                 <w:szCs w:val="18"/>
               </w:rPr>
-              <w:t xml:space="preserve">0.269</w:t>
+              <w:t xml:space="preserve">0.287</w:t>
             </w:r>
           </w:p>
         </w:tc>
@@ -21110,7 +21110,7 @@
                 <w:sz w:val="18"/>
                 <w:szCs w:val="18"/>
               </w:rPr>
-              <w:t xml:space="preserve">0.166</w:t>
+              <w:t xml:space="preserve">0.182</w:t>
             </w:r>
           </w:p>
         </w:tc>
@@ -21176,7 +21176,7 @@
                 <w:sz w:val="18"/>
                 <w:szCs w:val="18"/>
               </w:rPr>
-              <w:t xml:space="preserve">0.167</w:t>
+              <w:t xml:space="preserve">0.173</w:t>
             </w:r>
           </w:p>
         </w:tc>
@@ -21277,7 +21277,7 @@
                 <w:sz w:val="18"/>
                 <w:szCs w:val="18"/>
               </w:rPr>
-              <w:t xml:space="preserve">0.106</w:t>
+              <w:t xml:space="preserve">0.119</w:t>
             </w:r>
           </w:p>
         </w:tc>
@@ -21343,7 +21343,7 @@
                 <w:sz w:val="18"/>
                 <w:szCs w:val="18"/>
               </w:rPr>
-              <w:t xml:space="preserve">0.094</w:t>
+              <w:t xml:space="preserve">0.100</w:t>
             </w:r>
           </w:p>
         </w:tc>
@@ -21411,7 +21411,7 @@
                 <w:sz w:val="18"/>
                 <w:szCs w:val="18"/>
               </w:rPr>
-              <w:t xml:space="preserve">Region</w:t>
+              <w:t xml:space="preserve">Residence (Urban)</w:t>
             </w:r>
           </w:p>
         </w:tc>
@@ -21444,7 +21444,7 @@
                 <w:sz w:val="18"/>
                 <w:szCs w:val="18"/>
               </w:rPr>
-              <w:t xml:space="preserve">0.076</w:t>
+              <w:t xml:space="preserve">0.106</w:t>
             </w:r>
           </w:p>
         </w:tc>
@@ -21477,7 +21477,7 @@
                 <w:sz w:val="18"/>
                 <w:szCs w:val="18"/>
               </w:rPr>
-              <w:t xml:space="preserve">Marital status (married)</w:t>
+              <w:t xml:space="preserve">Distance to facility (barrier)</w:t>
             </w:r>
           </w:p>
         </w:tc>
@@ -21510,7 +21510,7 @@
                 <w:sz w:val="18"/>
                 <w:szCs w:val="18"/>
               </w:rPr>
-              <w:t xml:space="preserve">0.058</w:t>
+              <w:t xml:space="preserve">0.064</w:t>
             </w:r>
           </w:p>
         </w:tc>
@@ -21578,7 +21578,7 @@
                 <w:sz w:val="18"/>
                 <w:szCs w:val="18"/>
               </w:rPr>
-              <w:t xml:space="preserve">Residence: Rural</w:t>
+              <w:t xml:space="preserve">Region</w:t>
             </w:r>
           </w:p>
         </w:tc>
@@ -21611,7 +21611,7 @@
                 <w:sz w:val="18"/>
                 <w:szCs w:val="18"/>
               </w:rPr>
-              <w:t xml:space="preserve">0.068</w:t>
+              <w:t xml:space="preserve">0.081</w:t>
             </w:r>
           </w:p>
         </w:tc>
@@ -21644,7 +21644,7 @@
                 <w:sz w:val="18"/>
                 <w:szCs w:val="18"/>
               </w:rPr>
-              <w:t xml:space="preserve">Distance to facility (barrier)</w:t>
+              <w:t xml:space="preserve">Marital status (married)</w:t>
             </w:r>
           </w:p>
         </w:tc>
@@ -21695,7 +21695,7 @@
           <w:sz w:val="18"/>
           <w:szCs w:val="18"/>
         </w:rPr>
-        <w:t xml:space="preserve">Importance score = mean reduction in prediction error (MDI). Cross-validated overall accuracy (macro F1): 2015 = 0.21; 2024 = 0.33.</w:t>
+        <w:t xml:space="preserve">Importance score = mean reduction in prediction error (MDI). Cross-validated overall accuracy (macro F1): 2015 = 0.22; 2024 = 0.33.</w:t>
       </w:r>
     </w:p>
     <w:p>
@@ -21939,7 +21939,7 @@
               <w:bottom w:val="single" w:color="AAAAAA" w:sz="4"/>
               <w:right w:val="single" w:color="AAAAAA" w:sz="4"/>
             </w:tcBorders>
-            <w:shd w:fill="FFE5CC" w:val="clear"/>
+            <w:shd w:fill="E8F5E9" w:val="clear"/>
             <w:tcMar>
               <w:top w:type="dxa" w:w="60"/>
               <w:left w:type="dxa" w:w="100"/>
@@ -21993,7 +21993,7 @@
                 <w:sz w:val="18"/>
                 <w:szCs w:val="18"/>
               </w:rPr>
-              <w:t xml:space="preserve">0.99 (0.97–1.01)</w:t>
+              <w:t xml:space="preserve">0.99 (0.98–1.01)</w:t>
             </w:r>
           </w:p>
         </w:tc>
@@ -22109,7 +22109,7 @@
               <w:bottom w:val="single" w:color="AAAAAA" w:sz="4"/>
               <w:right w:val="single" w:color="AAAAAA" w:sz="4"/>
             </w:tcBorders>
-            <w:shd w:fill="FFE5CC" w:val="clear"/>
+            <w:shd w:fill="E8F5E9" w:val="clear"/>
             <w:tcMar>
               <w:top w:type="dxa" w:w="60"/>
               <w:left w:type="dxa" w:w="100"/>
@@ -22379,28 +22379,28 @@
               <w:bottom w:val="single" w:color="AAAAAA" w:sz="4"/>
               <w:right w:val="single" w:color="AAAAAA" w:sz="4"/>
             </w:tcBorders>
-            <w:shd w:fill="FFE5CC" w:val="clear"/>
-            <w:tcMar>
-              <w:top w:type="dxa" w:w="60"/>
-              <w:left w:type="dxa" w:w="100"/>
-              <w:bottom w:type="dxa" w:w="60"/>
-              <w:right w:type="dxa" w:w="100"/>
-            </w:tcMar>
-            <w:vAlign w:val="center"/>
-          </w:tcPr>
-          <w:p>
-            <w:pPr>
-              <w:jc w:val="center"/>
-            </w:pPr>
-            <w:r>
-              <w:rPr>
-                <w:rFonts w:ascii="Times New Roman" w:cs="Times New Roman" w:eastAsia="Times New Roman" w:hAnsi="Times New Roman"/>
-                <w:b w:val="false"/>
-                <w:bCs w:val="false"/>
-                <w:sz w:val="18"/>
-                <w:szCs w:val="18"/>
-              </w:rPr>
-              <w:t xml:space="preserve">1.39 (1.21–1.59)***</w:t>
+            <w:shd w:fill="E8F5E9" w:val="clear"/>
+            <w:tcMar>
+              <w:top w:type="dxa" w:w="60"/>
+              <w:left w:type="dxa" w:w="100"/>
+              <w:bottom w:type="dxa" w:w="60"/>
+              <w:right w:type="dxa" w:w="100"/>
+            </w:tcMar>
+            <w:vAlign w:val="center"/>
+          </w:tcPr>
+          <w:p>
+            <w:pPr>
+              <w:jc w:val="center"/>
+            </w:pPr>
+            <w:r>
+              <w:rPr>
+                <w:rFonts w:ascii="Times New Roman" w:cs="Times New Roman" w:eastAsia="Times New Roman" w:hAnsi="Times New Roman"/>
+                <w:b w:val="false"/>
+                <w:bCs w:val="false"/>
+                <w:sz w:val="18"/>
+                <w:szCs w:val="18"/>
+              </w:rPr>
+              <w:t xml:space="preserve">1.39 (1.22–1.59)***</w:t>
             </w:r>
           </w:p>
         </w:tc>
@@ -22616,6 +22616,40 @@
               <w:bottom w:val="single" w:color="AAAAAA" w:sz="4"/>
               <w:right w:val="single" w:color="AAAAAA" w:sz="4"/>
             </w:tcBorders>
+            <w:shd w:fill="E8F5E9" w:val="clear"/>
+            <w:tcMar>
+              <w:top w:type="dxa" w:w="60"/>
+              <w:left w:type="dxa" w:w="100"/>
+              <w:bottom w:type="dxa" w:w="60"/>
+              <w:right w:type="dxa" w:w="100"/>
+            </w:tcMar>
+            <w:vAlign w:val="center"/>
+          </w:tcPr>
+          <w:p>
+            <w:pPr>
+              <w:jc w:val="center"/>
+            </w:pPr>
+            <w:r>
+              <w:rPr>
+                <w:rFonts w:ascii="Times New Roman" w:cs="Times New Roman" w:eastAsia="Times New Roman" w:hAnsi="Times New Roman"/>
+                <w:b w:val="false"/>
+                <w:bCs w:val="false"/>
+                <w:sz w:val="18"/>
+                <w:szCs w:val="18"/>
+              </w:rPr>
+              <w:t xml:space="preserve">1.24 (1.02–1.50)*</w:t>
+            </w:r>
+          </w:p>
+        </w:tc>
+        <w:tc>
+          <w:tcPr>
+            <w:tcW w:type="dxa" w:w="2320"/>
+            <w:tcBorders>
+              <w:top w:val="single" w:color="AAAAAA" w:sz="4"/>
+              <w:left w:val="single" w:color="AAAAAA" w:sz="4"/>
+              <w:bottom w:val="single" w:color="AAAAAA" w:sz="4"/>
+              <w:right w:val="single" w:color="AAAAAA" w:sz="4"/>
+            </w:tcBorders>
             <w:shd w:fill="FFE5CC" w:val="clear"/>
             <w:tcMar>
               <w:top w:type="dxa" w:w="60"/>
@@ -22637,41 +22671,7 @@
                 <w:sz w:val="18"/>
                 <w:szCs w:val="18"/>
               </w:rPr>
-              <w:t xml:space="preserve">1.24 (1.02–1.50)*</w:t>
-            </w:r>
-          </w:p>
-        </w:tc>
-        <w:tc>
-          <w:tcPr>
-            <w:tcW w:type="dxa" w:w="2320"/>
-            <w:tcBorders>
-              <w:top w:val="single" w:color="AAAAAA" w:sz="4"/>
-              <w:left w:val="single" w:color="AAAAAA" w:sz="4"/>
-              <w:bottom w:val="single" w:color="AAAAAA" w:sz="4"/>
-              <w:right w:val="single" w:color="AAAAAA" w:sz="4"/>
-            </w:tcBorders>
-            <w:shd w:fill="FFE5CC" w:val="clear"/>
-            <w:tcMar>
-              <w:top w:type="dxa" w:w="60"/>
-              <w:left w:type="dxa" w:w="100"/>
-              <w:bottom w:type="dxa" w:w="60"/>
-              <w:right w:type="dxa" w:w="100"/>
-            </w:tcMar>
-            <w:vAlign w:val="center"/>
-          </w:tcPr>
-          <w:p>
-            <w:pPr>
-              <w:jc w:val="center"/>
-            </w:pPr>
-            <w:r>
-              <w:rPr>
-                <w:rFonts w:ascii="Times New Roman" w:cs="Times New Roman" w:eastAsia="Times New Roman" w:hAnsi="Times New Roman"/>
-                <w:b w:val="false"/>
-                <w:bCs w:val="false"/>
-                <w:sz w:val="18"/>
-                <w:szCs w:val="18"/>
-              </w:rPr>
-              <w:t xml:space="preserve">0.73 (0.57–0.94)*</w:t>
+              <w:t xml:space="preserve">0.74 (0.58–0.94)*</w:t>
             </w:r>
           </w:p>
         </w:tc>
@@ -22740,7 +22740,7 @@
                 <w:sz w:val="18"/>
                 <w:szCs w:val="18"/>
               </w:rPr>
-              <w:t xml:space="preserve">Wealth: Poorer</w:t>
+              <w:t xml:space="preserve">Wealth: Poorer vs Poorest</w:t>
             </w:r>
           </w:p>
         </w:tc>
@@ -22773,7 +22773,7 @@
                 <w:sz w:val="18"/>
                 <w:szCs w:val="18"/>
               </w:rPr>
-              <w:t xml:space="preserve">0.98 (0.76–1.26)</w:t>
+              <w:t xml:space="preserve">1.12 (0.86–1.47)</w:t>
             </w:r>
           </w:p>
         </w:tc>
@@ -22806,7 +22806,7 @@
                 <w:sz w:val="18"/>
                 <w:szCs w:val="18"/>
               </w:rPr>
-              <w:t xml:space="preserve">1.05 (0.87–1.26)</w:t>
+              <w:t xml:space="preserve">0.93 (0.77–1.11)</w:t>
             </w:r>
           </w:p>
         </w:tc>
@@ -22839,7 +22839,7 @@
                 <w:sz w:val="18"/>
                 <w:szCs w:val="18"/>
               </w:rPr>
-              <w:t xml:space="preserve">1.05 (0.93–1.20)</w:t>
+              <w:t xml:space="preserve">1.10 (0.96–1.25)</w:t>
             </w:r>
           </w:p>
         </w:tc>
@@ -22874,7 +22874,7 @@
                 <w:sz w:val="18"/>
                 <w:szCs w:val="18"/>
               </w:rPr>
-              <w:t xml:space="preserve">Wealth: Poorest</w:t>
+              <w:t xml:space="preserve">Wealth: Middle vs Poorest</w:t>
             </w:r>
           </w:p>
         </w:tc>
@@ -22907,7 +22907,7 @@
                 <w:sz w:val="18"/>
                 <w:szCs w:val="18"/>
               </w:rPr>
-              <w:t xml:space="preserve">0.87 (0.67–1.14)</w:t>
+              <w:t xml:space="preserve">1.15 (0.88–1.50)</w:t>
             </w:r>
           </w:p>
         </w:tc>
@@ -22940,7 +22940,7 @@
                 <w:sz w:val="18"/>
                 <w:szCs w:val="18"/>
               </w:rPr>
-              <w:t xml:space="preserve">1.13 (0.94–1.36)</w:t>
+              <w:t xml:space="preserve">0.88 (0.74–1.06)</w:t>
             </w:r>
           </w:p>
         </w:tc>
@@ -22973,7 +22973,7 @@
                 <w:sz w:val="18"/>
                 <w:szCs w:val="18"/>
               </w:rPr>
-              <w:t xml:space="preserve">0.96 (0.84–1.10)</w:t>
+              <w:t xml:space="preserve">1.04 (0.91–1.19)</w:t>
             </w:r>
           </w:p>
         </w:tc>
@@ -23008,7 +23008,7 @@
                 <w:sz w:val="18"/>
                 <w:szCs w:val="18"/>
               </w:rPr>
-              <w:t xml:space="preserve">Wealth: Richer</w:t>
+              <w:t xml:space="preserve">Wealth: Richer vs Poorest</w:t>
             </w:r>
           </w:p>
         </w:tc>
@@ -23021,6 +23021,40 @@
               <w:bottom w:val="single" w:color="AAAAAA" w:sz="4"/>
               <w:right w:val="single" w:color="AAAAAA" w:sz="4"/>
             </w:tcBorders>
+            <w:shd w:fill="E8F5E9" w:val="clear"/>
+            <w:tcMar>
+              <w:top w:type="dxa" w:w="60"/>
+              <w:left w:type="dxa" w:w="100"/>
+              <w:bottom w:type="dxa" w:w="60"/>
+              <w:right w:type="dxa" w:w="100"/>
+            </w:tcMar>
+            <w:vAlign w:val="center"/>
+          </w:tcPr>
+          <w:p>
+            <w:pPr>
+              <w:jc w:val="center"/>
+            </w:pPr>
+            <w:r>
+              <w:rPr>
+                <w:rFonts w:ascii="Times New Roman" w:cs="Times New Roman" w:eastAsia="Times New Roman" w:hAnsi="Times New Roman"/>
+                <w:b w:val="false"/>
+                <w:bCs w:val="false"/>
+                <w:sz w:val="18"/>
+                <w:szCs w:val="18"/>
+              </w:rPr>
+              <w:t xml:space="preserve">1.71 (1.33–2.19)***</w:t>
+            </w:r>
+          </w:p>
+        </w:tc>
+        <w:tc>
+          <w:tcPr>
+            <w:tcW w:type="dxa" w:w="2320"/>
+            <w:tcBorders>
+              <w:top w:val="single" w:color="AAAAAA" w:sz="4"/>
+              <w:left w:val="single" w:color="AAAAAA" w:sz="4"/>
+              <w:bottom w:val="single" w:color="AAAAAA" w:sz="4"/>
+              <w:right w:val="single" w:color="AAAAAA" w:sz="4"/>
+            </w:tcBorders>
             <w:shd w:fill="FFE5CC" w:val="clear"/>
             <w:tcMar>
               <w:top w:type="dxa" w:w="60"/>
@@ -23042,7 +23076,7 @@
                 <w:sz w:val="18"/>
                 <w:szCs w:val="18"/>
               </w:rPr>
-              <w:t xml:space="preserve">1.48 (1.17–1.88)**</w:t>
+              <w:t xml:space="preserve">0.81 (0.67–0.99)*</w:t>
             </w:r>
           </w:p>
         </w:tc>
@@ -23075,40 +23109,7 @@
                 <w:sz w:val="18"/>
                 <w:szCs w:val="18"/>
               </w:rPr>
-              <w:t xml:space="preserve">0.92 (0.75–1.13)</w:t>
-            </w:r>
-          </w:p>
-        </w:tc>
-        <w:tc>
-          <w:tcPr>
-            <w:tcW w:type="dxa" w:w="2320"/>
-            <w:tcBorders>
-              <w:top w:val="single" w:color="AAAAAA" w:sz="4"/>
-              <w:left w:val="single" w:color="AAAAAA" w:sz="4"/>
-              <w:bottom w:val="single" w:color="AAAAAA" w:sz="4"/>
-              <w:right w:val="single" w:color="AAAAAA" w:sz="4"/>
-            </w:tcBorders>
-            <w:tcMar>
-              <w:top w:type="dxa" w:w="60"/>
-              <w:left w:type="dxa" w:w="100"/>
-              <w:bottom w:type="dxa" w:w="60"/>
-              <w:right w:type="dxa" w:w="100"/>
-            </w:tcMar>
-            <w:vAlign w:val="center"/>
-          </w:tcPr>
-          <w:p>
-            <w:pPr>
-              <w:jc w:val="center"/>
-            </w:pPr>
-            <w:r>
-              <w:rPr>
-                <w:rFonts w:ascii="Times New Roman" w:cs="Times New Roman" w:eastAsia="Times New Roman" w:hAnsi="Times New Roman"/>
-                <w:b w:val="false"/>
-                <w:bCs w:val="false"/>
-                <w:sz w:val="18"/>
-                <w:szCs w:val="18"/>
-              </w:rPr>
-              <w:t xml:space="preserve">1.04 (0.91–1.19)</w:t>
+              <w:t xml:space="preserve">1.08 (0.94–1.24)</w:t>
             </w:r>
           </w:p>
         </w:tc>
@@ -23143,7 +23144,7 @@
                 <w:sz w:val="18"/>
                 <w:szCs w:val="18"/>
               </w:rPr>
-              <w:t xml:space="preserve">Wealth: Richest</w:t>
+              <w:t xml:space="preserve">Wealth: Richest vs Poorest</w:t>
             </w:r>
           </w:p>
         </w:tc>
@@ -23156,6 +23157,40 @@
               <w:bottom w:val="single" w:color="AAAAAA" w:sz="4"/>
               <w:right w:val="single" w:color="AAAAAA" w:sz="4"/>
             </w:tcBorders>
+            <w:shd w:fill="E8F5E9" w:val="clear"/>
+            <w:tcMar>
+              <w:top w:type="dxa" w:w="60"/>
+              <w:left w:type="dxa" w:w="100"/>
+              <w:bottom w:type="dxa" w:w="60"/>
+              <w:right w:type="dxa" w:w="100"/>
+            </w:tcMar>
+            <w:vAlign w:val="center"/>
+          </w:tcPr>
+          <w:p>
+            <w:pPr>
+              <w:jc w:val="center"/>
+            </w:pPr>
+            <w:r>
+              <w:rPr>
+                <w:rFonts w:ascii="Times New Roman" w:cs="Times New Roman" w:eastAsia="Times New Roman" w:hAnsi="Times New Roman"/>
+                <w:b w:val="false"/>
+                <w:bCs w:val="false"/>
+                <w:sz w:val="18"/>
+                <w:szCs w:val="18"/>
+              </w:rPr>
+              <w:t xml:space="preserve">2.09 (1.58–2.75)***</w:t>
+            </w:r>
+          </w:p>
+        </w:tc>
+        <w:tc>
+          <w:tcPr>
+            <w:tcW w:type="dxa" w:w="2320"/>
+            <w:tcBorders>
+              <w:top w:val="single" w:color="AAAAAA" w:sz="4"/>
+              <w:left w:val="single" w:color="AAAAAA" w:sz="4"/>
+              <w:bottom w:val="single" w:color="AAAAAA" w:sz="4"/>
+              <w:right w:val="single" w:color="AAAAAA" w:sz="4"/>
+            </w:tcBorders>
             <w:shd w:fill="FFE5CC" w:val="clear"/>
             <w:tcMar>
               <w:top w:type="dxa" w:w="60"/>
@@ -23177,7 +23212,7 @@
                 <w:sz w:val="18"/>
                 <w:szCs w:val="18"/>
               </w:rPr>
-              <w:t xml:space="preserve">1.81 (1.40–2.34)***</w:t>
+              <w:t xml:space="preserve">0.74 (0.57–0.97)*</w:t>
             </w:r>
           </w:p>
         </w:tc>
@@ -23190,39 +23225,6 @@
               <w:bottom w:val="single" w:color="AAAAAA" w:sz="4"/>
               <w:right w:val="single" w:color="AAAAAA" w:sz="4"/>
             </w:tcBorders>
-            <w:tcMar>
-              <w:top w:type="dxa" w:w="60"/>
-              <w:left w:type="dxa" w:w="100"/>
-              <w:bottom w:type="dxa" w:w="60"/>
-              <w:right w:type="dxa" w:w="100"/>
-            </w:tcMar>
-            <w:vAlign w:val="center"/>
-          </w:tcPr>
-          <w:p>
-            <w:pPr>
-              <w:jc w:val="center"/>
-            </w:pPr>
-            <w:r>
-              <w:rPr>
-                <w:rFonts w:ascii="Times New Roman" w:cs="Times New Roman" w:eastAsia="Times New Roman" w:hAnsi="Times New Roman"/>
-                <w:b w:val="false"/>
-                <w:bCs w:val="false"/>
-                <w:sz w:val="18"/>
-                <w:szCs w:val="18"/>
-              </w:rPr>
-              <w:t xml:space="preserve">0.84 (0.65–1.10)</w:t>
-            </w:r>
-          </w:p>
-        </w:tc>
-        <w:tc>
-          <w:tcPr>
-            <w:tcW w:type="dxa" w:w="2320"/>
-            <w:tcBorders>
-              <w:top w:val="single" w:color="AAAAAA" w:sz="4"/>
-              <w:left w:val="single" w:color="AAAAAA" w:sz="4"/>
-              <w:bottom w:val="single" w:color="AAAAAA" w:sz="4"/>
-              <w:right w:val="single" w:color="AAAAAA" w:sz="4"/>
-            </w:tcBorders>
             <w:shd w:fill="E8F5E9" w:val="clear"/>
             <w:tcMar>
               <w:top w:type="dxa" w:w="60"/>
@@ -23244,7 +23246,7 @@
                 <w:sz w:val="18"/>
                 <w:szCs w:val="18"/>
               </w:rPr>
-              <w:t xml:space="preserve">1.28 (1.09–1.50)**</w:t>
+              <w:t xml:space="preserve">1.33 (1.13–1.56)***</w:t>
             </w:r>
           </w:p>
         </w:tc>
@@ -23279,7 +23281,7 @@
                 <w:sz w:val="18"/>
                 <w:szCs w:val="18"/>
               </w:rPr>
-              <w:t xml:space="preserve">Education: No education</w:t>
+              <w:t xml:space="preserve">Education: Higher vs None</w:t>
             </w:r>
           </w:p>
         </w:tc>
@@ -23292,28 +23294,28 @@
               <w:bottom w:val="single" w:color="AAAAAA" w:sz="4"/>
               <w:right w:val="single" w:color="AAAAAA" w:sz="4"/>
             </w:tcBorders>
-            <w:shd w:fill="FFE5CC" w:val="clear"/>
-            <w:tcMar>
-              <w:top w:type="dxa" w:w="60"/>
-              <w:left w:type="dxa" w:w="100"/>
-              <w:bottom w:type="dxa" w:w="60"/>
-              <w:right w:type="dxa" w:w="100"/>
-            </w:tcMar>
-            <w:vAlign w:val="center"/>
-          </w:tcPr>
-          <w:p>
-            <w:pPr>
-              <w:jc w:val="center"/>
-            </w:pPr>
-            <w:r>
-              <w:rPr>
-                <w:rFonts w:ascii="Times New Roman" w:cs="Times New Roman" w:eastAsia="Times New Roman" w:hAnsi="Times New Roman"/>
-                <w:b w:val="false"/>
-                <w:bCs w:val="false"/>
-                <w:sz w:val="18"/>
-                <w:szCs w:val="18"/>
-              </w:rPr>
-              <w:t xml:space="preserve">0.45 (0.28–0.72)***</w:t>
+            <w:shd w:fill="E8F5E9" w:val="clear"/>
+            <w:tcMar>
+              <w:top w:type="dxa" w:w="60"/>
+              <w:left w:type="dxa" w:w="100"/>
+              <w:bottom w:type="dxa" w:w="60"/>
+              <w:right w:type="dxa" w:w="100"/>
+            </w:tcMar>
+            <w:vAlign w:val="center"/>
+          </w:tcPr>
+          <w:p>
+            <w:pPr>
+              <w:jc w:val="center"/>
+            </w:pPr>
+            <w:r>
+              <w:rPr>
+                <w:rFonts w:ascii="Times New Roman" w:cs="Times New Roman" w:eastAsia="Times New Roman" w:hAnsi="Times New Roman"/>
+                <w:b w:val="false"/>
+                <w:bCs w:val="false"/>
+                <w:sz w:val="18"/>
+                <w:szCs w:val="18"/>
+              </w:rPr>
+              <w:t xml:space="preserve">2.25 (1.41–3.61)***</w:t>
             </w:r>
           </w:p>
         </w:tc>
@@ -23346,7 +23348,7 @@
                 <w:sz w:val="18"/>
                 <w:szCs w:val="18"/>
               </w:rPr>
-              <w:t xml:space="preserve">2.13 (0.84–5.43)</w:t>
+              <w:t xml:space="preserve">0.48 (0.19–1.21)</w:t>
             </w:r>
           </w:p>
         </w:tc>
@@ -23359,28 +23361,28 @@
               <w:bottom w:val="single" w:color="AAAAAA" w:sz="4"/>
               <w:right w:val="single" w:color="AAAAAA" w:sz="4"/>
             </w:tcBorders>
-            <w:shd w:fill="FFE5CC" w:val="clear"/>
-            <w:tcMar>
-              <w:top w:type="dxa" w:w="60"/>
-              <w:left w:type="dxa" w:w="100"/>
-              <w:bottom w:type="dxa" w:w="60"/>
-              <w:right w:type="dxa" w:w="100"/>
-            </w:tcMar>
-            <w:vAlign w:val="center"/>
-          </w:tcPr>
-          <w:p>
-            <w:pPr>
-              <w:jc w:val="center"/>
-            </w:pPr>
-            <w:r>
-              <w:rPr>
-                <w:rFonts w:ascii="Times New Roman" w:cs="Times New Roman" w:eastAsia="Times New Roman" w:hAnsi="Times New Roman"/>
-                <w:b w:val="false"/>
-                <w:bCs w:val="false"/>
-                <w:sz w:val="18"/>
-                <w:szCs w:val="18"/>
-              </w:rPr>
-              <w:t xml:space="preserve">0.62 (0.44–0.88)**</w:t>
+            <w:shd w:fill="E8F5E9" w:val="clear"/>
+            <w:tcMar>
+              <w:top w:type="dxa" w:w="60"/>
+              <w:left w:type="dxa" w:w="100"/>
+              <w:bottom w:type="dxa" w:w="60"/>
+              <w:right w:type="dxa" w:w="100"/>
+            </w:tcMar>
+            <w:vAlign w:val="center"/>
+          </w:tcPr>
+          <w:p>
+            <w:pPr>
+              <w:jc w:val="center"/>
+            </w:pPr>
+            <w:r>
+              <w:rPr>
+                <w:rFonts w:ascii="Times New Roman" w:cs="Times New Roman" w:eastAsia="Times New Roman" w:hAnsi="Times New Roman"/>
+                <w:b w:val="false"/>
+                <w:bCs w:val="false"/>
+                <w:sz w:val="18"/>
+                <w:szCs w:val="18"/>
+              </w:rPr>
+              <w:t xml:space="preserve">1.62 (1.14–2.28)**</w:t>
             </w:r>
           </w:p>
         </w:tc>
@@ -23415,7 +23417,7 @@
                 <w:sz w:val="18"/>
                 <w:szCs w:val="18"/>
               </w:rPr>
-              <w:t xml:space="preserve">Education: Primary</w:t>
+              <w:t xml:space="preserve">Education: Primary vs None</w:t>
             </w:r>
           </w:p>
         </w:tc>
@@ -23428,28 +23430,27 @@
               <w:bottom w:val="single" w:color="AAAAAA" w:sz="4"/>
               <w:right w:val="single" w:color="AAAAAA" w:sz="4"/>
             </w:tcBorders>
-            <w:shd w:fill="FFE5CC" w:val="clear"/>
-            <w:tcMar>
-              <w:top w:type="dxa" w:w="60"/>
-              <w:left w:type="dxa" w:w="100"/>
-              <w:bottom w:type="dxa" w:w="60"/>
-              <w:right w:type="dxa" w:w="100"/>
-            </w:tcMar>
-            <w:vAlign w:val="center"/>
-          </w:tcPr>
-          <w:p>
-            <w:pPr>
-              <w:jc w:val="center"/>
-            </w:pPr>
-            <w:r>
-              <w:rPr>
-                <w:rFonts w:ascii="Times New Roman" w:cs="Times New Roman" w:eastAsia="Times New Roman" w:hAnsi="Times New Roman"/>
-                <w:b w:val="false"/>
-                <w:bCs w:val="false"/>
-                <w:sz w:val="18"/>
-                <w:szCs w:val="18"/>
-              </w:rPr>
-              <w:t xml:space="preserve">0.54 (0.37–0.78)**</w:t>
+            <w:tcMar>
+              <w:top w:type="dxa" w:w="60"/>
+              <w:left w:type="dxa" w:w="100"/>
+              <w:bottom w:type="dxa" w:w="60"/>
+              <w:right w:type="dxa" w:w="100"/>
+            </w:tcMar>
+            <w:vAlign w:val="center"/>
+          </w:tcPr>
+          <w:p>
+            <w:pPr>
+              <w:jc w:val="center"/>
+            </w:pPr>
+            <w:r>
+              <w:rPr>
+                <w:rFonts w:ascii="Times New Roman" w:cs="Times New Roman" w:eastAsia="Times New Roman" w:hAnsi="Times New Roman"/>
+                <w:b w:val="false"/>
+                <w:bCs w:val="false"/>
+                <w:sz w:val="18"/>
+                <w:szCs w:val="18"/>
+              </w:rPr>
+              <w:t xml:space="preserve">1.20 (0.89–1.62)</w:t>
             </w:r>
           </w:p>
         </w:tc>
@@ -23482,7 +23483,7 @@
                 <w:sz w:val="18"/>
                 <w:szCs w:val="18"/>
               </w:rPr>
-              <w:t xml:space="preserve">1.85 (0.74–4.63)</w:t>
+              <w:t xml:space="preserve">0.87 (0.72–1.04)</w:t>
             </w:r>
           </w:p>
         </w:tc>
@@ -23495,28 +23496,27 @@
               <w:bottom w:val="single" w:color="AAAAAA" w:sz="4"/>
               <w:right w:val="single" w:color="AAAAAA" w:sz="4"/>
             </w:tcBorders>
-            <w:shd w:fill="FFE5CC" w:val="clear"/>
-            <w:tcMar>
-              <w:top w:type="dxa" w:w="60"/>
-              <w:left w:type="dxa" w:w="100"/>
-              <w:bottom w:type="dxa" w:w="60"/>
-              <w:right w:type="dxa" w:w="100"/>
-            </w:tcMar>
-            <w:vAlign w:val="center"/>
-          </w:tcPr>
-          <w:p>
-            <w:pPr>
-              <w:jc w:val="center"/>
-            </w:pPr>
-            <w:r>
-              <w:rPr>
-                <w:rFonts w:ascii="Times New Roman" w:cs="Times New Roman" w:eastAsia="Times New Roman" w:hAnsi="Times New Roman"/>
-                <w:b w:val="false"/>
-                <w:bCs w:val="false"/>
-                <w:sz w:val="18"/>
-                <w:szCs w:val="18"/>
-              </w:rPr>
-              <w:t xml:space="preserve">0.69 (0.50–0.95)*</w:t>
+            <w:tcMar>
+              <w:top w:type="dxa" w:w="60"/>
+              <w:left w:type="dxa" w:w="100"/>
+              <w:bottom w:type="dxa" w:w="60"/>
+              <w:right w:type="dxa" w:w="100"/>
+            </w:tcMar>
+            <w:vAlign w:val="center"/>
+          </w:tcPr>
+          <w:p>
+            <w:pPr>
+              <w:jc w:val="center"/>
+            </w:pPr>
+            <w:r>
+              <w:rPr>
+                <w:rFonts w:ascii="Times New Roman" w:cs="Times New Roman" w:eastAsia="Times New Roman" w:hAnsi="Times New Roman"/>
+                <w:b w:val="false"/>
+                <w:bCs w:val="false"/>
+                <w:sz w:val="18"/>
+                <w:szCs w:val="18"/>
+              </w:rPr>
+              <w:t xml:space="preserve">1.11 (0.96–1.27)</w:t>
             </w:r>
           </w:p>
         </w:tc>
@@ -23551,7 +23551,7 @@
                 <w:sz w:val="18"/>
                 <w:szCs w:val="18"/>
               </w:rPr>
-              <w:t xml:space="preserve">Education: Secondary</w:t>
+              <w:t xml:space="preserve">Education: Secondary vs None</w:t>
             </w:r>
           </w:p>
         </w:tc>
@@ -23564,6 +23564,39 @@
               <w:bottom w:val="single" w:color="AAAAAA" w:sz="4"/>
               <w:right w:val="single" w:color="AAAAAA" w:sz="4"/>
             </w:tcBorders>
+            <w:tcMar>
+              <w:top w:type="dxa" w:w="60"/>
+              <w:left w:type="dxa" w:w="100"/>
+              <w:bottom w:type="dxa" w:w="60"/>
+              <w:right w:type="dxa" w:w="100"/>
+            </w:tcMar>
+            <w:vAlign w:val="center"/>
+          </w:tcPr>
+          <w:p>
+            <w:pPr>
+              <w:jc w:val="center"/>
+            </w:pPr>
+            <w:r>
+              <w:rPr>
+                <w:rFonts w:ascii="Times New Roman" w:cs="Times New Roman" w:eastAsia="Times New Roman" w:hAnsi="Times New Roman"/>
+                <w:b w:val="false"/>
+                <w:bCs w:val="false"/>
+                <w:sz w:val="18"/>
+                <w:szCs w:val="18"/>
+              </w:rPr>
+              <w:t xml:space="preserve">1.32 (0.95–1.84)</w:t>
+            </w:r>
+          </w:p>
+        </w:tc>
+        <w:tc>
+          <w:tcPr>
+            <w:tcW w:type="dxa" w:w="2320"/>
+            <w:tcBorders>
+              <w:top w:val="single" w:color="AAAAAA" w:sz="4"/>
+              <w:left w:val="single" w:color="AAAAAA" w:sz="4"/>
+              <w:bottom w:val="single" w:color="AAAAAA" w:sz="4"/>
+              <w:right w:val="single" w:color="AAAAAA" w:sz="4"/>
+            </w:tcBorders>
             <w:shd w:fill="FFE5CC" w:val="clear"/>
             <w:tcMar>
               <w:top w:type="dxa" w:w="60"/>
@@ -23585,7 +23618,7 @@
                 <w:sz w:val="18"/>
                 <w:szCs w:val="18"/>
               </w:rPr>
-              <w:t xml:space="preserve">0.59 (0.41–0.85)**</w:t>
+              <w:t xml:space="preserve">0.61 (0.47–0.79)***</w:t>
             </w:r>
           </w:p>
         </w:tc>
@@ -23618,41 +23651,7 @@
                 <w:sz w:val="18"/>
                 <w:szCs w:val="18"/>
               </w:rPr>
-              <w:t xml:space="preserve">1.29 (0.51–3.24)</w:t>
-            </w:r>
-          </w:p>
-        </w:tc>
-        <w:tc>
-          <w:tcPr>
-            <w:tcW w:type="dxa" w:w="2320"/>
-            <w:tcBorders>
-              <w:top w:val="single" w:color="AAAAAA" w:sz="4"/>
-              <w:left w:val="single" w:color="AAAAAA" w:sz="4"/>
-              <w:bottom w:val="single" w:color="AAAAAA" w:sz="4"/>
-              <w:right w:val="single" w:color="AAAAAA" w:sz="4"/>
-            </w:tcBorders>
-            <w:shd w:fill="FFE5CC" w:val="clear"/>
-            <w:tcMar>
-              <w:top w:type="dxa" w:w="60"/>
-              <w:left w:type="dxa" w:w="100"/>
-              <w:bottom w:type="dxa" w:w="60"/>
-              <w:right w:type="dxa" w:w="100"/>
-            </w:tcMar>
-            <w:vAlign w:val="center"/>
-          </w:tcPr>
-          <w:p>
-            <w:pPr>
-              <w:jc w:val="center"/>
-            </w:pPr>
-            <w:r>
-              <w:rPr>
-                <w:rFonts w:ascii="Times New Roman" w:cs="Times New Roman" w:eastAsia="Times New Roman" w:hAnsi="Times New Roman"/>
-                <w:b w:val="false"/>
-                <w:bCs w:val="false"/>
-                <w:sz w:val="18"/>
-                <w:szCs w:val="18"/>
-              </w:rPr>
-              <w:t xml:space="preserve">0.62 (0.45–0.85)**</w:t>
+              <w:t xml:space="preserve">0.99 (0.84–1.18)</w:t>
             </w:r>
           </w:p>
         </w:tc>
@@ -23675,7 +23674,7 @@
           <w:sz w:val="18"/>
           <w:szCs w:val="18"/>
         </w:rPr>
-        <w:t xml:space="preserve">Panel B: MDHS 2024 — Reference group: C-2 (Late ANC, facility delivery; n = 3,349)</w:t>
+        <w:t xml:space="preserve">Panel B: MDHS 2024 — Reference group: C-2 (Late ANC, facility delivery; n = 3,238)</w:t>
       </w:r>
     </w:p>
     <w:tbl>
@@ -23763,7 +23762,7 @@
                 <w:szCs w:val="18"/>
               </w:rPr>
               <w:t xml:space="preserve">C-1: High coverage
-(n = 3,232)</w:t>
+(n = 3,094)</w:t>
             </w:r>
           </w:p>
         </w:tc>
@@ -23799,7 +23798,7 @@
                 <w:szCs w:val="18"/>
               </w:rPr>
               <w:t xml:space="preserve">C-3: Moderate ANC, limited delivery
-(n = 344)</w:t>
+(n = 336)</w:t>
             </w:r>
           </w:p>
         </w:tc>
@@ -23970,7 +23969,7 @@
                 <w:sz w:val="18"/>
                 <w:szCs w:val="18"/>
               </w:rPr>
-              <w:t xml:space="preserve">0.91 (0.86–0.96)***</w:t>
+              <w:t xml:space="preserve">0.91 (0.86–0.96)**</w:t>
             </w:r>
           </w:p>
         </w:tc>
@@ -24003,7 +24002,7 @@
                 <w:sz w:val="18"/>
                 <w:szCs w:val="18"/>
               </w:rPr>
-              <w:t xml:space="preserve">1.09 (0.98–1.22)</w:t>
+              <w:t xml:space="preserve">1.09 (0.97–1.22)</w:t>
             </w:r>
           </w:p>
         </w:tc>
@@ -24105,7 +24104,7 @@
                 <w:sz w:val="18"/>
                 <w:szCs w:val="18"/>
               </w:rPr>
-              <w:t xml:space="preserve">1.21 (0.94–1.56)</w:t>
+              <w:t xml:space="preserve">1.21 (0.94–1.55)</w:t>
             </w:r>
           </w:p>
         </w:tc>
@@ -24443,7 +24442,7 @@
                 <w:sz w:val="18"/>
                 <w:szCs w:val="18"/>
               </w:rPr>
-              <w:t xml:space="preserve">Wealth: Poorer</w:t>
+              <w:t xml:space="preserve">Wealth: Poorer vs Poorest</w:t>
             </w:r>
           </w:p>
         </w:tc>
@@ -24476,7 +24475,7 @@
                 <w:sz w:val="18"/>
                 <w:szCs w:val="18"/>
               </w:rPr>
-              <w:t xml:space="preserve">0.97 (0.82–1.15)</w:t>
+              <w:t xml:space="preserve">1.02 (0.87–1.19)</w:t>
             </w:r>
           </w:p>
         </w:tc>
@@ -24509,7 +24508,7 @@
                 <w:sz w:val="18"/>
                 <w:szCs w:val="18"/>
               </w:rPr>
-              <w:t xml:space="preserve">1.40 (0.97–2.02)</w:t>
+              <w:t xml:space="preserve">1.05 (0.76–1.44)</w:t>
             </w:r>
           </w:p>
         </w:tc>
@@ -24544,7 +24543,7 @@
                 <w:sz w:val="18"/>
                 <w:szCs w:val="18"/>
               </w:rPr>
-              <w:t xml:space="preserve">Wealth: Poorest</w:t>
+              <w:t xml:space="preserve">Wealth: Middle vs Poorest</w:t>
             </w:r>
           </w:p>
         </w:tc>
@@ -24577,7 +24576,7 @@
                 <w:sz w:val="18"/>
                 <w:szCs w:val="18"/>
               </w:rPr>
-              <w:t xml:space="preserve">0.96 (0.82–1.12)</w:t>
+              <w:t xml:space="preserve">1.04 (0.89–1.22)</w:t>
             </w:r>
           </w:p>
         </w:tc>
@@ -24610,7 +24609,7 @@
                 <w:sz w:val="18"/>
                 <w:szCs w:val="18"/>
               </w:rPr>
-              <w:t xml:space="preserve">1.34 (0.94–1.90)</w:t>
+              <w:t xml:space="preserve">0.75 (0.53–1.07)</w:t>
             </w:r>
           </w:p>
         </w:tc>
@@ -24645,7 +24644,7 @@
                 <w:sz w:val="18"/>
                 <w:szCs w:val="18"/>
               </w:rPr>
-              <w:t xml:space="preserve">Wealth: Richer</w:t>
+              <w:t xml:space="preserve">Wealth: Richer vs Poorest</w:t>
             </w:r>
           </w:p>
         </w:tc>
@@ -24678,7 +24677,7 @@
                 <w:sz w:val="18"/>
                 <w:szCs w:val="18"/>
               </w:rPr>
-              <w:t xml:space="preserve">0.95 (0.80–1.12)</w:t>
+              <w:t xml:space="preserve">0.99 (0.84–1.16)</w:t>
             </w:r>
           </w:p>
         </w:tc>
@@ -24711,7 +24710,7 @@
                 <w:sz w:val="18"/>
                 <w:szCs w:val="18"/>
               </w:rPr>
-              <w:t xml:space="preserve">1.05 (0.71–1.55)</w:t>
+              <w:t xml:space="preserve">0.78 (0.55–1.12)</w:t>
             </w:r>
           </w:p>
         </w:tc>
@@ -24746,7 +24745,7 @@
                 <w:sz w:val="18"/>
                 <w:szCs w:val="18"/>
               </w:rPr>
-              <w:t xml:space="preserve">Wealth: Richest</w:t>
+              <w:t xml:space="preserve">Wealth: Richest vs Poorest</w:t>
             </w:r>
           </w:p>
         </w:tc>
@@ -24779,7 +24778,7 @@
                 <w:sz w:val="18"/>
                 <w:szCs w:val="18"/>
               </w:rPr>
-              <w:t xml:space="preserve">1.15 (0.95–1.39)</w:t>
+              <w:t xml:space="preserve">1.20 (0.99–1.45)</w:t>
             </w:r>
           </w:p>
         </w:tc>
@@ -24812,7 +24811,7 @@
                 <w:sz w:val="18"/>
                 <w:szCs w:val="18"/>
               </w:rPr>
-              <w:t xml:space="preserve">1.06 (0.66–1.70)</w:t>
+              <w:t xml:space="preserve">0.80 (0.51–1.26)</w:t>
             </w:r>
           </w:p>
         </w:tc>
@@ -24847,7 +24846,7 @@
                 <w:sz w:val="18"/>
                 <w:szCs w:val="18"/>
               </w:rPr>
-              <w:t xml:space="preserve">Education: No education</w:t>
+              <w:t xml:space="preserve">Education: Higher vs None</w:t>
             </w:r>
           </w:p>
         </w:tc>
@@ -24860,28 +24859,28 @@
               <w:bottom w:val="single" w:color="AAAAAA" w:sz="4"/>
               <w:right w:val="single" w:color="AAAAAA" w:sz="4"/>
             </w:tcBorders>
-            <w:shd w:fill="FFE5CC" w:val="clear"/>
-            <w:tcMar>
-              <w:top w:type="dxa" w:w="60"/>
-              <w:left w:type="dxa" w:w="100"/>
-              <w:bottom w:type="dxa" w:w="60"/>
-              <w:right w:type="dxa" w:w="100"/>
-            </w:tcMar>
-            <w:vAlign w:val="center"/>
-          </w:tcPr>
-          <w:p>
-            <w:pPr>
-              <w:jc w:val="center"/>
-            </w:pPr>
-            <w:r>
-              <w:rPr>
-                <w:rFonts w:ascii="Times New Roman" w:cs="Times New Roman" w:eastAsia="Times New Roman" w:hAnsi="Times New Roman"/>
-                <w:b w:val="false"/>
-                <w:bCs w:val="false"/>
-                <w:sz w:val="18"/>
-                <w:szCs w:val="18"/>
-              </w:rPr>
-              <w:t xml:space="preserve">0.43 (0.28–0.65)***</w:t>
+            <w:shd w:fill="E8F5E9" w:val="clear"/>
+            <w:tcMar>
+              <w:top w:type="dxa" w:w="60"/>
+              <w:left w:type="dxa" w:w="100"/>
+              <w:bottom w:type="dxa" w:w="60"/>
+              <w:right w:type="dxa" w:w="100"/>
+            </w:tcMar>
+            <w:vAlign w:val="center"/>
+          </w:tcPr>
+          <w:p>
+            <w:pPr>
+              <w:jc w:val="center"/>
+            </w:pPr>
+            <w:r>
+              <w:rPr>
+                <w:rFonts w:ascii="Times New Roman" w:cs="Times New Roman" w:eastAsia="Times New Roman" w:hAnsi="Times New Roman"/>
+                <w:b w:val="false"/>
+                <w:bCs w:val="false"/>
+                <w:sz w:val="18"/>
+                <w:szCs w:val="18"/>
+              </w:rPr>
+              <w:t xml:space="preserve">2.34 (1.53–3.58)***</w:t>
             </w:r>
           </w:p>
         </w:tc>
@@ -24914,7 +24913,7 @@
                 <w:sz w:val="18"/>
                 <w:szCs w:val="18"/>
               </w:rPr>
-              <w:t xml:space="preserve">0.90 (0.31–2.62)</w:t>
+              <w:t xml:space="preserve">1.11 (0.38–3.21)</w:t>
             </w:r>
           </w:p>
         </w:tc>
@@ -24949,7 +24948,7 @@
                 <w:sz w:val="18"/>
                 <w:szCs w:val="18"/>
               </w:rPr>
-              <w:t xml:space="preserve">Education: Primary</w:t>
+              <w:t xml:space="preserve">Education: Primary vs None</w:t>
             </w:r>
           </w:p>
         </w:tc>
@@ -24962,28 +24961,27 @@
               <w:bottom w:val="single" w:color="AAAAAA" w:sz="4"/>
               <w:right w:val="single" w:color="AAAAAA" w:sz="4"/>
             </w:tcBorders>
-            <w:shd w:fill="FFE5CC" w:val="clear"/>
-            <w:tcMar>
-              <w:top w:type="dxa" w:w="60"/>
-              <w:left w:type="dxa" w:w="100"/>
-              <w:bottom w:type="dxa" w:w="60"/>
-              <w:right w:type="dxa" w:w="100"/>
-            </w:tcMar>
-            <w:vAlign w:val="center"/>
-          </w:tcPr>
-          <w:p>
-            <w:pPr>
-              <w:jc w:val="center"/>
-            </w:pPr>
-            <w:r>
-              <w:rPr>
-                <w:rFonts w:ascii="Times New Roman" w:cs="Times New Roman" w:eastAsia="Times New Roman" w:hAnsi="Times New Roman"/>
-                <w:b w:val="false"/>
-                <w:bCs w:val="false"/>
-                <w:sz w:val="18"/>
-                <w:szCs w:val="18"/>
-              </w:rPr>
-              <w:t xml:space="preserve">0.48 (0.34–0.70)***</w:t>
+            <w:tcMar>
+              <w:top w:type="dxa" w:w="60"/>
+              <w:left w:type="dxa" w:w="100"/>
+              <w:bottom w:type="dxa" w:w="60"/>
+              <w:right w:type="dxa" w:w="100"/>
+            </w:tcMar>
+            <w:vAlign w:val="center"/>
+          </w:tcPr>
+          <w:p>
+            <w:pPr>
+              <w:jc w:val="center"/>
+            </w:pPr>
+            <w:r>
+              <w:rPr>
+                <w:rFonts w:ascii="Times New Roman" w:cs="Times New Roman" w:eastAsia="Times New Roman" w:hAnsi="Times New Roman"/>
+                <w:b w:val="false"/>
+                <w:bCs w:val="false"/>
+                <w:sz w:val="18"/>
+                <w:szCs w:val="18"/>
+              </w:rPr>
+              <w:t xml:space="preserve">1.13 (0.90–1.42)</w:t>
             </w:r>
           </w:p>
         </w:tc>
@@ -25016,7 +25014,7 @@
                 <w:sz w:val="18"/>
                 <w:szCs w:val="18"/>
               </w:rPr>
-              <w:t xml:space="preserve">0.67 (0.25–1.81)</w:t>
+              <w:t xml:space="preserve">0.75 (0.49–1.13)</w:t>
             </w:r>
           </w:p>
         </w:tc>
@@ -25051,7 +25049,7 @@
                 <w:sz w:val="18"/>
                 <w:szCs w:val="18"/>
               </w:rPr>
-              <w:t xml:space="preserve">Education: Secondary</w:t>
+              <w:t xml:space="preserve">Education: Secondary vs None</w:t>
             </w:r>
           </w:p>
         </w:tc>
@@ -25064,28 +25062,27 @@
               <w:bottom w:val="single" w:color="AAAAAA" w:sz="4"/>
               <w:right w:val="single" w:color="AAAAAA" w:sz="4"/>
             </w:tcBorders>
-            <w:shd w:fill="FFE5CC" w:val="clear"/>
-            <w:tcMar>
-              <w:top w:type="dxa" w:w="60"/>
-              <w:left w:type="dxa" w:w="100"/>
-              <w:bottom w:type="dxa" w:w="60"/>
-              <w:right w:type="dxa" w:w="100"/>
-            </w:tcMar>
-            <w:vAlign w:val="center"/>
-          </w:tcPr>
-          <w:p>
-            <w:pPr>
-              <w:jc w:val="center"/>
-            </w:pPr>
-            <w:r>
-              <w:rPr>
-                <w:rFonts w:ascii="Times New Roman" w:cs="Times New Roman" w:eastAsia="Times New Roman" w:hAnsi="Times New Roman"/>
-                <w:b w:val="false"/>
-                <w:bCs w:val="false"/>
-                <w:sz w:val="18"/>
-                <w:szCs w:val="18"/>
-              </w:rPr>
-              <w:t xml:space="preserve">0.50 (0.35–0.71)***</w:t>
+            <w:tcMar>
+              <w:top w:type="dxa" w:w="60"/>
+              <w:left w:type="dxa" w:w="100"/>
+              <w:bottom w:type="dxa" w:w="60"/>
+              <w:right w:type="dxa" w:w="100"/>
+            </w:tcMar>
+            <w:vAlign w:val="center"/>
+          </w:tcPr>
+          <w:p>
+            <w:pPr>
+              <w:jc w:val="center"/>
+            </w:pPr>
+            <w:r>
+              <w:rPr>
+                <w:rFonts w:ascii="Times New Roman" w:cs="Times New Roman" w:eastAsia="Times New Roman" w:hAnsi="Times New Roman"/>
+                <w:b w:val="false"/>
+                <w:bCs w:val="false"/>
+                <w:sz w:val="18"/>
+                <w:szCs w:val="18"/>
+              </w:rPr>
+              <w:t xml:space="preserve">1.17 (0.91–1.51)</w:t>
             </w:r>
           </w:p>
         </w:tc>
@@ -25118,7 +25115,7 @@
                 <w:sz w:val="18"/>
                 <w:szCs w:val="18"/>
               </w:rPr>
-              <w:t xml:space="preserve">0.74 (0.28–1.97)</w:t>
+              <w:t xml:space="preserve">0.82 (0.50–1.34)</w:t>
             </w:r>
           </w:p>
         </w:tc>
@@ -25136,7 +25133,7 @@
           <w:sz w:val="18"/>
           <w:szCs w:val="18"/>
         </w:rPr>
-        <w:t xml:space="preserve">OR = adjusted odds ratio; 95% confidence interval in parentheses. Reference cluster: C-B (2015) and C-2 (2024), both Late ANC, facility delivery. Reference categories within predictors: residence = rural; wealth quintile = middle; education = higher education. * p &lt; 0.05; ** p &lt; 0.01; *** p &lt; 0.001. Highlighted cells: orange = lower odds; green = higher odds. McFadden R² = 0.023 (2015); 0.011 (2024).</w:t>
+        <w:t xml:space="preserve">OR = adjusted odds ratio; 95% confidence interval in parentheses. Reference cluster: C-B (2015) and C-2 (2024), both Late ANC, facility delivery. Reference categories within predictors: residence = rural; wealth quintile = poorest; education = no education. * p &lt; 0.05; ** p &lt; 0.01; *** p &lt; 0.001. Highlighted cells: green = higher odds; orange = lower odds. McFadden R² = 0.023 (2015); 0.011 (2024).</w:t>
       </w:r>
     </w:p>
     <w:p>

</xml_diff>